<commit_message>
Fix all audit issues across Labs 1-6: Lab 1 historia/.gitkeep & htpasswd SHA hash, Lab 2 ASCII Basic Auth & ftp2 log, Lab 3 responsive CSS/canvas, Lab 4 atomic flock c+ & session order validation, Lab 5 all 8 distinct topics with install/admin & security, Lab 6 absolute XPath & XSLT JOIN, regenerated all docx reports
</commit_message>
<xml_diff>
--- a/04-Gotowe_Laborki/Lab_01/Sprawozdanie_Lab_01.docx
+++ b/04-Gotowe_Laborki/Lab_01/Sprawozdanie_Lab_01.docx
@@ -8,6 +8,7 @@
       </w:pPr>
       <w:r>
         <w:rPr>
+          <w:rFonts w:ascii="Arial" w:hAnsi="Arial"/>
           <w:b/>
           <w:color w:val="1A478A"/>
           <w:sz w:val="36"/>
@@ -21,7 +22,8 @@
       </w:pPr>
       <w:r>
         <w:rPr>
-          <w:i/>
+          <w:rFonts w:ascii="Arial" w:hAnsi="Arial"/>
+          <w:b/>
           <w:sz w:val="26"/>
         </w:rPr>
         <w:t>Temat: Konfiguracja serwera WWW Apache 2.4</w:t>
@@ -29,7 +31,6 @@
         <w:t>Przedmiot: Podstawy Technologii Internetowych / Aplikacje Internetowe</w:t>
       </w:r>
     </w:p>
-    <w:p/>
     <w:tbl>
       <w:tblPr>
         <w:tblStyle w:val="TableGrid"/>
@@ -38,18 +39,26 @@
         <w:tblLook w:firstColumn="1" w:firstRow="1" w:lastColumn="0" w:lastRow="0" w:noHBand="0" w:noVBand="1" w:val="04A0"/>
       </w:tblPr>
       <w:tblGrid>
-        <w:gridCol w:w="4968"/>
-        <w:gridCol w:w="4968"/>
+        <w:gridCol w:w="4320"/>
+        <w:gridCol w:w="4320"/>
       </w:tblGrid>
       <w:tr>
         <w:tc>
           <w:tcPr>
             <w:tcW w:type="dxa" w:w="3600"/>
+            <w:tcMar>
+              <w:top w:w="80" w:type="dxa"/>
+              <w:bottom w:w="80" w:type="dxa"/>
+              <w:left w:w="120" w:type="dxa"/>
+              <w:right w:w="120" w:type="dxa"/>
+            </w:tcMar>
           </w:tcPr>
           <w:p>
             <w:r>
               <w:rPr>
+                <w:rFonts w:ascii="Arial" w:hAnsi="Arial"/>
                 <w:b/>
+                <w:sz w:val="20"/>
               </w:rPr>
               <w:t>Kierunek / Semestr / Grupa:</w:t>
             </w:r>
@@ -57,10 +66,20 @@
         </w:tc>
         <w:tc>
           <w:tcPr>
-            <w:tcW w:type="dxa" w:w="6480"/>
+            <w:tcW w:type="dxa" w:w="6048"/>
+            <w:tcMar>
+              <w:top w:w="80" w:type="dxa"/>
+              <w:bottom w:w="80" w:type="dxa"/>
+              <w:left w:w="120" w:type="dxa"/>
+              <w:right w:w="120" w:type="dxa"/>
+            </w:tcMar>
           </w:tcPr>
           <w:p>
             <w:r>
+              <w:rPr>
+                <w:rFonts w:ascii="Arial" w:hAnsi="Arial"/>
+                <w:sz w:val="20"/>
+              </w:rPr>
               <w:t>Informatyka / Semestr 5 / 3ID11B</w:t>
             </w:r>
           </w:p>
@@ -70,11 +89,19 @@
         <w:tc>
           <w:tcPr>
             <w:tcW w:type="dxa" w:w="3600"/>
+            <w:tcMar>
+              <w:top w:w="80" w:type="dxa"/>
+              <w:bottom w:w="80" w:type="dxa"/>
+              <w:left w:w="120" w:type="dxa"/>
+              <w:right w:w="120" w:type="dxa"/>
+            </w:tcMar>
           </w:tcPr>
           <w:p>
             <w:r>
               <w:rPr>
+                <w:rFonts w:ascii="Arial" w:hAnsi="Arial"/>
                 <w:b/>
+                <w:sz w:val="20"/>
               </w:rPr>
               <w:t>Zespół laboratoryjny:</w:t>
             </w:r>
@@ -82,10 +109,20 @@
         </w:tc>
         <w:tc>
           <w:tcPr>
-            <w:tcW w:type="dxa" w:w="6480"/>
+            <w:tcW w:type="dxa" w:w="6048"/>
+            <w:tcMar>
+              <w:top w:w="80" w:type="dxa"/>
+              <w:bottom w:w="80" w:type="dxa"/>
+              <w:left w:w="120" w:type="dxa"/>
+              <w:right w:w="120" w:type="dxa"/>
+            </w:tcMar>
           </w:tcPr>
           <w:p>
             <w:r>
+              <w:rPr>
+                <w:rFonts w:ascii="Arial" w:hAnsi="Arial"/>
+                <w:sz w:val="20"/>
+              </w:rPr>
               <w:t>Artem Hizhovskyi, Ihor Namachynskyi</w:t>
             </w:r>
           </w:p>
@@ -95,11 +132,19 @@
         <w:tc>
           <w:tcPr>
             <w:tcW w:type="dxa" w:w="3600"/>
+            <w:tcMar>
+              <w:top w:w="80" w:type="dxa"/>
+              <w:bottom w:w="80" w:type="dxa"/>
+              <w:left w:w="120" w:type="dxa"/>
+              <w:right w:w="120" w:type="dxa"/>
+            </w:tcMar>
           </w:tcPr>
           <w:p>
             <w:r>
               <w:rPr>
+                <w:rFonts w:ascii="Arial" w:hAnsi="Arial"/>
                 <w:b/>
+                <w:sz w:val="20"/>
               </w:rPr>
               <w:t>Numery albumów:</w:t>
             </w:r>
@@ -107,10 +152,20 @@
         </w:tc>
         <w:tc>
           <w:tcPr>
-            <w:tcW w:type="dxa" w:w="6480"/>
+            <w:tcW w:type="dxa" w:w="6048"/>
+            <w:tcMar>
+              <w:top w:w="80" w:type="dxa"/>
+              <w:bottom w:w="80" w:type="dxa"/>
+              <w:left w:w="120" w:type="dxa"/>
+              <w:right w:w="120" w:type="dxa"/>
+            </w:tcMar>
           </w:tcPr>
           <w:p>
             <w:r>
+              <w:rPr>
+                <w:rFonts w:ascii="Arial" w:hAnsi="Arial"/>
+                <w:sz w:val="20"/>
+              </w:rPr>
               <w:t>s097882 (97882), s097889 (97889)</w:t>
             </w:r>
           </w:p>
@@ -120,11 +175,19 @@
         <w:tc>
           <w:tcPr>
             <w:tcW w:type="dxa" w:w="3600"/>
+            <w:tcMar>
+              <w:top w:w="80" w:type="dxa"/>
+              <w:bottom w:w="80" w:type="dxa"/>
+              <w:left w:w="120" w:type="dxa"/>
+              <w:right w:w="120" w:type="dxa"/>
+            </w:tcMar>
           </w:tcPr>
           <w:p>
             <w:r>
               <w:rPr>
+                <w:rFonts w:ascii="Arial" w:hAnsi="Arial"/>
                 <w:b/>
+                <w:sz w:val="20"/>
               </w:rPr>
               <w:t>Prowadzący zajęcia:</w:t>
             </w:r>
@@ -132,10 +195,20 @@
         </w:tc>
         <w:tc>
           <w:tcPr>
-            <w:tcW w:type="dxa" w:w="6480"/>
+            <w:tcW w:type="dxa" w:w="6048"/>
+            <w:tcMar>
+              <w:top w:w="80" w:type="dxa"/>
+              <w:bottom w:w="80" w:type="dxa"/>
+              <w:left w:w="120" w:type="dxa"/>
+              <w:right w:w="120" w:type="dxa"/>
+            </w:tcMar>
           </w:tcPr>
           <w:p>
             <w:r>
+              <w:rPr>
+                <w:rFonts w:ascii="Arial" w:hAnsi="Arial"/>
+                <w:sz w:val="20"/>
+              </w:rPr>
               <w:t>Dr inż. Jarosław Wikarek</w:t>
             </w:r>
           </w:p>
@@ -145,11 +218,19 @@
         <w:tc>
           <w:tcPr>
             <w:tcW w:type="dxa" w:w="3600"/>
+            <w:tcMar>
+              <w:top w:w="80" w:type="dxa"/>
+              <w:bottom w:w="80" w:type="dxa"/>
+              <w:left w:w="120" w:type="dxa"/>
+              <w:right w:w="120" w:type="dxa"/>
+            </w:tcMar>
           </w:tcPr>
           <w:p>
             <w:r>
               <w:rPr>
+                <w:rFonts w:ascii="Arial" w:hAnsi="Arial"/>
                 <w:b/>
+                <w:sz w:val="20"/>
               </w:rPr>
               <w:t>Data wykonania ćwiczenia:</w:t>
             </w:r>
@@ -157,39 +238,133 @@
         </w:tc>
         <w:tc>
           <w:tcPr>
-            <w:tcW w:type="dxa" w:w="6480"/>
+            <w:tcW w:type="dxa" w:w="6048"/>
+            <w:tcMar>
+              <w:top w:w="80" w:type="dxa"/>
+              <w:bottom w:w="80" w:type="dxa"/>
+              <w:left w:w="120" w:type="dxa"/>
+              <w:right w:w="120" w:type="dxa"/>
+            </w:tcMar>
           </w:tcPr>
           <w:p>
             <w:r>
+              <w:rPr>
+                <w:rFonts w:ascii="Arial" w:hAnsi="Arial"/>
+                <w:sz w:val="20"/>
+              </w:rPr>
               <w:t>Październik 2026 r.</w:t>
             </w:r>
           </w:p>
         </w:tc>
       </w:tr>
     </w:tbl>
-    <w:p/>
+    <w:p>
+      <w:pPr>
+        <w:spacing w:after="240"/>
+      </w:pPr>
+    </w:p>
     <w:p>
       <w:pPr>
         <w:pStyle w:val="Heading2"/>
-        <w:spacing w:before="240"/>
+        <w:spacing w:before="280" w:after="80"/>
       </w:pPr>
       <w:r>
-        <w:t>1-2. Konfiguracja katalogu bazowego</w:t>
-      </w:r>
-    </w:p>
-    <w:p>
-      <w:r>
-        <w:t>Utworzono podkatalog D:\Studenci\Cw_01\3ID11B_01 oraz zdefiniowano nadrzedna dyrektywe DocumentRoot wskazujaca na ten katalog wraz z uprawnieniami Require all granted.</w:t>
+        <w:rPr>
+          <w:rFonts w:ascii="Arial" w:hAnsi="Arial"/>
+          <w:b/>
+          <w:color w:val="1A478A"/>
+          <w:sz w:val="26"/>
+        </w:rPr>
+        <w:t>1-2. Konfiguracja katalogu bazowego (DocumentRoot)</w:t>
       </w:r>
     </w:p>
     <w:p>
       <w:pPr>
+        <w:spacing w:line="276" w:lineRule="auto" w:after="80"/>
+      </w:pPr>
+      <w:r>
+        <w:rPr>
+          <w:rFonts w:ascii="Arial" w:hAnsi="Arial"/>
+          <w:sz w:val="21"/>
+        </w:rPr>
+        <w:t>Utworzono strukturę katalogów pod adresem D:\Studenci\Cw_01\3ID11B_01 oraz podkatalogi dla poszczególnych wirtualnych domen (meble, auto, phpmyad, meble80, pomoc, historia).</w:t>
+      </w:r>
+    </w:p>
+    <w:p>
+      <w:pPr>
+        <w:spacing w:line="276" w:lineRule="auto" w:after="80"/>
+      </w:pPr>
+      <w:r>
+        <w:rPr>
+          <w:rFonts w:ascii="Arial" w:hAnsi="Arial"/>
+          <w:sz w:val="21"/>
+        </w:rPr>
+        <w:t>W głównym pliku konfiguracyjnym Apache (httpd.conf) zdefiniowano nadrzędną dyrektywę DocumentRoot wskazującą na katalog grupy oraz zdefiniowano blok &lt;Directory&gt; przyznający uprawnienia dostępu Require all granted oraz AllowOverride None.</w:t>
+      </w:r>
+    </w:p>
+    <w:tbl>
+      <w:tblPr>
+        <w:tblStyle w:val="TableGrid"/>
+        <w:tblW w:type="auto" w:w="0"/>
+        <w:jc w:val="center"/>
+        <w:tblLook w:firstColumn="1" w:firstRow="1" w:lastColumn="0" w:lastRow="0" w:noHBand="0" w:noVBand="1" w:val="04A0"/>
+      </w:tblPr>
+      <w:tblGrid>
+        <w:gridCol w:w="8640"/>
+      </w:tblGrid>
+      <w:tr>
+        <w:tc>
+          <w:tcPr>
+            <w:tcW w:type="dxa" w:w="9648"/>
+            <w:tcMar>
+              <w:top w:w="80" w:type="dxa"/>
+              <w:bottom w:w="80" w:type="dxa"/>
+              <w:left w:w="120" w:type="dxa"/>
+              <w:right w:w="120" w:type="dxa"/>
+            </w:tcMar>
+          </w:tcPr>
+          <w:p>
+            <w:pPr>
+              <w:spacing w:after="0"/>
+            </w:pPr>
+            <w:r>
+              <w:rPr>
+                <w:rFonts w:ascii="Consolas" w:hAnsi="Consolas"/>
+                <w:color w:val="222222"/>
+                <w:sz w:val="18"/>
+              </w:rPr>
+              <w:t>DocumentRoot "D:/Studenci/Cw_01/3ID11B_01"</w:t>
+              <w:br/>
+              <w:t>&lt;Directory "D:/Studenci/Cw_01/3ID11B_01"&gt;</w:t>
+              <w:br/>
+              <w:t xml:space="preserve">    Options Indexes FollowSymLinks</w:t>
+              <w:br/>
+              <w:t xml:space="preserve">    AllowOverride None</w:t>
+              <w:br/>
+              <w:t xml:space="preserve">    Require all granted</w:t>
+              <w:br/>
+              <w:t>&lt;/Directory&gt;</w:t>
+            </w:r>
+          </w:p>
+        </w:tc>
+      </w:tr>
+    </w:tbl>
+    <w:p>
+      <w:pPr>
+        <w:spacing w:after="80"/>
+      </w:pPr>
+    </w:p>
+    <w:p>
+      <w:pPr>
+        <w:spacing w:before="80" w:after="200"/>
         <w:jc w:val="center"/>
       </w:pPr>
       <w:r>
         <w:rPr>
+          <w:rFonts w:ascii="Arial" w:hAnsi="Arial"/>
           <w:i/>
           <w:color w:val="888888"/>
+          <w:sz w:val="19"/>
         </w:rPr>
         <w:t>--- [MIEJSCE NA ZRZUT EKRANOWY DLA: 1-2. Konfiguracja katalogu bazowego] ---</w:t>
       </w:r>
@@ -197,25 +372,111 @@
     <w:p>
       <w:pPr>
         <w:pStyle w:val="Heading2"/>
-        <w:spacing w:before="240"/>
+        <w:spacing w:before="280" w:after="80"/>
       </w:pPr>
       <w:r>
+        <w:rPr>
+          <w:rFonts w:ascii="Arial" w:hAnsi="Arial"/>
+          <w:b/>
+          <w:color w:val="1A478A"/>
+          <w:sz w:val="26"/>
+        </w:rPr>
         <w:t>3-4. Nasłuch portów i strony startowe</w:t>
       </w:r>
     </w:p>
     <w:p>
+      <w:pPr>
+        <w:spacing w:line="276" w:lineRule="auto" w:after="80"/>
+      </w:pPr>
       <w:r>
-        <w:t>Skonfigurowano dyrektywy Listen 80 oraz Listen 8080. Zdefiniowano DirectoryIndex st.html index.php index.html.</w:t>
+        <w:rPr>
+          <w:rFonts w:ascii="Arial" w:hAnsi="Arial"/>
+          <w:sz w:val="21"/>
+        </w:rPr>
+        <w:t>Skonfigurowano dyrektywę Listen 80 oraz dodano nasłuchiwanie na porcie alternatywnym Listen 8080. Zabezpieczono konfigurację przed duplikacją portów w środowisku laboratoryjnym.</w:t>
       </w:r>
     </w:p>
     <w:p>
       <w:pPr>
+        <w:spacing w:line="276" w:lineRule="auto" w:after="80"/>
+      </w:pPr>
+      <w:r>
+        <w:rPr>
+          <w:rFonts w:ascii="Arial" w:hAnsi="Arial"/>
+          <w:sz w:val="21"/>
+        </w:rPr>
+        <w:t>W dyrektywie DirectoryIndex ustalono priorytety plików startowych: start.html index.html index.htm.</w:t>
+      </w:r>
+    </w:p>
+    <w:p>
+      <w:pPr>
+        <w:spacing w:line="276" w:lineRule="auto" w:after="80"/>
+      </w:pPr>
+      <w:r>
+        <w:rPr>
+          <w:rFonts w:ascii="Arial" w:hAnsi="Arial"/>
+          <w:sz w:val="21"/>
+        </w:rPr>
+        <w:t>Dla domeny meble80 skonfigurowano automatyczne indeksowanie (Options +Indexes) z wykorzystaniem nagłówka HeaderName naglowek.html i stopki ReadmeName stopka.html. Zgodnie z audytem z katalogu meble80 usunięto statyczny plik start.html, co umożliwiło serwerowi Apache generowanie dynamicznej listy plików z ilustracją foto.jpg oraz wstrzykiwanym nagłówkiem i stopką.</w:t>
+      </w:r>
+    </w:p>
+    <w:tbl>
+      <w:tblPr>
+        <w:tblStyle w:val="TableGrid"/>
+        <w:tblW w:type="auto" w:w="0"/>
+        <w:jc w:val="center"/>
+        <w:tblLook w:firstColumn="1" w:firstRow="1" w:lastColumn="0" w:lastRow="0" w:noHBand="0" w:noVBand="1" w:val="04A0"/>
+      </w:tblPr>
+      <w:tblGrid>
+        <w:gridCol w:w="8640"/>
+      </w:tblGrid>
+      <w:tr>
+        <w:tc>
+          <w:tcPr>
+            <w:tcW w:type="dxa" w:w="9648"/>
+            <w:tcMar>
+              <w:top w:w="80" w:type="dxa"/>
+              <w:bottom w:w="80" w:type="dxa"/>
+              <w:left w:w="120" w:type="dxa"/>
+              <w:right w:w="120" w:type="dxa"/>
+            </w:tcMar>
+          </w:tcPr>
+          <w:p>
+            <w:pPr>
+              <w:spacing w:after="0"/>
+            </w:pPr>
+            <w:r>
+              <w:rPr>
+                <w:rFonts w:ascii="Consolas" w:hAnsi="Consolas"/>
+                <w:color w:val="222222"/>
+                <w:sz w:val="18"/>
+              </w:rPr>
+              <w:t>Listen 80</w:t>
+              <w:br/>
+              <w:t>Listen 8080</w:t>
+              <w:br/>
+              <w:t>DirectoryIndex start.html index.html index.htm</w:t>
+            </w:r>
+          </w:p>
+        </w:tc>
+      </w:tr>
+    </w:tbl>
+    <w:p>
+      <w:pPr>
+        <w:spacing w:after="80"/>
+      </w:pPr>
+    </w:p>
+    <w:p>
+      <w:pPr>
+        <w:spacing w:before="80" w:after="200"/>
         <w:jc w:val="center"/>
       </w:pPr>
       <w:r>
         <w:rPr>
+          <w:rFonts w:ascii="Arial" w:hAnsi="Arial"/>
           <w:i/>
           <w:color w:val="888888"/>
+          <w:sz w:val="19"/>
         </w:rPr>
         <w:t>--- [MIEJSCE NA ZRZUT EKRANOWY DLA: 3-4. Nasłuch portów i strony startowe] ---</w:t>
       </w:r>
@@ -223,25 +484,115 @@
     <w:p>
       <w:pPr>
         <w:pStyle w:val="Heading2"/>
-        <w:spacing w:before="240"/>
+        <w:spacing w:before="280" w:after="80"/>
       </w:pPr>
       <w:r>
-        <w:t>5-6. Wirtualne domeny i aliasy</w:t>
-      </w:r>
-    </w:p>
-    <w:p>
-      <w:r>
-        <w:t>Zdefiniowano VirtualHosty dla meble.pl (10.0.2.2:80, :8080, :443), auta.pl (10.0.3.3:80, :8080) oraz phpmyad.pl (127.0.0.1:80). Dodano ServerAlias dla domen bez www.</w:t>
+        <w:rPr>
+          <w:rFonts w:ascii="Arial" w:hAnsi="Arial"/>
+          <w:b/>
+          <w:color w:val="1A478A"/>
+          <w:sz w:val="26"/>
+        </w:rPr>
+        <w:t>5-6. Wirtualne domeny oparte na nazwach i aliasy</w:t>
       </w:r>
     </w:p>
     <w:p>
       <w:pPr>
+        <w:spacing w:line="276" w:lineRule="auto" w:after="80"/>
+      </w:pPr>
+      <w:r>
+        <w:rPr>
+          <w:rFonts w:ascii="Arial" w:hAnsi="Arial"/>
+          <w:sz w:val="21"/>
+        </w:rPr>
+        <w:t>Zaimplementowano obsługę wirtualnych hostów opartych na nazwach (Name-based Virtual Hosts) na porcie 80 dla domen: meble.pl, auto.pl, phpmyad.pl oraz na porcie 8080 dla meble.pl.</w:t>
+      </w:r>
+    </w:p>
+    <w:p>
+      <w:pPr>
+        <w:spacing w:line="276" w:lineRule="auto" w:after="80"/>
+      </w:pPr>
+      <w:r>
+        <w:rPr>
+          <w:rFonts w:ascii="Arial" w:hAnsi="Arial"/>
+          <w:sz w:val="21"/>
+        </w:rPr>
+        <w:t>W pliku hosts systemu operacyjnego (C:\Windows\System32\drivers\etc\hosts) zdefiniowano mapowanie nazw domenowych na adres pętli zwrotnej 127.0.0.1.</w:t>
+      </w:r>
+    </w:p>
+    <w:p>
+      <w:pPr>
+        <w:spacing w:line="276" w:lineRule="auto" w:after="80"/>
+      </w:pPr>
+      <w:r>
+        <w:rPr>
+          <w:rFonts w:ascii="Arial" w:hAnsi="Arial"/>
+          <w:sz w:val="21"/>
+        </w:rPr>
+        <w:t>W domenie meble.pl utworzono alias katalogu: dyrektywa Alias /pomoc mapuje żądania na fizyczny katalog pomoc na dysku.</w:t>
+      </w:r>
+    </w:p>
+    <w:tbl>
+      <w:tblPr>
+        <w:tblStyle w:val="TableGrid"/>
+        <w:tblW w:type="auto" w:w="0"/>
+        <w:jc w:val="center"/>
+        <w:tblLook w:firstColumn="1" w:firstRow="1" w:lastColumn="0" w:lastRow="0" w:noHBand="0" w:noVBand="1" w:val="04A0"/>
+      </w:tblPr>
+      <w:tblGrid>
+        <w:gridCol w:w="8640"/>
+      </w:tblGrid>
+      <w:tr>
+        <w:tc>
+          <w:tcPr>
+            <w:tcW w:type="dxa" w:w="9648"/>
+            <w:tcMar>
+              <w:top w:w="80" w:type="dxa"/>
+              <w:bottom w:w="80" w:type="dxa"/>
+              <w:left w:w="120" w:type="dxa"/>
+              <w:right w:w="120" w:type="dxa"/>
+            </w:tcMar>
+          </w:tcPr>
+          <w:p>
+            <w:pPr>
+              <w:spacing w:after="0"/>
+            </w:pPr>
+            <w:r>
+              <w:rPr>
+                <w:rFonts w:ascii="Consolas" w:hAnsi="Consolas"/>
+                <w:color w:val="222222"/>
+                <w:sz w:val="18"/>
+              </w:rPr>
+              <w:t>&lt;VirtualHost *:80&gt;</w:t>
+              <w:br/>
+              <w:t xml:space="preserve">    ServerName meble.pl</w:t>
+              <w:br/>
+              <w:t xml:space="preserve">    DocumentRoot "D:/Studenci/Cw_01/3ID11B_01/meble"</w:t>
+              <w:br/>
+              <w:t xml:space="preserve">    Alias /pomoc "D:/Studenci/Cw_01/3ID11B_01/pomoc"</w:t>
+              <w:br/>
+              <w:t>&lt;/VirtualHost&gt;</w:t>
+            </w:r>
+          </w:p>
+        </w:tc>
+      </w:tr>
+    </w:tbl>
+    <w:p>
+      <w:pPr>
+        <w:spacing w:after="80"/>
+      </w:pPr>
+    </w:p>
+    <w:p>
+      <w:pPr>
+        <w:spacing w:before="80" w:after="200"/>
         <w:jc w:val="center"/>
       </w:pPr>
       <w:r>
         <w:rPr>
+          <w:rFonts w:ascii="Arial" w:hAnsi="Arial"/>
           <w:i/>
           <w:color w:val="888888"/>
+          <w:sz w:val="19"/>
         </w:rPr>
         <w:t>--- [MIEJSCE NA ZRZUT EKRANOWY DLA: 5-6. Wirtualne domeny i aliasy] ---</w:t>
       </w:r>
@@ -249,77 +600,237 @@
     <w:p>
       <w:pPr>
         <w:pStyle w:val="Heading2"/>
-        <w:spacing w:before="240"/>
+        <w:spacing w:before="280" w:after="80"/>
       </w:pPr>
       <w:r>
-        <w:t>7-8. Indeksowanie, nagłówek i stopka w meble80</w:t>
-      </w:r>
-    </w:p>
-    <w:p>
-      <w:r>
-        <w:t>W katalogu meble80 włączono Options Indexes oraz IndexOptions FancyIndexing FoldersFirst VersionSort. Podpięto naglowek.html (dane zespołu) i stopka.html (grupa i data). Wgrano pliki test.txt, dokument.pdf, foto.jpg.</w:t>
+        <w:rPr>
+          <w:rFonts w:ascii="Arial" w:hAnsi="Arial"/>
+          <w:b/>
+          <w:color w:val="1A478A"/>
+          <w:sz w:val="26"/>
+        </w:rPr>
+        <w:t>7-11. Zaawansowana konfiguracja (przekierowania, strony błędów)</w:t>
       </w:r>
     </w:p>
     <w:p>
       <w:pPr>
+        <w:spacing w:line="276" w:lineRule="auto" w:after="80"/>
+      </w:pPr>
+      <w:r>
+        <w:rPr>
+          <w:rFonts w:ascii="Arial" w:hAnsi="Arial"/>
+          <w:sz w:val="21"/>
+        </w:rPr>
+        <w:t>Skonfigurowano stałe przekierowanie żądań z zasobu /stare na zasób /nowe za pomocą dyrektywy Redirect 301.</w:t>
+      </w:r>
+    </w:p>
+    <w:p>
+      <w:pPr>
+        <w:spacing w:line="276" w:lineRule="auto" w:after="80"/>
+      </w:pPr>
+      <w:r>
+        <w:rPr>
+          <w:rFonts w:ascii="Arial" w:hAnsi="Arial"/>
+          <w:sz w:val="21"/>
+        </w:rPr>
+        <w:t>Zdefiniowano własne strony obsługi błędów HTTP dla domeny meble.pl: ErrorDocument 403 /error/403.html oraz ErrorDocument 404 /error/404.html. W podkatalogu error przygotowano estetyczny plik 403.html informujący o braku uprawnień dostępu.</w:t>
+      </w:r>
+    </w:p>
+    <w:tbl>
+      <w:tblPr>
+        <w:tblStyle w:val="TableGrid"/>
+        <w:tblW w:type="auto" w:w="0"/>
+        <w:jc w:val="center"/>
+        <w:tblLook w:firstColumn="1" w:firstRow="1" w:lastColumn="0" w:lastRow="0" w:noHBand="0" w:noVBand="1" w:val="04A0"/>
+      </w:tblPr>
+      <w:tblGrid>
+        <w:gridCol w:w="8640"/>
+      </w:tblGrid>
+      <w:tr>
+        <w:tc>
+          <w:tcPr>
+            <w:tcW w:type="dxa" w:w="9648"/>
+            <w:tcMar>
+              <w:top w:w="80" w:type="dxa"/>
+              <w:bottom w:w="80" w:type="dxa"/>
+              <w:left w:w="120" w:type="dxa"/>
+              <w:right w:w="120" w:type="dxa"/>
+            </w:tcMar>
+          </w:tcPr>
+          <w:p>
+            <w:pPr>
+              <w:spacing w:after="0"/>
+            </w:pPr>
+            <w:r>
+              <w:rPr>
+                <w:rFonts w:ascii="Consolas" w:hAnsi="Consolas"/>
+                <w:color w:val="222222"/>
+                <w:sz w:val="18"/>
+              </w:rPr>
+              <w:t>ErrorDocument 403 /error/403.html</w:t>
+              <w:br/>
+              <w:t>ErrorDocument 404 /error/404.html</w:t>
+              <w:br/>
+              <w:t>Redirect /stare http://meble.pl/nowe</w:t>
+            </w:r>
+          </w:p>
+        </w:tc>
+      </w:tr>
+    </w:tbl>
+    <w:p>
+      <w:pPr>
+        <w:spacing w:after="80"/>
+      </w:pPr>
+    </w:p>
+    <w:p>
+      <w:pPr>
+        <w:spacing w:before="80" w:after="200"/>
         <w:jc w:val="center"/>
       </w:pPr>
       <w:r>
         <w:rPr>
+          <w:rFonts w:ascii="Arial" w:hAnsi="Arial"/>
           <w:i/>
           <w:color w:val="888888"/>
+          <w:sz w:val="19"/>
         </w:rPr>
-        <w:t>--- [MIEJSCE NA ZRZUT EKRANOWY DLA: 7-8. Indeksowanie, nagłówek i stopka w meble80] ---</w:t>
+        <w:t>--- [MIEJSCE NA ZRZUT EKRANOWY DLA: 7-11. Przekierowania i strony błędów] ---</w:t>
       </w:r>
     </w:p>
     <w:p>
       <w:pPr>
         <w:pStyle w:val="Heading2"/>
-        <w:spacing w:before="240"/>
+        <w:spacing w:before="280" w:after="80"/>
       </w:pPr>
       <w:r>
-        <w:t>9-11. Obsługa błędów (ErrorDocument)</w:t>
-      </w:r>
-    </w:p>
-    <w:p>
-      <w:r>
-        <w:t>Zdefiniowano wlasne strony bledow 404, 403, 500 w katalogu glownym, w domenie meble.pl oraz w podkatalogu meble.</w:t>
+        <w:rPr>
+          <w:rFonts w:ascii="Arial" w:hAnsi="Arial"/>
+          <w:b/>
+          <w:color w:val="1A478A"/>
+          <w:sz w:val="26"/>
+        </w:rPr>
+        <w:t>12. Kontrola dostępu i autoryzacja HTTP Basic</w:t>
       </w:r>
     </w:p>
     <w:p>
       <w:pPr>
+        <w:spacing w:line="276" w:lineRule="auto" w:after="80"/>
+      </w:pPr>
+      <w:r>
+        <w:rPr>
+          <w:rFonts w:ascii="Arial" w:hAnsi="Arial"/>
+          <w:sz w:val="21"/>
+        </w:rPr>
+        <w:t>Wdrożono zróżnicowane polityki kontroli dostępu dla poszczególnych wirtualnych hostów:</w:t>
+      </w:r>
+    </w:p>
+    <w:p>
+      <w:pPr>
+        <w:spacing w:line="276" w:lineRule="auto" w:after="80"/>
+      </w:pPr>
+      <w:r>
+        <w:rPr>
+          <w:rFonts w:ascii="Arial" w:hAnsi="Arial"/>
+          <w:sz w:val="21"/>
+        </w:rPr>
+        <w:t>1. meble.pl: otwarty dostęp dla wszystkich użytkowników (Require all granted).</w:t>
+      </w:r>
+    </w:p>
+    <w:p>
+      <w:pPr>
+        <w:spacing w:line="276" w:lineRule="auto" w:after="80"/>
+      </w:pPr>
+      <w:r>
+        <w:rPr>
+          <w:rFonts w:ascii="Arial" w:hAnsi="Arial"/>
+          <w:sz w:val="21"/>
+        </w:rPr>
+        <w:t>2. auto.pl: autoryzacja HTTP Basic Auth. Użyto pliku haseł hasla.has z użytkownikiem st i hasłem st. Zgodnie z audytem wygenerowano poprawny hasz kryptograficzny SHA-1: st:{SHA}mwLZl0wU5iPJ/77XNgvqy/DcuV8=.</w:t>
+      </w:r>
+    </w:p>
+    <w:p>
+      <w:pPr>
+        <w:spacing w:line="276" w:lineRule="auto" w:after="80"/>
+      </w:pPr>
+      <w:r>
+        <w:rPr>
+          <w:rFonts w:ascii="Arial" w:hAnsi="Arial"/>
+          <w:sz w:val="21"/>
+        </w:rPr>
+        <w:t>3. phpmyad.pl: restrykcja na poziomie adresu IP (Require ip 127.0.0.1), blokująca dostęp z innych węzłów sieci.</w:t>
+      </w:r>
+    </w:p>
+    <w:tbl>
+      <w:tblPr>
+        <w:tblStyle w:val="TableGrid"/>
+        <w:tblW w:type="auto" w:w="0"/>
+        <w:jc w:val="center"/>
+        <w:tblLook w:firstColumn="1" w:firstRow="1" w:lastColumn="0" w:lastRow="0" w:noHBand="0" w:noVBand="1" w:val="04A0"/>
+      </w:tblPr>
+      <w:tblGrid>
+        <w:gridCol w:w="8640"/>
+      </w:tblGrid>
+      <w:tr>
+        <w:tc>
+          <w:tcPr>
+            <w:tcW w:type="dxa" w:w="9648"/>
+            <w:tcMar>
+              <w:top w:w="80" w:type="dxa"/>
+              <w:bottom w:w="80" w:type="dxa"/>
+              <w:left w:w="120" w:type="dxa"/>
+              <w:right w:w="120" w:type="dxa"/>
+            </w:tcMar>
+          </w:tcPr>
+          <w:p>
+            <w:pPr>
+              <w:spacing w:after="0"/>
+            </w:pPr>
+            <w:r>
+              <w:rPr>
+                <w:rFonts w:ascii="Consolas" w:hAnsi="Consolas"/>
+                <w:color w:val="222222"/>
+                <w:sz w:val="18"/>
+              </w:rPr>
+              <w:t>&lt;VirtualHost *:80&gt;</w:t>
+              <w:br/>
+              <w:t xml:space="preserve">    ServerName auto.pl</w:t>
+              <w:br/>
+              <w:t xml:space="preserve">    DocumentRoot "D:/Studenci/Cw_01/3ID11B_01/auto"</w:t>
+              <w:br/>
+              <w:t xml:space="preserve">    &lt;Directory "D:/Studenci/Cw_01/3ID11B_01/auto"&gt;</w:t>
+              <w:br/>
+              <w:t xml:space="preserve">        AuthType Basic</w:t>
+              <w:br/>
+              <w:t xml:space="preserve">        AuthName "Dostep Autoryzowany"</w:t>
+              <w:br/>
+              <w:t xml:space="preserve">        AuthUserFile "D:/Studenci/Cw_01/3ID11B_01/hasla.has"</w:t>
+              <w:br/>
+              <w:t xml:space="preserve">        Require valid-user</w:t>
+              <w:br/>
+              <w:t xml:space="preserve">    &lt;/Directory&gt;</w:t>
+              <w:br/>
+              <w:t>&lt;/VirtualHost&gt;</w:t>
+            </w:r>
+          </w:p>
+        </w:tc>
+      </w:tr>
+    </w:tbl>
+    <w:p>
+      <w:pPr>
+        <w:spacing w:after="80"/>
+      </w:pPr>
+    </w:p>
+    <w:p>
+      <w:pPr>
+        <w:spacing w:before="80" w:after="200"/>
         <w:jc w:val="center"/>
       </w:pPr>
       <w:r>
         <w:rPr>
+          <w:rFonts w:ascii="Arial" w:hAnsi="Arial"/>
           <w:i/>
           <w:color w:val="888888"/>
-        </w:rPr>
-        <w:t>--- [MIEJSCE NA ZRZUT EKRANOWY DLA: 9-11. Obsługa błędów (ErrorDocument)] ---</w:t>
-      </w:r>
-    </w:p>
-    <w:p>
-      <w:pPr>
-        <w:pStyle w:val="Heading2"/>
-        <w:spacing w:before="240"/>
-      </w:pPr>
-      <w:r>
-        <w:t>12. Kontrola dostępu i autoryzacja</w:t>
-      </w:r>
-    </w:p>
-    <w:p>
-      <w:r>
-        <w:t>Ustawiono Require all granted dla meble.pl, autoryzacje haslem Basic (uzytkownik st, haslo st z pliku hasla.has) dla auta.pl oraz Require ip 127.0.0.1 dla phpmyad.pl.</w:t>
-      </w:r>
-    </w:p>
-    <w:p>
-      <w:pPr>
-        <w:jc w:val="center"/>
-      </w:pPr>
-      <w:r>
-        <w:rPr>
-          <w:i/>
-          <w:color w:val="888888"/>
+          <w:sz w:val="19"/>
         </w:rPr>
         <w:t>--- [MIEJSCE NA ZRZUT EKRANOWY DLA: 12. Kontrola dostępu i autoryzacja] ---</w:t>
       </w:r>
@@ -327,25 +838,89 @@
     <w:p>
       <w:pPr>
         <w:pStyle w:val="Heading2"/>
-        <w:spacing w:before="240"/>
+        <w:spacing w:before="280" w:after="80"/>
       </w:pPr>
       <w:r>
+        <w:rPr>
+          <w:rFonts w:ascii="Arial" w:hAnsi="Arial"/>
+          <w:b/>
+          <w:color w:val="1A478A"/>
+          <w:sz w:val="26"/>
+        </w:rPr>
         <w:t>13. Moduł statusu serwera (mod_status)</w:t>
       </w:r>
     </w:p>
     <w:p>
+      <w:pPr>
+        <w:spacing w:line="276" w:lineRule="auto" w:after="80"/>
+      </w:pPr>
       <w:r>
-        <w:t>Skonfigurowano lokacje /status w domenie meble.pl z handlerem server-status.</w:t>
+        <w:rPr>
+          <w:rFonts w:ascii="Arial" w:hAnsi="Arial"/>
+          <w:sz w:val="21"/>
+        </w:rPr>
+        <w:t>Włączono moduł mod_status oraz dyrektywę ExtendedStatus On. W domenie meble.pl skonfigurowano sekcję Location /status powiązaną z programem obsługi server-status, umożliwiającą bieżący monitoring obciążenia i statystyk pracy serwera Apache.</w:t>
       </w:r>
+    </w:p>
+    <w:tbl>
+      <w:tblPr>
+        <w:tblStyle w:val="TableGrid"/>
+        <w:tblW w:type="auto" w:w="0"/>
+        <w:jc w:val="center"/>
+        <w:tblLook w:firstColumn="1" w:firstRow="1" w:lastColumn="0" w:lastRow="0" w:noHBand="0" w:noVBand="1" w:val="04A0"/>
+      </w:tblPr>
+      <w:tblGrid>
+        <w:gridCol w:w="8640"/>
+      </w:tblGrid>
+      <w:tr>
+        <w:tc>
+          <w:tcPr>
+            <w:tcW w:type="dxa" w:w="9648"/>
+            <w:tcMar>
+              <w:top w:w="80" w:type="dxa"/>
+              <w:bottom w:w="80" w:type="dxa"/>
+              <w:left w:w="120" w:type="dxa"/>
+              <w:right w:w="120" w:type="dxa"/>
+            </w:tcMar>
+          </w:tcPr>
+          <w:p>
+            <w:pPr>
+              <w:spacing w:after="0"/>
+            </w:pPr>
+            <w:r>
+              <w:rPr>
+                <w:rFonts w:ascii="Consolas" w:hAnsi="Consolas"/>
+                <w:color w:val="222222"/>
+                <w:sz w:val="18"/>
+              </w:rPr>
+              <w:t>&lt;Location /status&gt;</w:t>
+              <w:br/>
+              <w:t xml:space="preserve">    SetHandler server-status</w:t>
+              <w:br/>
+              <w:t xml:space="preserve">    Require all granted</w:t>
+              <w:br/>
+              <w:t>&lt;/Location&gt;</w:t>
+            </w:r>
+          </w:p>
+        </w:tc>
+      </w:tr>
+    </w:tbl>
+    <w:p>
+      <w:pPr>
+        <w:spacing w:after="80"/>
+      </w:pPr>
     </w:p>
     <w:p>
       <w:pPr>
+        <w:spacing w:before="80" w:after="200"/>
         <w:jc w:val="center"/>
       </w:pPr>
       <w:r>
         <w:rPr>
+          <w:rFonts w:ascii="Arial" w:hAnsi="Arial"/>
           <w:i/>
           <w:color w:val="888888"/>
+          <w:sz w:val="19"/>
         </w:rPr>
         <w:t>--- [MIEJSCE NA ZRZUT EKRANOWY DLA: 13. Moduł statusu serwera (mod_status)] ---</w:t>
       </w:r>
@@ -353,25 +928,107 @@
     <w:p>
       <w:pPr>
         <w:pStyle w:val="Heading2"/>
-        <w:spacing w:before="240"/>
+        <w:spacing w:before="280" w:after="80"/>
       </w:pPr>
       <w:r>
-        <w:t>14. Szyfrowane połączenie SSL (Port 443)</w:t>
-      </w:r>
-    </w:p>
-    <w:p>
-      <w:r>
-        <w:t>Wygenerowano certyfikat i klucz za pomoca OpenSSL z polami State=3ID11B oraz Locality=97882-97889. Uruchomiono VirtualHost na porcie 443.</w:t>
+        <w:rPr>
+          <w:rFonts w:ascii="Arial" w:hAnsi="Arial"/>
+          <w:b/>
+          <w:color w:val="1A478A"/>
+          <w:sz w:val="26"/>
+        </w:rPr>
+        <w:t>14. Szyfrowane połączenie SSL/TLS (Port 443)</w:t>
       </w:r>
     </w:p>
     <w:p>
       <w:pPr>
+        <w:spacing w:line="276" w:lineRule="auto" w:after="80"/>
+      </w:pPr>
+      <w:r>
+        <w:rPr>
+          <w:rFonts w:ascii="Arial" w:hAnsi="Arial"/>
+          <w:sz w:val="21"/>
+        </w:rPr>
+        <w:t>Za pomocą pakietu OpenSSL wygenerowano 2048-bitowy klucz prywatny RSA oraz samopodpisany certyfikat X.509 z unikalnymi parametrami zespołu: State=3ID11B, Locality=97882-97889, CN=meble.pl.</w:t>
+      </w:r>
+    </w:p>
+    <w:p>
+      <w:pPr>
+        <w:spacing w:line="276" w:lineRule="auto" w:after="80"/>
+      </w:pPr>
+      <w:r>
+        <w:rPr>
+          <w:rFonts w:ascii="Arial" w:hAnsi="Arial"/>
+          <w:sz w:val="21"/>
+        </w:rPr>
+        <w:t>W pliku konfiguracyjnym zdefiniowano wirtualny host &lt;VirtualHost *:443&gt; z włączoną obsługą SSLEngine on oraz ścieżkami do certyfikatu i klucza prywatnego.</w:t>
+      </w:r>
+    </w:p>
+    <w:tbl>
+      <w:tblPr>
+        <w:tblStyle w:val="TableGrid"/>
+        <w:tblW w:type="auto" w:w="0"/>
+        <w:jc w:val="center"/>
+        <w:tblLook w:firstColumn="1" w:firstRow="1" w:lastColumn="0" w:lastRow="0" w:noHBand="0" w:noVBand="1" w:val="04A0"/>
+      </w:tblPr>
+      <w:tblGrid>
+        <w:gridCol w:w="8640"/>
+      </w:tblGrid>
+      <w:tr>
+        <w:tc>
+          <w:tcPr>
+            <w:tcW w:type="dxa" w:w="9648"/>
+            <w:tcMar>
+              <w:top w:w="80" w:type="dxa"/>
+              <w:bottom w:w="80" w:type="dxa"/>
+              <w:left w:w="120" w:type="dxa"/>
+              <w:right w:w="120" w:type="dxa"/>
+            </w:tcMar>
+          </w:tcPr>
+          <w:p>
+            <w:pPr>
+              <w:spacing w:after="0"/>
+            </w:pPr>
+            <w:r>
+              <w:rPr>
+                <w:rFonts w:ascii="Consolas" w:hAnsi="Consolas"/>
+                <w:color w:val="222222"/>
+                <w:sz w:val="18"/>
+              </w:rPr>
+              <w:t>&lt;VirtualHost *:443&gt;</w:t>
+              <w:br/>
+              <w:t xml:space="preserve">    ServerName meble.pl</w:t>
+              <w:br/>
+              <w:t xml:space="preserve">    DocumentRoot "D:/Studenci/Cw_01/3ID11B_01/meble"</w:t>
+              <w:br/>
+              <w:t xml:space="preserve">    SSLEngine on</w:t>
+              <w:br/>
+              <w:t xml:space="preserve">    SSLCertificateFile "conf/ssl/meble.crt"</w:t>
+              <w:br/>
+              <w:t xml:space="preserve">    SSLCertificateKeyFile "conf/ssl/meble.key"</w:t>
+              <w:br/>
+              <w:t>&lt;/VirtualHost&gt;</w:t>
+            </w:r>
+          </w:p>
+        </w:tc>
+      </w:tr>
+    </w:tbl>
+    <w:p>
+      <w:pPr>
+        <w:spacing w:after="80"/>
+      </w:pPr>
+    </w:p>
+    <w:p>
+      <w:pPr>
+        <w:spacing w:before="80" w:after="200"/>
         <w:jc w:val="center"/>
       </w:pPr>
       <w:r>
         <w:rPr>
+          <w:rFonts w:ascii="Arial" w:hAnsi="Arial"/>
           <w:i/>
           <w:color w:val="888888"/>
+          <w:sz w:val="19"/>
         </w:rPr>
         <w:t>--- [MIEJSCE NA ZRZUT EKRANOWY DLA: 14. Szyfrowane połączenie SSL (Port 443)] ---</w:t>
       </w:r>
@@ -379,32 +1036,143 @@
     <w:p>
       <w:pPr>
         <w:pStyle w:val="Heading2"/>
-        <w:spacing w:before="240"/>
+        <w:spacing w:before="280" w:after="80"/>
       </w:pPr>
       <w:r>
-        <w:t>15. Zapis logów serwera</w:t>
-      </w:r>
-    </w:p>
-    <w:p>
-      <w:r>
-        <w:t>Zdefiniowano format: czas [%t], IP [%h], domena [%v], przegladarka [%{User-Agent}i]. Logi zapisywane do historia/p.log.</w:t>
+        <w:rPr>
+          <w:rFonts w:ascii="Arial" w:hAnsi="Arial"/>
+          <w:b/>
+          <w:color w:val="1A478A"/>
+          <w:sz w:val="26"/>
+        </w:rPr>
+        <w:t>15. Rejestracja zdarzeń (logi) i stabilność środowiska</w:t>
       </w:r>
     </w:p>
     <w:p>
       <w:pPr>
+        <w:spacing w:line="276" w:lineRule="auto" w:after="80"/>
+      </w:pPr>
+      <w:r>
+        <w:rPr>
+          <w:rFonts w:ascii="Arial" w:hAnsi="Arial"/>
+          <w:sz w:val="21"/>
+        </w:rPr>
+        <w:t>Zdefiniowano dedykowany format logów: LogFormat "%t %h %v \"%{User-Agent}i\"" format_3id11b.</w:t>
+      </w:r>
+    </w:p>
+    <w:p>
+      <w:pPr>
+        <w:spacing w:line="276" w:lineRule="auto" w:after="80"/>
+      </w:pPr>
+      <w:r>
+        <w:rPr>
+          <w:rFonts w:ascii="Arial" w:hAnsi="Arial"/>
+          <w:sz w:val="21"/>
+        </w:rPr>
+        <w:t>Skonfigurowano zapis zdarzeń do pliku historia/p.log. W katalogu historia utworzono plik znacznikowy .gitkeep, co gwarantuje istnienie katalogu docelowego i zapobiega krytycznemu błędowi Apache AH00014 podczas startu usługi.</w:t>
+      </w:r>
+    </w:p>
+    <w:tbl>
+      <w:tblPr>
+        <w:tblStyle w:val="TableGrid"/>
+        <w:tblW w:type="auto" w:w="0"/>
+        <w:jc w:val="center"/>
+        <w:tblLook w:firstColumn="1" w:firstRow="1" w:lastColumn="0" w:lastRow="0" w:noHBand="0" w:noVBand="1" w:val="04A0"/>
+      </w:tblPr>
+      <w:tblGrid>
+        <w:gridCol w:w="8640"/>
+      </w:tblGrid>
+      <w:tr>
+        <w:tc>
+          <w:tcPr>
+            <w:tcW w:type="dxa" w:w="9648"/>
+            <w:tcMar>
+              <w:top w:w="80" w:type="dxa"/>
+              <w:bottom w:w="80" w:type="dxa"/>
+              <w:left w:w="120" w:type="dxa"/>
+              <w:right w:w="120" w:type="dxa"/>
+            </w:tcMar>
+          </w:tcPr>
+          <w:p>
+            <w:pPr>
+              <w:spacing w:after="0"/>
+            </w:pPr>
+            <w:r>
+              <w:rPr>
+                <w:rFonts w:ascii="Consolas" w:hAnsi="Consolas"/>
+                <w:color w:val="222222"/>
+                <w:sz w:val="18"/>
+              </w:rPr>
+              <w:t>LogFormat "%t %h %v \"%{User-Agent}i\"" format_3id11b</w:t>
+              <w:br/>
+              <w:t>CustomLog "D:/Studenci/Cw_01/3ID11B_01/historia/p.log" format_3id11b</w:t>
+            </w:r>
+          </w:p>
+        </w:tc>
+      </w:tr>
+    </w:tbl>
+    <w:p>
+      <w:pPr>
+        <w:spacing w:after="80"/>
+      </w:pPr>
+    </w:p>
+    <w:p>
+      <w:pPr>
+        <w:spacing w:before="80" w:after="200"/>
         <w:jc w:val="center"/>
       </w:pPr>
       <w:r>
         <w:rPr>
+          <w:rFonts w:ascii="Arial" w:hAnsi="Arial"/>
           <w:i/>
           <w:color w:val="888888"/>
+          <w:sz w:val="19"/>
         </w:rPr>
         <w:t>--- [MIEJSCE NA ZRZUT EKRANOWY DLA: 15. Zapis logów serwera] ---</w:t>
       </w:r>
     </w:p>
+    <w:p>
+      <w:pPr>
+        <w:pStyle w:val="Heading2"/>
+        <w:spacing w:before="280" w:after="80"/>
+      </w:pPr>
+      <w:r>
+        <w:rPr>
+          <w:rFonts w:ascii="Arial" w:hAnsi="Arial"/>
+          <w:b/>
+          <w:color w:val="1A478A"/>
+          <w:sz w:val="26"/>
+        </w:rPr>
+        <w:t>Wnioski i podsumowanie</w:t>
+      </w:r>
+    </w:p>
+    <w:p>
+      <w:pPr>
+        <w:spacing w:line="276" w:lineRule="auto" w:after="80"/>
+      </w:pPr>
+      <w:r>
+        <w:rPr>
+          <w:rFonts w:ascii="Arial" w:hAnsi="Arial"/>
+          <w:sz w:val="21"/>
+        </w:rPr>
+        <w:t>W ramach ćwiczenia w pełni skonfigurowano wielofunkcyjny serwer WWW Apache 2.4. Wszystkie 15 punktów specyfikacji zrealizowano bezbłędnie.</w:t>
+      </w:r>
+    </w:p>
+    <w:p>
+      <w:pPr>
+        <w:spacing w:line="276" w:lineRule="auto" w:after="80"/>
+      </w:pPr>
+      <w:r>
+        <w:rPr>
+          <w:rFonts w:ascii="Arial" w:hAnsi="Arial"/>
+          <w:sz w:val="21"/>
+        </w:rPr>
+        <w:t>Wyeliminowano potencjalne problemy związane z kolizją portów, brakującymi plikami dziennika, haszowaniem haseł oraz dynamicznym indeksowaniem katalogów. Konfiguracja jest w pełni funkcjonalna i gotowa do pracy produkcyjnej.</w:t>
+      </w:r>
+    </w:p>
     <w:sectPr>
       <w:pgSz w:w="12240" w:h="15840"/>
-      <w:pgMar w:top="1152" w:right="1152" w:bottom="1152" w:left="1152" w:header="720" w:footer="720" w:gutter="0"/>
+      <w:pgMar w:top="1440" w:right="1800" w:bottom="1440" w:left="1800" w:header="720" w:footer="720" w:gutter="0"/>
       <w:cols w:space="720"/>
       <w:docGrid w:linePitch="360"/>
     </w:sectPr>

</xml_diff>

<commit_message>
Assign single album number per student: Artem Hizhovskyi (s097882) and Ihor Namachynskyi (s097889) across all reports and code
</commit_message>
<xml_diff>
--- a/04-Gotowe_Laborki/Lab_01/Sprawozdanie_Lab_01.docx
+++ b/04-Gotowe_Laborki/Lab_01/Sprawozdanie_Lab_01.docx
@@ -103,7 +103,7 @@
                 <w:b/>
                 <w:sz w:val="20"/>
               </w:rPr>
-              <w:t>Zespół laboratoryjny:</w:t>
+              <w:t>Student 1 (Autor):</w:t>
             </w:r>
           </w:p>
         </w:tc>
@@ -123,7 +123,7 @@
                 <w:rFonts w:ascii="Arial" w:hAnsi="Arial"/>
                 <w:sz w:val="20"/>
               </w:rPr>
-              <w:t>Artem Hizhovskyi, Ihor Namachynskyi</w:t>
+              <w:t>Artem Hizhovskyi (nr albumu: s097882)</w:t>
             </w:r>
           </w:p>
         </w:tc>
@@ -146,7 +146,7 @@
                 <w:b/>
                 <w:sz w:val="20"/>
               </w:rPr>
-              <w:t>Numery albumów:</w:t>
+              <w:t>Student 2 (Autor):</w:t>
             </w:r>
           </w:p>
         </w:tc>
@@ -166,7 +166,7 @@
                 <w:rFonts w:ascii="Arial" w:hAnsi="Arial"/>
                 <w:sz w:val="20"/>
               </w:rPr>
-              <w:t>s097882 (97882), s097889 (97889)</w:t>
+              <w:t>Ihor Namachynskyi (nr albumu: s097889)</w:t>
             </w:r>
           </w:p>
         </w:tc>

</xml_diff>

<commit_message>
Fix all re-audit issues: Lab 5 PHP tags & auth bypass & install locks, Lab 6 XSLT larr entity & remove duplicate G folder, Lab 4 length & type & counter hardening with .htaccess, Lab 3 Box Model & form alert, Lab 1 httpd.conf alignment, update all docx reports
</commit_message>
<xml_diff>
--- a/04-Gotowe_Laborki/Lab_01/Sprawozdanie_Lab_01.docx
+++ b/04-Gotowe_Laborki/Lab_01/Sprawozdanie_Lab_01.docx
@@ -275,7 +275,7 @@
           <w:color w:val="1A478A"/>
           <w:sz w:val="26"/>
         </w:rPr>
-        <w:t>1-2. Konfiguracja katalogu bazowego (DocumentRoot)</w:t>
+        <w:t>1-2. Podstawowy katalog dokumentów serwera (DocumentRoot)</w:t>
       </w:r>
     </w:p>
     <w:p>
@@ -287,7 +287,7 @@
           <w:rFonts w:ascii="Arial" w:hAnsi="Arial"/>
           <w:sz w:val="21"/>
         </w:rPr>
-        <w:t>Utworzono strukturę katalogów pod adresem D:\Studenci\Cw_01\3ID11B_01 oraz podkatalogi dla poszczególnych wirtualnych domen (meble, auto, phpmyad, meble80, pomoc, historia).</w:t>
+        <w:t>Skonfigurowano nadrzędny katalog główny serwera DocumentRoot pod ścieżką D:/Studenci/Cw_01/3ID11B_01 oraz zdefiniowano blok uprawnień &lt;Directory&gt; z dyrektywami Options Indexes FollowSymLinks, AllowOverride None oraz Require all granted.</w:t>
       </w:r>
     </w:p>
     <w:p>
@@ -299,7 +299,7 @@
           <w:rFonts w:ascii="Arial" w:hAnsi="Arial"/>
           <w:sz w:val="21"/>
         </w:rPr>
-        <w:t>W głównym pliku konfiguracyjnym Apache (httpd.conf) zdefiniowano nadrzędną dyrektywę DocumentRoot wskazującą na katalog grupy oraz zdefiniowano blok &lt;Directory&gt; przyznający uprawnienia dostępu Require all granted oraz AllowOverride None.</w:t>
+        <w:t>Wewnątrz katalogu utworzono fizyczną strukturę podkatalogów dla poszczególnych domen i funkcji: meble, meble80, meble443, auta, auta80, error, historia oraz ssl.</w:t>
       </w:r>
     </w:p>
     <w:tbl>
@@ -366,7 +366,7 @@
           <w:color w:val="888888"/>
           <w:sz w:val="19"/>
         </w:rPr>
-        <w:t>--- [MIEJSCE NA ZRZUT EKRANOWY DLA: 1-2. Konfiguracja katalogu bazowego] ---</w:t>
+        <w:t>--- [MIEJSCE NA ZRZUT EKRANOWY DLA: 1-2. Konfiguracja DocumentRoot] ---</w:t>
       </w:r>
     </w:p>
     <w:p>
@@ -381,7 +381,7 @@
           <w:color w:val="1A478A"/>
           <w:sz w:val="26"/>
         </w:rPr>
-        <w:t>3-4. Nasłuch portów i strony startowe</w:t>
+        <w:t>3-4. Nasłuch portów i domyślne pliki startowe</w:t>
       </w:r>
     </w:p>
     <w:p>
@@ -393,7 +393,7 @@
           <w:rFonts w:ascii="Arial" w:hAnsi="Arial"/>
           <w:sz w:val="21"/>
         </w:rPr>
-        <w:t>Skonfigurowano dyrektywę Listen 80 oraz dodano nasłuchiwanie na porcie alternatywnym Listen 8080. Zabezpieczono konfigurację przed duplikacją portów w środowisku laboratoryjnym.</w:t>
+        <w:t>Dodano nasłuchiwanie na porcie alternatywnym za pomocą dyrektywy Listen 8080. W instrukcji uwzględniono weryfikację ewentualnych istniejących dyrektyw Listen 8080 i Listen 443 w bazowym pliku httpd.conf.</w:t>
       </w:r>
     </w:p>
     <w:p>
@@ -405,19 +405,7 @@
           <w:rFonts w:ascii="Arial" w:hAnsi="Arial"/>
           <w:sz w:val="21"/>
         </w:rPr>
-        <w:t>W dyrektywie DirectoryIndex ustalono priorytety plików startowych: start.html index.html index.htm.</w:t>
-      </w:r>
-    </w:p>
-    <w:p>
-      <w:pPr>
-        <w:spacing w:line="276" w:lineRule="auto" w:after="80"/>
-      </w:pPr>
-      <w:r>
-        <w:rPr>
-          <w:rFonts w:ascii="Arial" w:hAnsi="Arial"/>
-          <w:sz w:val="21"/>
-        </w:rPr>
-        <w:t>Dla domeny meble80 skonfigurowano automatyczne indeksowanie (Options +Indexes) z wykorzystaniem nagłówka HeaderName naglowek.html i stopki ReadmeName stopka.html. Zgodnie z audytem z katalogu meble80 usunięto statyczny plik start.html, co umożliwiło serwerowi Apache generowanie dynamicznej listy plików z ilustracją foto.jpg oraz wstrzykiwanym nagłówkiem i stopką.</w:t>
+        <w:t>Zdefiniowano domyślne pliki startowe serwera: DirectoryIndex st.html index.php index.html.</w:t>
       </w:r>
     </w:p>
     <w:tbl>
@@ -451,11 +439,9 @@
                 <w:color w:val="222222"/>
                 <w:sz w:val="18"/>
               </w:rPr>
-              <w:t>Listen 80</w:t>
-              <w:br/>
               <w:t>Listen 8080</w:t>
               <w:br/>
-              <w:t>DirectoryIndex start.html index.html index.htm</w:t>
+              <w:t>DirectoryIndex st.html index.php index.html</w:t>
             </w:r>
           </w:p>
         </w:tc>
@@ -478,7 +464,7 @@
           <w:color w:val="888888"/>
           <w:sz w:val="19"/>
         </w:rPr>
-        <w:t>--- [MIEJSCE NA ZRZUT EKRANOWY DLA: 3-4. Nasłuch portów i strony startowe] ---</w:t>
+        <w:t>--- [MIEJSCE NA ZRZUT EKRANOWY DLA: 3-4. Nasłuch portów i pliki startowe] ---</w:t>
       </w:r>
     </w:p>
     <w:p>
@@ -493,7 +479,7 @@
           <w:color w:val="1A478A"/>
           <w:sz w:val="26"/>
         </w:rPr>
-        <w:t>5-6. Wirtualne domeny oparte na nazwach i aliasy</w:t>
+        <w:t>5-8. Wirtualne hosty (meble.pl, meble80, auta.pl, auta80)</w:t>
       </w:r>
     </w:p>
     <w:p>
@@ -505,7 +491,7 @@
           <w:rFonts w:ascii="Arial" w:hAnsi="Arial"/>
           <w:sz w:val="21"/>
         </w:rPr>
-        <w:t>Zaimplementowano obsługę wirtualnych hostów opartych na nazwach (Name-based Virtual Hosts) na porcie 80 dla domen: meble.pl, auto.pl, phpmyad.pl oraz na porcie 8080 dla meble.pl.</w:t>
+        <w:t>Zdefiniowano wirtualne hosty oparte o adresy IP i porty zgodnie z wytycznymi:</w:t>
       </w:r>
     </w:p>
     <w:p>
@@ -517,7 +503,7 @@
           <w:rFonts w:ascii="Arial" w:hAnsi="Arial"/>
           <w:sz w:val="21"/>
         </w:rPr>
-        <w:t>W pliku hosts systemu operacyjnego (C:\Windows\System32\drivers\etc\hosts) zdefiniowano mapowanie nazw domenowych na adres pętli zwrotnej 127.0.0.1.</w:t>
+        <w:t>1. www.meble.pl na porcie 80 (&lt;VirtualHost 10.0.2.2:80&gt;) z katalogiem DocumentRoot meble, plikiem startowym start.html oraz obsługą modułu server-status w lokacji /status.</w:t>
       </w:r>
     </w:p>
     <w:p>
@@ -529,7 +515,31 @@
           <w:rFonts w:ascii="Arial" w:hAnsi="Arial"/>
           <w:sz w:val="21"/>
         </w:rPr>
-        <w:t>W domenie meble.pl utworzono alias katalogu: dyrektywa Alias /pomoc mapuje żądania na fizyczny katalog pomoc na dysku.</w:t>
+        <w:t>2. www.meble.pl na porcie 8080 (&lt;VirtualHost 10.0.2.2:8080&gt;) z katalogiem meble80. Skonfigurowano automatyczne indeksowanie (Options +Indexes) z opcją FancyIndexing, nagłówkiem HeaderName naglowek.html (zawierającym dane zespołu) oraz stopką ReadmeName stopka.html. Z katalogu usunięto statyczny plik start.html, dzięki czemu serwer dynamicznie generuje listę plików z plikiem graficznym foto.jpg.</w:t>
+      </w:r>
+    </w:p>
+    <w:p>
+      <w:pPr>
+        <w:spacing w:line="276" w:lineRule="auto" w:after="80"/>
+      </w:pPr>
+      <w:r>
+        <w:rPr>
+          <w:rFonts w:ascii="Arial" w:hAnsi="Arial"/>
+          <w:sz w:val="21"/>
+        </w:rPr>
+        <w:t>3. www.auta.pl na porcie 80 (&lt;VirtualHost 10.0.3.3:80&gt;) oraz na porcie 8080 (&lt;VirtualHost 10.0.3.3:8080&gt;). Obie lokacje zabezpieczono autoryzacją HTTP Basic Auth.</w:t>
+      </w:r>
+    </w:p>
+    <w:p>
+      <w:pPr>
+        <w:spacing w:line="276" w:lineRule="auto" w:after="80"/>
+      </w:pPr>
+      <w:r>
+        <w:rPr>
+          <w:rFonts w:ascii="Arial" w:hAnsi="Arial"/>
+          <w:sz w:val="21"/>
+        </w:rPr>
+        <w:t>4. www.phpmyad.pl na porcie 80 (&lt;VirtualHost 127.0.0.1:80&gt;) z restrykcją dostępu Require ip 127.0.0.1.</w:t>
       </w:r>
     </w:p>
     <w:tbl>
@@ -563,15 +573,27 @@
                 <w:color w:val="222222"/>
                 <w:sz w:val="18"/>
               </w:rPr>
-              <w:t>&lt;VirtualHost *:80&gt;</w:t>
+              <w:t>&lt;VirtualHost 10.0.2.2:8080&gt;</w:t>
               <w:br/>
-              <w:t xml:space="preserve">    ServerName meble.pl</w:t>
+              <w:t xml:space="preserve">    ServerName www.meble.pl</w:t>
               <w:br/>
-              <w:t xml:space="preserve">    DocumentRoot "D:/Studenci/Cw_01/3ID11B_01/meble"</w:t>
-              <w:br/>
-              <w:t xml:space="preserve">    Alias /pomoc "D:/Studenci/Cw_01/3ID11B_01/pomoc"</w:t>
+              <w:t xml:space="preserve">    DocumentRoot "D:/Studenci/Cw_01/3ID11B_01/meble80"</w:t>
               <w:br/>
               <w:t>&lt;/VirtualHost&gt;</w:t>
+              <w:br/>
+              <w:t>&lt;Directory "D:/Studenci/Cw_01/3ID11B_01/meble80"&gt;</w:t>
+              <w:br/>
+              <w:t xml:space="preserve">    Options Indexes FollowSymLinks</w:t>
+              <w:br/>
+              <w:t xml:space="preserve">    IndexOptions FancyIndexing FoldersFirst VersionSort</w:t>
+              <w:br/>
+              <w:t xml:space="preserve">    HeaderName naglowek.html</w:t>
+              <w:br/>
+              <w:t xml:space="preserve">    ReadmeName stopka.html</w:t>
+              <w:br/>
+              <w:t xml:space="preserve">    Require all granted</w:t>
+              <w:br/>
+              <w:t>&lt;/Directory&gt;</w:t>
             </w:r>
           </w:p>
         </w:tc>
@@ -594,7 +616,7 @@
           <w:color w:val="888888"/>
           <w:sz w:val="19"/>
         </w:rPr>
-        <w:t>--- [MIEJSCE NA ZRZUT EKRANOWY DLA: 5-6. Wirtualne domeny i aliasy] ---</w:t>
+        <w:t>--- [MIEJSCE NA ZRZUT EKRANOWY DLA: 5-8. Wirtualne hosty i indeksowanie] ---</w:t>
       </w:r>
     </w:p>
     <w:p>
@@ -609,7 +631,7 @@
           <w:color w:val="1A478A"/>
           <w:sz w:val="26"/>
         </w:rPr>
-        <w:t>7-11. Zaawansowana konfiguracja (przekierowania, strony błędów)</w:t>
+        <w:t>9-11. Obsługa własnych stron błędów HTTP</w:t>
       </w:r>
     </w:p>
     <w:p>
@@ -621,7 +643,7 @@
           <w:rFonts w:ascii="Arial" w:hAnsi="Arial"/>
           <w:sz w:val="21"/>
         </w:rPr>
-        <w:t>Skonfigurowano stałe przekierowanie żądań z zasobu /stare na zasób /nowe za pomocą dyrektywy Redirect 301.</w:t>
+        <w:t>Skonfigurowano globalny alias dla stron błędów Alias /err/ "D:/Studenci/Cw_01/3ID11B_01/error/" oraz zdefiniowano dyrektywy ErrorDocument dla kodów 404, 403 i 500.</w:t>
       </w:r>
     </w:p>
     <w:p>
@@ -633,7 +655,7 @@
           <w:rFonts w:ascii="Arial" w:hAnsi="Arial"/>
           <w:sz w:val="21"/>
         </w:rPr>
-        <w:t>Zdefiniowano własne strony obsługi błędów HTTP dla domeny meble.pl: ErrorDocument 403 /error/403.html oraz ErrorDocument 404 /error/404.html. W podkatalogu error przygotowano estetyczny plik 403.html informujący o braku uprawnień dostępu.</w:t>
+        <w:t>Dla domeny meble.pl oraz katalogu meble przygotowano dedykowane pliki obsługi błędów /error/404.html oraz /error/403.html w estetycznej oprawie graficznej.</w:t>
       </w:r>
     </w:p>
     <w:tbl>
@@ -667,11 +689,13 @@
                 <w:color w:val="222222"/>
                 <w:sz w:val="18"/>
               </w:rPr>
-              <w:t>ErrorDocument 403 /error/403.html</w:t>
+              <w:t>Alias /err/ "D:/Studenci/Cw_01/3ID11B_01/error/"</w:t>
               <w:br/>
-              <w:t>ErrorDocument 404 /error/404.html</w:t>
+              <w:t>ErrorDocument 404 /err/404.html</w:t>
               <w:br/>
-              <w:t>Redirect /stare http://meble.pl/nowe</w:t>
+              <w:t>ErrorDocument 403 /err/403.html</w:t>
+              <w:br/>
+              <w:t>ErrorDocument 500 /err/500.html</w:t>
             </w:r>
           </w:p>
         </w:tc>
@@ -694,7 +718,7 @@
           <w:color w:val="888888"/>
           <w:sz w:val="19"/>
         </w:rPr>
-        <w:t>--- [MIEJSCE NA ZRZUT EKRANOWY DLA: 7-11. Przekierowania i strony błędów] ---</w:t>
+        <w:t>--- [MIEJSCE NA ZRZUT EKRANOWY DLA: 9-11. Własne strony błędów HTTP] ---</w:t>
       </w:r>
     </w:p>
     <w:p>
@@ -709,7 +733,7 @@
           <w:color w:val="1A478A"/>
           <w:sz w:val="26"/>
         </w:rPr>
-        <w:t>12. Kontrola dostępu i autoryzacja HTTP Basic</w:t>
+        <w:t>12. Kontrola dostępu i autoryzacja HTTP Basic (hasla.has)</w:t>
       </w:r>
     </w:p>
     <w:p>
@@ -721,7 +745,7 @@
           <w:rFonts w:ascii="Arial" w:hAnsi="Arial"/>
           <w:sz w:val="21"/>
         </w:rPr>
-        <w:t>Wdrożono zróżnicowane polityki kontroli dostępu dla poszczególnych wirtualnych hostów:</w:t>
+        <w:t>Katalogi domen auta oraz auta80 zabezpieczono za pomocą modułu mod_auth_basic. Zdefiniowano plik haseł AuthUserFile "D:/Studenci/Cw_01/3ID11B_01/hasla.has".</w:t>
       </w:r>
     </w:p>
     <w:p>
@@ -733,7 +757,7 @@
           <w:rFonts w:ascii="Arial" w:hAnsi="Arial"/>
           <w:sz w:val="21"/>
         </w:rPr>
-        <w:t>1. meble.pl: otwarty dostęp dla wszystkich użytkowników (Require all granted).</w:t>
+        <w:t>W pliku hasla.has wygenerowano konto użytkownika st z poprawnym haszem SHA-1 dla hasła st: st:{SHA}mwLZl0wU5iPJ/77XNgvqy/DcuV8=.</w:t>
       </w:r>
     </w:p>
     <w:p>
@@ -745,19 +769,7 @@
           <w:rFonts w:ascii="Arial" w:hAnsi="Arial"/>
           <w:sz w:val="21"/>
         </w:rPr>
-        <w:t>2. auto.pl: autoryzacja HTTP Basic Auth. Użyto pliku haseł hasla.has z użytkownikiem st i hasłem st. Zgodnie z audytem wygenerowano poprawny hasz kryptograficzny SHA-1: st:{SHA}mwLZl0wU5iPJ/77XNgvqy/DcuV8=.</w:t>
-      </w:r>
-    </w:p>
-    <w:p>
-      <w:pPr>
-        <w:spacing w:line="276" w:lineRule="auto" w:after="80"/>
-      </w:pPr>
-      <w:r>
-        <w:rPr>
-          <w:rFonts w:ascii="Arial" w:hAnsi="Arial"/>
-          <w:sz w:val="21"/>
-        </w:rPr>
-        <w:t>3. phpmyad.pl: restrykcja na poziomie adresu IP (Require ip 127.0.0.1), blokująca dostęp z innych węzłów sieci.</w:t>
+        <w:t>Dostęp do zasobów phpmyad.pl ograniczono wyłącznie do adresu lokalnego za pomocą dyrektywy Require ip 127.0.0.1.</w:t>
       </w:r>
     </w:p>
     <w:tbl>
@@ -791,25 +803,21 @@
                 <w:color w:val="222222"/>
                 <w:sz w:val="18"/>
               </w:rPr>
-              <w:t>&lt;VirtualHost *:80&gt;</w:t>
+              <w:t>&lt;Directory "D:/Studenci/Cw_01/3ID11B_01/auta"&gt;</w:t>
               <w:br/>
-              <w:t xml:space="preserve">    ServerName auto.pl</w:t>
+              <w:t xml:space="preserve">    Options Indexes FollowSymLinks</w:t>
               <w:br/>
-              <w:t xml:space="preserve">    DocumentRoot "D:/Studenci/Cw_01/3ID11B_01/auto"</w:t>
+              <w:t xml:space="preserve">    AllowOverride None</w:t>
               <w:br/>
-              <w:t xml:space="preserve">    &lt;Directory "D:/Studenci/Cw_01/3ID11B_01/auto"&gt;</w:t>
+              <w:t xml:space="preserve">    AuthType Basic</w:t>
               <w:br/>
-              <w:t xml:space="preserve">        AuthType Basic</w:t>
+              <w:t xml:space="preserve">    AuthName "Auta - Wymagana autoryzacja studenta"</w:t>
               <w:br/>
-              <w:t xml:space="preserve">        AuthName "Dostep Autoryzowany"</w:t>
+              <w:t xml:space="preserve">    AuthUserFile "D:/Studenci/Cw_01/3ID11B_01/hasla.has"</w:t>
               <w:br/>
-              <w:t xml:space="preserve">        AuthUserFile "D:/Studenci/Cw_01/3ID11B_01/hasla.has"</w:t>
+              <w:t xml:space="preserve">    Require user st</w:t>
               <w:br/>
-              <w:t xml:space="preserve">        Require valid-user</w:t>
-              <w:br/>
-              <w:t xml:space="preserve">    &lt;/Directory&gt;</w:t>
-              <w:br/>
-              <w:t>&lt;/VirtualHost&gt;</w:t>
+              <w:t>&lt;/Directory&gt;</w:t>
             </w:r>
           </w:p>
         </w:tc>
@@ -859,7 +867,7 @@
           <w:rFonts w:ascii="Arial" w:hAnsi="Arial"/>
           <w:sz w:val="21"/>
         </w:rPr>
-        <w:t>Włączono moduł mod_status oraz dyrektywę ExtendedStatus On. W domenie meble.pl skonfigurowano sekcję Location /status powiązaną z programem obsługi server-status, umożliwiającą bieżący monitoring obciążenia i statystyk pracy serwera Apache.</w:t>
+        <w:t>W wirtualnym hoście www.meble.pl na porcie 80 zdefiniowano lokację /status obsługiwaną przez wewnętrzny handler server-status, z uprawnieniem dostępu Require all granted.</w:t>
       </w:r>
     </w:p>
     <w:tbl>
@@ -949,7 +957,7 @@
           <w:rFonts w:ascii="Arial" w:hAnsi="Arial"/>
           <w:sz w:val="21"/>
         </w:rPr>
-        <w:t>Za pomocą pakietu OpenSSL wygenerowano 2048-bitowy klucz prywatny RSA oraz samopodpisany certyfikat X.509 z unikalnymi parametrami zespołu: State=3ID11B, Locality=97882-97889, CN=meble.pl.</w:t>
+        <w:t>Zdefiniowano dyrektywę Listen 443 https oraz wirtualny host &lt;VirtualHost 10.0.2.2:443&gt; dla domeny www.meble.pl z katalogiem DocumentRoot meble443.</w:t>
       </w:r>
     </w:p>
     <w:p>
@@ -961,7 +969,7 @@
           <w:rFonts w:ascii="Arial" w:hAnsi="Arial"/>
           <w:sz w:val="21"/>
         </w:rPr>
-        <w:t>W pliku konfiguracyjnym zdefiniowano wirtualny host &lt;VirtualHost *:443&gt; z włączoną obsługą SSLEngine on oraz ścieżkami do certyfikatu i klucza prywatnego.</w:t>
+        <w:t>Włączono obsługę szyfrowania SSLEngine on oraz podpięto 2048-bitowy certyfikat i klucz prywatny RSA wygenerowane za pomocą OpenSSL z danymi zespołu: SSLCertificateFile "D:/Studenci/Cw_01/3ID11B_01/ssl/meble.crt" oraz SSLCertificateKeyFile "D:/Studenci/Cw_01/3ID11B_01/ssl/meble.key".</w:t>
       </w:r>
     </w:p>
     <w:tbl>
@@ -995,17 +1003,21 @@
                 <w:color w:val="222222"/>
                 <w:sz w:val="18"/>
               </w:rPr>
-              <w:t>&lt;VirtualHost *:443&gt;</w:t>
+              <w:t>&lt;VirtualHost 10.0.2.2:443&gt;</w:t>
               <w:br/>
-              <w:t xml:space="preserve">    ServerName meble.pl</w:t>
+              <w:t xml:space="preserve">    ServerName www.meble.pl</w:t>
               <w:br/>
-              <w:t xml:space="preserve">    DocumentRoot "D:/Studenci/Cw_01/3ID11B_01/meble"</w:t>
+              <w:t xml:space="preserve">    ServerAlias meble.pl</w:t>
+              <w:br/>
+              <w:t xml:space="preserve">    DocumentRoot "D:/Studenci/Cw_01/3ID11B_01/meble443"</w:t>
+              <w:br/>
+              <w:t xml:space="preserve">    DirectoryIndex start.html st.html index.php</w:t>
               <w:br/>
               <w:t xml:space="preserve">    SSLEngine on</w:t>
               <w:br/>
-              <w:t xml:space="preserve">    SSLCertificateFile "conf/ssl/meble.crt"</w:t>
+              <w:t xml:space="preserve">    SSLCertificateFile "D:/Studenci/Cw_01/3ID11B_01/ssl/meble.crt"</w:t>
               <w:br/>
-              <w:t xml:space="preserve">    SSLCertificateKeyFile "conf/ssl/meble.key"</w:t>
+              <w:t xml:space="preserve">    SSLCertificateKeyFile "D:/Studenci/Cw_01/3ID11B_01/ssl/meble.key"</w:t>
               <w:br/>
               <w:t>&lt;/VirtualHost&gt;</w:t>
             </w:r>
@@ -1045,7 +1057,7 @@
           <w:color w:val="1A478A"/>
           <w:sz w:val="26"/>
         </w:rPr>
-        <w:t>15. Rejestracja zdarzeń (logi) i stabilność środowiska</w:t>
+        <w:t>15. Rejestracja zdarzeń w logach (historia/p.log)</w:t>
       </w:r>
     </w:p>
     <w:p>
@@ -1057,7 +1069,7 @@
           <w:rFonts w:ascii="Arial" w:hAnsi="Arial"/>
           <w:sz w:val="21"/>
         </w:rPr>
-        <w:t>Zdefiniowano dedykowany format logów: LogFormat "%t %h %v \"%{User-Agent}i\"" format_3id11b.</w:t>
+        <w:t>Zdefiniowano format dziennika LogFormat "%t %h %v \"%{User-Agent}i\"" lab1_log_format rejestrujący czas żądania, adres IP klienta, nazwę domeny oraz identyfikator przeglądarki.</w:t>
       </w:r>
     </w:p>
     <w:p>
@@ -1069,7 +1081,7 @@
           <w:rFonts w:ascii="Arial" w:hAnsi="Arial"/>
           <w:sz w:val="21"/>
         </w:rPr>
-        <w:t>Skonfigurowano zapis zdarzeń do pliku historia/p.log. W katalogu historia utworzono plik znacznikowy .gitkeep, co gwarantuje istnienie katalogu docelowego i zapobiega krytycznemu błędowi Apache AH00014 podczas startu usługi.</w:t>
+        <w:t>Wszystkie zdarzenia rejestrowane są w pliku D:/Studenci/Cw_01/3ID11B_01/historia/p.log. W katalogu historia umieszczono plik .gitkeep, co eliminuje błąd Apache AH00014 przy starcie usługi.</w:t>
       </w:r>
     </w:p>
     <w:tbl>
@@ -1103,9 +1115,9 @@
                 <w:color w:val="222222"/>
                 <w:sz w:val="18"/>
               </w:rPr>
-              <w:t>LogFormat "%t %h %v \"%{User-Agent}i\"" format_3id11b</w:t>
+              <w:t>LogFormat "%t %h %v \"%{User-Agent}i\"" lab1_log_format</w:t>
               <w:br/>
-              <w:t>CustomLog "D:/Studenci/Cw_01/3ID11B_01/historia/p.log" format_3id11b</w:t>
+              <w:t>CustomLog "D:/Studenci/Cw_01/3ID11B_01/historia/p.log" lab1_log_format</w:t>
             </w:r>
           </w:p>
         </w:tc>
@@ -1155,7 +1167,7 @@
           <w:rFonts w:ascii="Arial" w:hAnsi="Arial"/>
           <w:sz w:val="21"/>
         </w:rPr>
-        <w:t>W ramach ćwiczenia w pełni skonfigurowano wielofunkcyjny serwer WWW Apache 2.4. Wszystkie 15 punktów specyfikacji zrealizowano bezbłędnie.</w:t>
+        <w:t>Wszystkie zadania konfiguracji serwera Apache 2.4 zostały zrealizowane zgodnie ze strukturą plików i dyrektyw w httpd_append.conf.</w:t>
       </w:r>
     </w:p>
     <w:p>
@@ -1167,7 +1179,7 @@
           <w:rFonts w:ascii="Arial" w:hAnsi="Arial"/>
           <w:sz w:val="21"/>
         </w:rPr>
-        <w:t>Wyeliminowano potencjalne problemy związane z kolizją portów, brakującymi plikami dziennika, haszowaniem haseł oraz dynamicznym indeksowaniem katalogów. Konfiguracja jest w pełni funkcjonalna i gotowa do pracy produkcyjnej.</w:t>
+        <w:t>Zapewniono poprawną kolejność wdrożenia (przygotowanie katalogów -&gt; certyfikaty SSL -&gt; konfiguracja -&gt; httpd -t -&gt; restart), eliminując ryzyko błędów startowych.</w:t>
       </w:r>
     </w:p>
     <w:sectPr>

</xml_diff>

<commit_message>
Complete Lab 1 report with all 17 actual screenshots and compile DOCX/PDF for all labs 1-6 (3ID11B_06)
</commit_message>
<xml_diff>
--- a/04-Gotowe_Laborki/Lab_01/Sprawozdanie_Lab_01.docx
+++ b/04-Gotowe_Laborki/Lab_01/Sprawozdanie_Lab_01.docx
@@ -4,6 +4,7 @@
   <w:body>
     <w:p>
       <w:pPr>
+        <w:spacing w:before="0" w:after="80"/>
         <w:jc w:val="center"/>
       </w:pPr>
       <w:r>
@@ -18,13 +19,15 @@
     </w:p>
     <w:p>
       <w:pPr>
+        <w:spacing w:after="280"/>
         <w:jc w:val="center"/>
       </w:pPr>
       <w:r>
         <w:rPr>
           <w:rFonts w:ascii="Arial" w:hAnsi="Arial"/>
           <w:b/>
-          <w:sz w:val="26"/>
+          <w:color w:val="2B6CB0"/>
+          <w:sz w:val="24"/>
         </w:rPr>
         <w:t>Temat: Konfiguracja serwera WWW Apache 2.4</w:t>
         <w:br/>
@@ -33,32 +36,44 @@
     </w:p>
     <w:tbl>
       <w:tblPr>
-        <w:tblStyle w:val="TableGrid"/>
         <w:tblW w:type="auto" w:w="0"/>
         <w:jc w:val="center"/>
         <w:tblLook w:firstColumn="1" w:firstRow="1" w:lastColumn="0" w:lastRow="0" w:noHBand="0" w:noVBand="1" w:val="04A0"/>
+        <w:tblBorders>
+          <w:top w:val="single" w:sz="6" w:space="0" w:color="CBD5E1"/>
+          <w:left w:val="single" w:sz="6" w:space="0" w:color="CBD5E1"/>
+          <w:bottom w:val="single" w:sz="6" w:space="0" w:color="CBD5E1"/>
+          <w:right w:val="single" w:sz="6" w:space="0" w:color="CBD5E1"/>
+          <w:insideH w:val="single" w:sz="6" w:space="0" w:color="CBD5E1"/>
+          <w:insideV w:val="single" w:sz="6" w:space="0" w:color="CBD5E1"/>
+        </w:tblBorders>
       </w:tblPr>
       <w:tblGrid>
-        <w:gridCol w:w="4320"/>
-        <w:gridCol w:w="4320"/>
+        <w:gridCol w:w="5040"/>
+        <w:gridCol w:w="5040"/>
       </w:tblGrid>
       <w:tr>
         <w:tc>
           <w:tcPr>
-            <w:tcW w:type="dxa" w:w="3600"/>
+            <w:tcW w:type="dxa" w:w="3744"/>
+            <w:shd w:val="clear" w:color="auto" w:fill="F1F5F9"/>
             <w:tcMar>
-              <w:top w:w="80" w:type="dxa"/>
-              <w:bottom w:w="80" w:type="dxa"/>
-              <w:left w:w="120" w:type="dxa"/>
-              <w:right w:w="120" w:type="dxa"/>
+              <w:top w:w="60" w:type="dxa"/>
+              <w:bottom w:w="60" w:type="dxa"/>
+              <w:left w:w="100" w:type="dxa"/>
+              <w:right w:w="100" w:type="dxa"/>
             </w:tcMar>
           </w:tcPr>
           <w:p>
+            <w:pPr>
+              <w:spacing w:after="0"/>
+            </w:pPr>
             <w:r>
               <w:rPr>
                 <w:rFonts w:ascii="Arial" w:hAnsi="Arial"/>
                 <w:b/>
-                <w:sz w:val="20"/>
+                <w:color w:val="1F2937"/>
+                <w:sz w:val="19"/>
               </w:rPr>
               <w:t>Kierunek / Semestr / Grupa:</w:t>
             </w:r>
@@ -66,21 +81,26 @@
         </w:tc>
         <w:tc>
           <w:tcPr>
-            <w:tcW w:type="dxa" w:w="6048"/>
+            <w:tcW w:type="dxa" w:w="5904"/>
+            <w:shd w:val="clear" w:color="auto" w:fill="FFFFFF"/>
             <w:tcMar>
-              <w:top w:w="80" w:type="dxa"/>
-              <w:bottom w:w="80" w:type="dxa"/>
-              <w:left w:w="120" w:type="dxa"/>
-              <w:right w:w="120" w:type="dxa"/>
+              <w:top w:w="60" w:type="dxa"/>
+              <w:bottom w:w="60" w:type="dxa"/>
+              <w:left w:w="100" w:type="dxa"/>
+              <w:right w:w="100" w:type="dxa"/>
             </w:tcMar>
           </w:tcPr>
           <w:p>
+            <w:pPr>
+              <w:spacing w:after="0"/>
+            </w:pPr>
             <w:r>
               <w:rPr>
                 <w:rFonts w:ascii="Arial" w:hAnsi="Arial"/>
-                <w:sz w:val="20"/>
+                <w:color w:val="1F2937"/>
+                <w:sz w:val="19"/>
               </w:rPr>
-              <w:t>Informatyka / Semestr 5 / 3ID11B</w:t>
+              <w:t>Informatyka / Semestr 5 / 3ID11B (Podgrupa 06)</w:t>
             </w:r>
           </w:p>
         </w:tc>
@@ -88,20 +108,25 @@
       <w:tr>
         <w:tc>
           <w:tcPr>
-            <w:tcW w:type="dxa" w:w="3600"/>
+            <w:tcW w:type="dxa" w:w="3744"/>
+            <w:shd w:val="clear" w:color="auto" w:fill="F1F5F9"/>
             <w:tcMar>
-              <w:top w:w="80" w:type="dxa"/>
-              <w:bottom w:w="80" w:type="dxa"/>
-              <w:left w:w="120" w:type="dxa"/>
-              <w:right w:w="120" w:type="dxa"/>
+              <w:top w:w="60" w:type="dxa"/>
+              <w:bottom w:w="60" w:type="dxa"/>
+              <w:left w:w="100" w:type="dxa"/>
+              <w:right w:w="100" w:type="dxa"/>
             </w:tcMar>
           </w:tcPr>
           <w:p>
+            <w:pPr>
+              <w:spacing w:after="0"/>
+            </w:pPr>
             <w:r>
               <w:rPr>
                 <w:rFonts w:ascii="Arial" w:hAnsi="Arial"/>
                 <w:b/>
-                <w:sz w:val="20"/>
+                <w:color w:val="1F2937"/>
+                <w:sz w:val="19"/>
               </w:rPr>
               <w:t>Student 1 (Autor):</w:t>
             </w:r>
@@ -109,19 +134,24 @@
         </w:tc>
         <w:tc>
           <w:tcPr>
-            <w:tcW w:type="dxa" w:w="6048"/>
+            <w:tcW w:type="dxa" w:w="5904"/>
+            <w:shd w:val="clear" w:color="auto" w:fill="FFFFFF"/>
             <w:tcMar>
-              <w:top w:w="80" w:type="dxa"/>
-              <w:bottom w:w="80" w:type="dxa"/>
-              <w:left w:w="120" w:type="dxa"/>
-              <w:right w:w="120" w:type="dxa"/>
+              <w:top w:w="60" w:type="dxa"/>
+              <w:bottom w:w="60" w:type="dxa"/>
+              <w:left w:w="100" w:type="dxa"/>
+              <w:right w:w="100" w:type="dxa"/>
             </w:tcMar>
           </w:tcPr>
           <w:p>
+            <w:pPr>
+              <w:spacing w:after="0"/>
+            </w:pPr>
             <w:r>
               <w:rPr>
                 <w:rFonts w:ascii="Arial" w:hAnsi="Arial"/>
-                <w:sz w:val="20"/>
+                <w:color w:val="1F2937"/>
+                <w:sz w:val="19"/>
               </w:rPr>
               <w:t>Artem Hizhovskyi (nr albumu: s097882)</w:t>
             </w:r>
@@ -131,20 +161,25 @@
       <w:tr>
         <w:tc>
           <w:tcPr>
-            <w:tcW w:type="dxa" w:w="3600"/>
+            <w:tcW w:type="dxa" w:w="3744"/>
+            <w:shd w:val="clear" w:color="auto" w:fill="F1F5F9"/>
             <w:tcMar>
-              <w:top w:w="80" w:type="dxa"/>
-              <w:bottom w:w="80" w:type="dxa"/>
-              <w:left w:w="120" w:type="dxa"/>
-              <w:right w:w="120" w:type="dxa"/>
+              <w:top w:w="60" w:type="dxa"/>
+              <w:bottom w:w="60" w:type="dxa"/>
+              <w:left w:w="100" w:type="dxa"/>
+              <w:right w:w="100" w:type="dxa"/>
             </w:tcMar>
           </w:tcPr>
           <w:p>
+            <w:pPr>
+              <w:spacing w:after="0"/>
+            </w:pPr>
             <w:r>
               <w:rPr>
                 <w:rFonts w:ascii="Arial" w:hAnsi="Arial"/>
                 <w:b/>
-                <w:sz w:val="20"/>
+                <w:color w:val="1F2937"/>
+                <w:sz w:val="19"/>
               </w:rPr>
               <w:t>Student 2 (Autor):</w:t>
             </w:r>
@@ -152,19 +187,24 @@
         </w:tc>
         <w:tc>
           <w:tcPr>
-            <w:tcW w:type="dxa" w:w="6048"/>
+            <w:tcW w:type="dxa" w:w="5904"/>
+            <w:shd w:val="clear" w:color="auto" w:fill="FFFFFF"/>
             <w:tcMar>
-              <w:top w:w="80" w:type="dxa"/>
-              <w:bottom w:w="80" w:type="dxa"/>
-              <w:left w:w="120" w:type="dxa"/>
-              <w:right w:w="120" w:type="dxa"/>
+              <w:top w:w="60" w:type="dxa"/>
+              <w:bottom w:w="60" w:type="dxa"/>
+              <w:left w:w="100" w:type="dxa"/>
+              <w:right w:w="100" w:type="dxa"/>
             </w:tcMar>
           </w:tcPr>
           <w:p>
+            <w:pPr>
+              <w:spacing w:after="0"/>
+            </w:pPr>
             <w:r>
               <w:rPr>
                 <w:rFonts w:ascii="Arial" w:hAnsi="Arial"/>
-                <w:sz w:val="20"/>
+                <w:color w:val="1F2937"/>
+                <w:sz w:val="19"/>
               </w:rPr>
               <w:t>Ihor Namachynskyi (nr albumu: s097889)</w:t>
             </w:r>
@@ -174,20 +214,25 @@
       <w:tr>
         <w:tc>
           <w:tcPr>
-            <w:tcW w:type="dxa" w:w="3600"/>
+            <w:tcW w:type="dxa" w:w="3744"/>
+            <w:shd w:val="clear" w:color="auto" w:fill="F1F5F9"/>
             <w:tcMar>
-              <w:top w:w="80" w:type="dxa"/>
-              <w:bottom w:w="80" w:type="dxa"/>
-              <w:left w:w="120" w:type="dxa"/>
-              <w:right w:w="120" w:type="dxa"/>
+              <w:top w:w="60" w:type="dxa"/>
+              <w:bottom w:w="60" w:type="dxa"/>
+              <w:left w:w="100" w:type="dxa"/>
+              <w:right w:w="100" w:type="dxa"/>
             </w:tcMar>
           </w:tcPr>
           <w:p>
+            <w:pPr>
+              <w:spacing w:after="0"/>
+            </w:pPr>
             <w:r>
               <w:rPr>
                 <w:rFonts w:ascii="Arial" w:hAnsi="Arial"/>
                 <w:b/>
-                <w:sz w:val="20"/>
+                <w:color w:val="1F2937"/>
+                <w:sz w:val="19"/>
               </w:rPr>
               <w:t>Prowadzący zajęcia:</w:t>
             </w:r>
@@ -195,19 +240,24 @@
         </w:tc>
         <w:tc>
           <w:tcPr>
-            <w:tcW w:type="dxa" w:w="6048"/>
+            <w:tcW w:type="dxa" w:w="5904"/>
+            <w:shd w:val="clear" w:color="auto" w:fill="FFFFFF"/>
             <w:tcMar>
-              <w:top w:w="80" w:type="dxa"/>
-              <w:bottom w:w="80" w:type="dxa"/>
-              <w:left w:w="120" w:type="dxa"/>
-              <w:right w:w="120" w:type="dxa"/>
+              <w:top w:w="60" w:type="dxa"/>
+              <w:bottom w:w="60" w:type="dxa"/>
+              <w:left w:w="100" w:type="dxa"/>
+              <w:right w:w="100" w:type="dxa"/>
             </w:tcMar>
           </w:tcPr>
           <w:p>
+            <w:pPr>
+              <w:spacing w:after="0"/>
+            </w:pPr>
             <w:r>
               <w:rPr>
                 <w:rFonts w:ascii="Arial" w:hAnsi="Arial"/>
-                <w:sz w:val="20"/>
+                <w:color w:val="1F2937"/>
+                <w:sz w:val="19"/>
               </w:rPr>
               <w:t>Dr inż. Jarosław Wikarek</w:t>
             </w:r>
@@ -217,20 +267,25 @@
       <w:tr>
         <w:tc>
           <w:tcPr>
-            <w:tcW w:type="dxa" w:w="3600"/>
+            <w:tcW w:type="dxa" w:w="3744"/>
+            <w:shd w:val="clear" w:color="auto" w:fill="F1F5F9"/>
             <w:tcMar>
-              <w:top w:w="80" w:type="dxa"/>
-              <w:bottom w:w="80" w:type="dxa"/>
-              <w:left w:w="120" w:type="dxa"/>
-              <w:right w:w="120" w:type="dxa"/>
+              <w:top w:w="60" w:type="dxa"/>
+              <w:bottom w:w="60" w:type="dxa"/>
+              <w:left w:w="100" w:type="dxa"/>
+              <w:right w:w="100" w:type="dxa"/>
             </w:tcMar>
           </w:tcPr>
           <w:p>
+            <w:pPr>
+              <w:spacing w:after="0"/>
+            </w:pPr>
             <w:r>
               <w:rPr>
                 <w:rFonts w:ascii="Arial" w:hAnsi="Arial"/>
                 <w:b/>
-                <w:sz w:val="20"/>
+                <w:color w:val="1F2937"/>
+                <w:sz w:val="19"/>
               </w:rPr>
               <w:t>Data wykonania ćwiczenia:</w:t>
             </w:r>
@@ -238,21 +293,26 @@
         </w:tc>
         <w:tc>
           <w:tcPr>
-            <w:tcW w:type="dxa" w:w="6048"/>
+            <w:tcW w:type="dxa" w:w="5904"/>
+            <w:shd w:val="clear" w:color="auto" w:fill="FFFFFF"/>
             <w:tcMar>
-              <w:top w:w="80" w:type="dxa"/>
-              <w:bottom w:w="80" w:type="dxa"/>
-              <w:left w:w="120" w:type="dxa"/>
-              <w:right w:w="120" w:type="dxa"/>
+              <w:top w:w="60" w:type="dxa"/>
+              <w:bottom w:w="60" w:type="dxa"/>
+              <w:left w:w="100" w:type="dxa"/>
+              <w:right w:w="100" w:type="dxa"/>
             </w:tcMar>
           </w:tcPr>
           <w:p>
+            <w:pPr>
+              <w:spacing w:after="0"/>
+            </w:pPr>
             <w:r>
               <w:rPr>
                 <w:rFonts w:ascii="Arial" w:hAnsi="Arial"/>
-                <w:sz w:val="20"/>
+                <w:color w:val="1F2937"/>
+                <w:sz w:val="19"/>
               </w:rPr>
-              <w:t>Październik 2026 r.</w:t>
+              <w:t>22 października 2026 r.</w:t>
             </w:r>
           </w:p>
         </w:tc>
@@ -260,12 +320,13 @@
     </w:tbl>
     <w:p>
       <w:pPr>
-        <w:spacing w:after="240"/>
+        <w:spacing w:after="200"/>
       </w:pPr>
     </w:p>
     <w:p>
       <w:pPr>
-        <w:pStyle w:val="Heading2"/>
+        <w:pStyle w:val="Heading1"/>
+        <w:keepNext/>
         <w:spacing w:before="280" w:after="80"/>
       </w:pPr>
       <w:r>
@@ -275,67 +336,239 @@
           <w:color w:val="1A478A"/>
           <w:sz w:val="26"/>
         </w:rPr>
-        <w:t>1-2. Podstawowy katalog dokumentów serwera (DocumentRoot)</w:t>
+        <w:t>1. Wstęp, cel laboratorium oraz środowisko robocze</w:t>
       </w:r>
     </w:p>
     <w:p>
       <w:pPr>
         <w:spacing w:line="276" w:lineRule="auto" w:after="80"/>
+        <w:jc w:val="both"/>
       </w:pPr>
       <w:r>
         <w:rPr>
           <w:rFonts w:ascii="Arial" w:hAnsi="Arial"/>
-          <w:sz w:val="21"/>
+          <w:color w:val="1F2937"/>
+          <w:sz w:val="20"/>
         </w:rPr>
-        <w:t>Skonfigurowano nadrzędny katalog główny serwera DocumentRoot pod ścieżką D:/Studenci/Cw_01/3ID11B_01 oraz zdefiniowano blok uprawnień &lt;Directory&gt; z dyrektywami Options Indexes FollowSymLinks, AllowOverride None oraz Require all granted.</w:t>
+        <w:t>Celem ćwiczenia laboratoryjnego było kompleksowe skonfigurowanie wielodomenowego serwera WWW w oparciu o oprogramowanie Apache HTTP Server 2.4 pod systemem Windows w środowisku wirtualnym Politechniki Świętokrzyskiej. Zakres prac obejmował uruchomienie nasłuchu na wielu portach, powiązanie wirtualnych hostów z dedykowanymi adresami IP, wdrożenie mechanizmów automatycznego indeksowania zasobów (FancyIndexing), obsługę niestandardowych stron błędów HTTP (404, 403, 500), zabezpieczenie katalogów autoryzacją HTTP Basic (mod_auth_basic), diagnostykę stanu serwera (mod_status), wdrożenie bezpiecznej komunikacji szyfrowanej SSL/TLS (HTTPS na porcie 443) oraz rejestrację zdarzeń w dedykowanym formacie logów.</w:t>
       </w:r>
     </w:p>
     <w:p>
       <w:pPr>
         <w:spacing w:line="276" w:lineRule="auto" w:after="80"/>
+        <w:jc w:val="both"/>
       </w:pPr>
       <w:r>
         <w:rPr>
           <w:rFonts w:ascii="Arial" w:hAnsi="Arial"/>
-          <w:sz w:val="21"/>
+          <w:color w:val="1F2937"/>
+          <w:sz w:val="20"/>
         </w:rPr>
-        <w:t>Wewnątrz katalogu utworzono fizyczną strukturę podkatalogów dla poszczególnych domen i funkcji: meble, meble80, meble443, auta, auta80, error, historia oraz ssl.</w:t>
+        <w:t>Środowisko laboratoryjne opierało się na maszynie wirtualnej z systemem Windows 10 x64, serwerze Apache 2.4.58 (Win64) zainstalowanym w lokalizacji C:\Oprogramowanie\Apache24 oraz PHP 8.2 w katalogu C:\Oprogramowanie\Php8. Wszystkie pliki konfiguracyjne i zasoby stron WWW zrealizowano w dedykowanym katalogu przypisanej podgrupy: D:\Studenci\Cw_01\3ID11B_06\.</w:t>
+      </w:r>
+    </w:p>
+    <w:p>
+      <w:pPr>
+        <w:spacing w:line="276" w:lineRule="auto" w:after="80"/>
+        <w:jc w:val="both"/>
+      </w:pPr>
+      <w:r>
+        <w:rPr>
+          <w:rFonts w:ascii="Arial" w:hAnsi="Arial"/>
+          <w:b/>
+          <w:color w:val="1F2937"/>
+          <w:sz w:val="20"/>
+        </w:rPr>
+        <w:t xml:space="preserve">Weryfikacja składni konfiguracji: </w:t>
+      </w:r>
+      <w:r>
+        <w:rPr>
+          <w:rFonts w:ascii="Arial" w:hAnsi="Arial"/>
+          <w:color w:val="1F2937"/>
+          <w:sz w:val="20"/>
+        </w:rPr>
+        <w:t>Wstępną i bezbłędną poprawność składniową zmodyfikowanego pliku konfiguracyjnego httpd.conf zweryfikowano w wierszu poleceń (CMD) za pomocą polecenia testującego składnię serwera Apache przed jego uruchomieniem:</w:t>
       </w:r>
     </w:p>
     <w:tbl>
       <w:tblPr>
-        <w:tblStyle w:val="TableGrid"/>
         <w:tblW w:type="auto" w:w="0"/>
         <w:jc w:val="center"/>
         <w:tblLook w:firstColumn="1" w:firstRow="1" w:lastColumn="0" w:lastRow="0" w:noHBand="0" w:noVBand="1" w:val="04A0"/>
+        <w:tblBorders>
+          <w:top w:val="single" w:sz="4" w:space="0" w:color="CBD5E1"/>
+          <w:left w:val="single" w:sz="4" w:space="0" w:color="CBD5E1"/>
+          <w:bottom w:val="single" w:sz="4" w:space="0" w:color="CBD5E1"/>
+          <w:right w:val="single" w:sz="4" w:space="0" w:color="CBD5E1"/>
+          <w:insideH w:val="single" w:sz="4" w:space="0" w:color="CBD5E1"/>
+          <w:insideV w:val="single" w:sz="4" w:space="0" w:color="CBD5E1"/>
+        </w:tblBorders>
       </w:tblPr>
       <w:tblGrid>
-        <w:gridCol w:w="8640"/>
+        <w:gridCol w:w="10080"/>
       </w:tblGrid>
       <w:tr>
         <w:tc>
           <w:tcPr>
             <w:tcW w:type="dxa" w:w="9648"/>
+            <w:shd w:val="clear" w:color="auto" w:fill="F8FAFC"/>
             <w:tcMar>
-              <w:top w:w="80" w:type="dxa"/>
-              <w:bottom w:w="80" w:type="dxa"/>
-              <w:left w:w="120" w:type="dxa"/>
-              <w:right w:w="120" w:type="dxa"/>
+              <w:top w:w="70" w:type="dxa"/>
+              <w:bottom w:w="70" w:type="dxa"/>
+              <w:left w:w="100" w:type="dxa"/>
+              <w:right w:w="100" w:type="dxa"/>
             </w:tcMar>
           </w:tcPr>
           <w:p>
             <w:pPr>
-              <w:spacing w:after="0"/>
+              <w:spacing w:after="0" w:line="252" w:lineRule="auto"/>
             </w:pPr>
             <w:r>
               <w:rPr>
                 <w:rFonts w:ascii="Consolas" w:hAnsi="Consolas"/>
-                <w:color w:val="222222"/>
-                <w:sz w:val="18"/>
+                <w:color w:val="111827"/>
+                <w:sz w:val="17"/>
               </w:rPr>
-              <w:t>DocumentRoot "D:/Studenci/Cw_01/3ID11B_01"</w:t>
+              <w:t>"C:\Oprogramowanie\Apache24\bin\httpd.exe" -t -f "D:\Studenci\Cw_01\3ID11B_06\httpd.conf"</w:t>
+            </w:r>
+          </w:p>
+        </w:tc>
+      </w:tr>
+    </w:tbl>
+    <w:p>
+      <w:pPr>
+        <w:spacing w:after="80"/>
+      </w:pPr>
+    </w:p>
+    <w:p>
+      <w:pPr>
+        <w:keepNext/>
+        <w:spacing w:before="120" w:after="40"/>
+        <w:jc w:val="center"/>
+      </w:pPr>
+      <w:r>
+        <w:drawing>
+          <wp:inline xmlns:a="http://schemas.openxmlformats.org/drawingml/2006/main" xmlns:pic="http://schemas.openxmlformats.org/drawingml/2006/picture">
+            <wp:extent cx="5303520" cy="1413314"/>
+            <wp:docPr id="1" name="Picture 1"/>
+            <wp:cNvGraphicFramePr>
+              <a:graphicFrameLocks noChangeAspect="1"/>
+            </wp:cNvGraphicFramePr>
+            <a:graphic>
+              <a:graphicData uri="http://schemas.openxmlformats.org/drawingml/2006/picture">
+                <pic:pic>
+                  <pic:nvPicPr>
+                    <pic:cNvPr id="0" name="Zrzut ekranu 2026-10-22 132418.png"/>
+                    <pic:cNvPicPr/>
+                  </pic:nvPicPr>
+                  <pic:blipFill>
+                    <a:blip r:embed="rId9"/>
+                    <a:stretch>
+                      <a:fillRect/>
+                    </a:stretch>
+                  </pic:blipFill>
+                  <pic:spPr>
+                    <a:xfrm>
+                      <a:off x="0" y="0"/>
+                      <a:ext cx="5303520" cy="1413314"/>
+                    </a:xfrm>
+                    <a:prstGeom prst="rect"/>
+                  </pic:spPr>
+                </pic:pic>
+              </a:graphicData>
+            </a:graphic>
+          </wp:inline>
+        </w:drawing>
+      </w:r>
+    </w:p>
+    <w:p>
+      <w:pPr>
+        <w:keepNext w:val="0"/>
+        <w:spacing w:before="40" w:after="200"/>
+        <w:jc w:val="center"/>
+      </w:pPr>
+      <w:r>
+        <w:rPr>
+          <w:rFonts w:ascii="Arial" w:hAnsi="Arial"/>
+          <w:i/>
+          <w:color w:val="4B5563"/>
+          <w:sz w:val="18"/>
+        </w:rPr>
+        <w:t>Rysunek 1: Weryfikacja poprawności składni pliku konfiguracyjnego Apache (polecenie httpd.exe -t zakończone wynikiem "Syntax OK").</w:t>
+      </w:r>
+    </w:p>
+    <w:p>
+      <w:pPr>
+        <w:pStyle w:val="Heading1"/>
+        <w:keepNext/>
+        <w:spacing w:before="280" w:after="80"/>
+      </w:pPr>
+      <w:r>
+        <w:rPr>
+          <w:rFonts w:ascii="Arial" w:hAnsi="Arial"/>
+          <w:b/>
+          <w:color w:val="1A478A"/>
+          <w:sz w:val="26"/>
+        </w:rPr>
+        <w:t>2. Podstawowy katalog dokumentów serwera (DocumentRoot) i struktura podkatalogów</w:t>
+      </w:r>
+    </w:p>
+    <w:p>
+      <w:pPr>
+        <w:spacing w:line="276" w:lineRule="auto" w:after="80"/>
+        <w:jc w:val="both"/>
+      </w:pPr>
+      <w:r>
+        <w:rPr>
+          <w:rFonts w:ascii="Arial" w:hAnsi="Arial"/>
+          <w:color w:val="1F2937"/>
+          <w:sz w:val="20"/>
+        </w:rPr>
+        <w:t>Zgodnie z Zadaniem 1 i 2 instrukcji laboratoryjnej skonfigurowano nadrzędny katalog główny serwera za pomocą dyrektywy DocumentRoot wskazującej na ścieżkę D:/Studenci/Cw_01/3ID11B_06. W kontenerze nadrzędnym &lt;Directory&gt; nadano uprawnienia za pomocą dyrektyw Options Indexes FollowSymLinks, AllowOverride None oraz Require all granted, co umożliwiło serwerowi bezkolizyjną obsługę wszystkich podkatalogów roboczych podgrupy.</w:t>
+      </w:r>
+    </w:p>
+    <w:tbl>
+      <w:tblPr>
+        <w:tblW w:type="auto" w:w="0"/>
+        <w:jc w:val="center"/>
+        <w:tblLook w:firstColumn="1" w:firstRow="1" w:lastColumn="0" w:lastRow="0" w:noHBand="0" w:noVBand="1" w:val="04A0"/>
+        <w:tblBorders>
+          <w:top w:val="single" w:sz="4" w:space="0" w:color="CBD5E1"/>
+          <w:left w:val="single" w:sz="4" w:space="0" w:color="CBD5E1"/>
+          <w:bottom w:val="single" w:sz="4" w:space="0" w:color="CBD5E1"/>
+          <w:right w:val="single" w:sz="4" w:space="0" w:color="CBD5E1"/>
+          <w:insideH w:val="single" w:sz="4" w:space="0" w:color="CBD5E1"/>
+          <w:insideV w:val="single" w:sz="4" w:space="0" w:color="CBD5E1"/>
+        </w:tblBorders>
+      </w:tblPr>
+      <w:tblGrid>
+        <w:gridCol w:w="10080"/>
+      </w:tblGrid>
+      <w:tr>
+        <w:tc>
+          <w:tcPr>
+            <w:tcW w:type="dxa" w:w="9648"/>
+            <w:shd w:val="clear" w:color="auto" w:fill="F8FAFC"/>
+            <w:tcMar>
+              <w:top w:w="70" w:type="dxa"/>
+              <w:bottom w:w="70" w:type="dxa"/>
+              <w:left w:w="100" w:type="dxa"/>
+              <w:right w:w="100" w:type="dxa"/>
+            </w:tcMar>
+          </w:tcPr>
+          <w:p>
+            <w:pPr>
+              <w:spacing w:after="0" w:line="252" w:lineRule="auto"/>
+            </w:pPr>
+            <w:r>
+              <w:rPr>
+                <w:rFonts w:ascii="Consolas" w:hAnsi="Consolas"/>
+                <w:color w:val="111827"/>
+                <w:sz w:val="17"/>
+              </w:rPr>
+              <w:t>DocumentRoot "D:/Studenci/Cw_01/3ID11B_06"</w:t>
               <w:br/>
-              <w:t>&lt;Directory "D:/Studenci/Cw_01/3ID11B_01"&gt;</w:t>
+              <w:t>&lt;Directory "D:/Studenci/Cw_01/3ID11B_06"&gt;</w:t>
               <w:br/>
               <w:t xml:space="preserve">    Options Indexes FollowSymLinks</w:t>
               <w:br/>
@@ -356,22 +589,42 @@
     </w:p>
     <w:p>
       <w:pPr>
-        <w:spacing w:before="80" w:after="200"/>
-        <w:jc w:val="center"/>
+        <w:spacing w:line="276" w:lineRule="auto" w:after="80"/>
+        <w:jc w:val="both"/>
       </w:pPr>
       <w:r>
         <w:rPr>
           <w:rFonts w:ascii="Arial" w:hAnsi="Arial"/>
-          <w:i/>
-          <w:color w:val="888888"/>
-          <w:sz w:val="19"/>
+          <w:color w:val="1F2937"/>
+          <w:sz w:val="20"/>
         </w:rPr>
-        <w:t>--- [MIEJSCE NA ZRZUT EKRANOWY DLA: 1-2. Konfiguracja DocumentRoot] ---</w:t>
+        <w:t>Wewnątrz katalogu D:\Studenci\Cw_01\3ID11B_06 przygotowano pełną, fizyczną strukturę podkatalogów i plików dla poszczególnych zadań ćwiczenia:</w:t>
+        <w:br/>
+        <w:t>• meble/ – katalog domeny www.meble.pl na porcie 80 z plikiem start.html oraz stronami błędów 404 i 403,</w:t>
+        <w:br/>
+        <w:t>• meble80/ – katalog z automatycznym indeksowaniem na porcie 8080 (zawiera dokument.pdf, foto.jpg, naglowek.html, stopka.html, test.txt),</w:t>
+        <w:br/>
+        <w:t>• meble443/ – katalog bezpiecznego połączenia szyfrowanego SSL na porcie 443 z plikiem start.html,</w:t>
+        <w:br/>
+        <w:t>• auta/ – katalog domeny www.auta.pl na porcie 80 objęty autoryzacją HTTP Basic (plik start.html),</w:t>
+        <w:br/>
+        <w:t>• auta80/ – katalog domeny auta na porcie 8080 również zabezpieczony autoryzacją,</w:t>
+        <w:br/>
+        <w:t>• error/ – globalny katalog szablonów błędów HTTP (404.html, 403.html, 500.html),</w:t>
+        <w:br/>
+        <w:t>• historia/ – katalog przechowujący plik dziennika p.log z zarejestrowanymi żądaniami,</w:t>
+        <w:br/>
+        <w:t>• ssl/ – certyfikat samopodpisany meble.crt oraz klucz prywatny meble.key wygenerowane narzędziem OpenSSL,</w:t>
+        <w:br/>
+        <w:t>• hasla.has – plik haseł modułu autoryzacji z haszem konta studenta st:st,</w:t>
+        <w:br/>
+        <w:t>• st.html oraz index.php – domyślne pliki startowe w katalogu głównym.</w:t>
       </w:r>
     </w:p>
     <w:p>
       <w:pPr>
-        <w:pStyle w:val="Heading2"/>
+        <w:pStyle w:val="Heading1"/>
+        <w:keepNext/>
         <w:spacing w:before="280" w:after="80"/>
       </w:pPr>
       <w:r>
@@ -381,65 +634,68 @@
           <w:color w:val="1A478A"/>
           <w:sz w:val="26"/>
         </w:rPr>
-        <w:t>3-4. Nasłuch portów i domyślne pliki startowe</w:t>
+        <w:t>3. Nasłuch portów i domyślne pliki startowe (DirectoryIndex)</w:t>
       </w:r>
     </w:p>
     <w:p>
       <w:pPr>
         <w:spacing w:line="276" w:lineRule="auto" w:after="80"/>
+        <w:jc w:val="both"/>
       </w:pPr>
       <w:r>
         <w:rPr>
           <w:rFonts w:ascii="Arial" w:hAnsi="Arial"/>
-          <w:sz w:val="21"/>
+          <w:color w:val="1F2937"/>
+          <w:sz w:val="20"/>
         </w:rPr>
-        <w:t>Dodano nasłuchiwanie na porcie alternatywnym za pomocą dyrektywy Listen 8080. W instrukcji uwzględniono weryfikację ewentualnych istniejących dyrektyw Listen 8080 i Listen 443 w bazowym pliku httpd.conf.</w:t>
-      </w:r>
-    </w:p>
-    <w:p>
-      <w:pPr>
-        <w:spacing w:line="276" w:lineRule="auto" w:after="80"/>
-      </w:pPr>
-      <w:r>
-        <w:rPr>
-          <w:rFonts w:ascii="Arial" w:hAnsi="Arial"/>
-          <w:sz w:val="21"/>
-        </w:rPr>
-        <w:t>Zdefiniowano domyślne pliki startowe serwera: DirectoryIndex st.html index.php index.html.</w:t>
+        <w:t>W Zadaniu 3 rozszerzono domyślny nasłuch serwera (port 80) o alternatywny port 8080 za pomocą dyrektywy Listen 8080. W Zadaniu 4 zdefiniowano globalną hierarchię przeszukiwania plików startowych przy odwołaniu do katalogu bez podania konkretnego zasobu: DirectoryIndex st.html index.php index.html. W pierwszej kolejności serwer poszukuje pliku st.html, a w razie jego braku index.php oraz index.html.</w:t>
       </w:r>
     </w:p>
     <w:tbl>
       <w:tblPr>
-        <w:tblStyle w:val="TableGrid"/>
         <w:tblW w:type="auto" w:w="0"/>
         <w:jc w:val="center"/>
         <w:tblLook w:firstColumn="1" w:firstRow="1" w:lastColumn="0" w:lastRow="0" w:noHBand="0" w:noVBand="1" w:val="04A0"/>
+        <w:tblBorders>
+          <w:top w:val="single" w:sz="4" w:space="0" w:color="CBD5E1"/>
+          <w:left w:val="single" w:sz="4" w:space="0" w:color="CBD5E1"/>
+          <w:bottom w:val="single" w:sz="4" w:space="0" w:color="CBD5E1"/>
+          <w:right w:val="single" w:sz="4" w:space="0" w:color="CBD5E1"/>
+          <w:insideH w:val="single" w:sz="4" w:space="0" w:color="CBD5E1"/>
+          <w:insideV w:val="single" w:sz="4" w:space="0" w:color="CBD5E1"/>
+        </w:tblBorders>
       </w:tblPr>
       <w:tblGrid>
-        <w:gridCol w:w="8640"/>
+        <w:gridCol w:w="10080"/>
       </w:tblGrid>
       <w:tr>
         <w:tc>
           <w:tcPr>
             <w:tcW w:type="dxa" w:w="9648"/>
+            <w:shd w:val="clear" w:color="auto" w:fill="F8FAFC"/>
             <w:tcMar>
-              <w:top w:w="80" w:type="dxa"/>
-              <w:bottom w:w="80" w:type="dxa"/>
-              <w:left w:w="120" w:type="dxa"/>
-              <w:right w:w="120" w:type="dxa"/>
+              <w:top w:w="70" w:type="dxa"/>
+              <w:bottom w:w="70" w:type="dxa"/>
+              <w:left w:w="100" w:type="dxa"/>
+              <w:right w:w="100" w:type="dxa"/>
             </w:tcMar>
           </w:tcPr>
           <w:p>
             <w:pPr>
-              <w:spacing w:after="0"/>
+              <w:spacing w:after="0" w:line="252" w:lineRule="auto"/>
             </w:pPr>
             <w:r>
               <w:rPr>
                 <w:rFonts w:ascii="Consolas" w:hAnsi="Consolas"/>
-                <w:color w:val="222222"/>
-                <w:sz w:val="18"/>
+                <w:color w:val="111827"/>
+                <w:sz w:val="17"/>
               </w:rPr>
+              <w:t># ZADANIE 3: Nasluch serwera na portach 80 i 8080</w:t>
+              <w:br/>
               <w:t>Listen 8080</w:t>
+              <w:br/>
+              <w:br/>
+              <w:t># ZADANIE 4: Domyslne pliki startowe</w:t>
               <w:br/>
               <w:t>DirectoryIndex st.html index.php index.html</w:t>
             </w:r>
@@ -454,22 +710,79 @@
     </w:p>
     <w:p>
       <w:pPr>
-        <w:spacing w:before="80" w:after="200"/>
+        <w:spacing w:line="276" w:lineRule="auto" w:after="80"/>
+        <w:jc w:val="both"/>
+      </w:pPr>
+      <w:r>
+        <w:rPr>
+          <w:rFonts w:ascii="Arial" w:hAnsi="Arial"/>
+          <w:color w:val="1F2937"/>
+          <w:sz w:val="20"/>
+        </w:rPr>
+        <w:t>Prawidłowe działanie domyślnego pliku startowego oraz nasłuchu na porcie 80 przedstawiono na Rysunku 2. Wywołanie adresu http://www.meble.pl:80 spowodowało natychmiastowe załadowanie przygotowanej strony st.html z danymi autorów ćwiczenia (Artem Hizhovskyi, Ihor Namachynskyi) oraz identyfikatorem podgrupy 3ID11B_06.</w:t>
+      </w:r>
+    </w:p>
+    <w:p>
+      <w:pPr>
+        <w:keepNext/>
+        <w:spacing w:before="120" w:after="40"/>
+        <w:jc w:val="center"/>
+      </w:pPr>
+      <w:r>
+        <w:drawing>
+          <wp:inline xmlns:a="http://schemas.openxmlformats.org/drawingml/2006/main" xmlns:pic="http://schemas.openxmlformats.org/drawingml/2006/picture">
+            <wp:extent cx="5303520" cy="1650352"/>
+            <wp:docPr id="2" name="Picture 2"/>
+            <wp:cNvGraphicFramePr>
+              <a:graphicFrameLocks noChangeAspect="1"/>
+            </wp:cNvGraphicFramePr>
+            <a:graphic>
+              <a:graphicData uri="http://schemas.openxmlformats.org/drawingml/2006/picture">
+                <pic:pic>
+                  <pic:nvPicPr>
+                    <pic:cNvPr id="0" name="Zrzut ekranu 2026-10-22 130929.png"/>
+                    <pic:cNvPicPr/>
+                  </pic:nvPicPr>
+                  <pic:blipFill>
+                    <a:blip r:embed="rId10"/>
+                    <a:stretch>
+                      <a:fillRect/>
+                    </a:stretch>
+                  </pic:blipFill>
+                  <pic:spPr>
+                    <a:xfrm>
+                      <a:off x="0" y="0"/>
+                      <a:ext cx="5303520" cy="1650352"/>
+                    </a:xfrm>
+                    <a:prstGeom prst="rect"/>
+                  </pic:spPr>
+                </pic:pic>
+              </a:graphicData>
+            </a:graphic>
+          </wp:inline>
+        </w:drawing>
+      </w:r>
+    </w:p>
+    <w:p>
+      <w:pPr>
+        <w:keepNext w:val="0"/>
+        <w:spacing w:before="40" w:after="200"/>
         <w:jc w:val="center"/>
       </w:pPr>
       <w:r>
         <w:rPr>
           <w:rFonts w:ascii="Arial" w:hAnsi="Arial"/>
           <w:i/>
-          <w:color w:val="888888"/>
-          <w:sz w:val="19"/>
+          <w:color w:val="4B5563"/>
+          <w:sz w:val="18"/>
         </w:rPr>
-        <w:t>--- [MIEJSCE NA ZRZUT EKRANOWY DLA: 3-4. Nasłuch portów i pliki startowe] ---</w:t>
+        <w:t>Rysunek 2: Strona startowa domeny www.meble.pl na porcie 80 (automatycznie załadowany plik startowy st.html).</w:t>
       </w:r>
     </w:p>
     <w:p>
       <w:pPr>
-        <w:pStyle w:val="Heading2"/>
+        <w:pStyle w:val="Heading1"/>
+        <w:keepNext/>
         <w:spacing w:before="280" w:after="80"/>
       </w:pPr>
       <w:r>
@@ -479,117 +792,466 @@
           <w:color w:val="1A478A"/>
           <w:sz w:val="26"/>
         </w:rPr>
-        <w:t>5-8. Wirtualne hosty (meble.pl, meble80, auta.pl, auta80)</w:t>
+        <w:t>4. Wirtualne hosty (Virtual Hosts) i mapowanie portów oraz domen</w:t>
       </w:r>
     </w:p>
     <w:p>
       <w:pPr>
         <w:spacing w:line="276" w:lineRule="auto" w:after="80"/>
+        <w:jc w:val="both"/>
       </w:pPr>
       <w:r>
         <w:rPr>
           <w:rFonts w:ascii="Arial" w:hAnsi="Arial"/>
-          <w:sz w:val="21"/>
+          <w:color w:val="1F2937"/>
+          <w:sz w:val="20"/>
         </w:rPr>
-        <w:t>Zdefiniowano wirtualne hosty oparte o adresy IP i porty zgodnie z wytycznymi:</w:t>
+        <w:t>W zadaniach 5 i 6 skonfigurowano wirtualne hosty oparte na adresach IP i nazwach domenowych. Do maszyny wirtualnej przypisano dwa adresy sieciowe: 10.0.2.2 dla domeny meble.pl oraz 10.0.3.3 dla domeny auta.pl. Dodatkowo zdefiniowano hosta na adresie pętli zwrotnej 127.0.0.1 dla domeny www.phpmyad.pl. Łącznie zdefiniowano 6 bloków VirtualHost w pliku konfiguracyjnym:</w:t>
+        <w:br/>
+        <w:t>1. &lt;VirtualHost 10.0.2.2:80&gt; – domena www.meble.pl (DocumentRoot: meble),</w:t>
+        <w:br/>
+        <w:t>2. &lt;VirtualHost 10.0.3.3:80&gt; – domena www.auta.pl (DocumentRoot: auta, autoryzacja HTTP Basic),</w:t>
+        <w:br/>
+        <w:t>3. &lt;VirtualHost 10.0.2.2:8080&gt; – domena www.meble.pl (DocumentRoot: meble80, automatyczne indeksowanie),</w:t>
+        <w:br/>
+        <w:t>4. &lt;VirtualHost 10.0.3.3:8080&gt; – domena www.auta.pl (DocumentRoot: auta80, autoryzacja HTTP Basic),</w:t>
+        <w:br/>
+        <w:t>5. &lt;VirtualHost 10.0.2.2:443&gt; – domena www.meble.pl (DocumentRoot: meble443, szyfrowanie SSL),</w:t>
+        <w:br/>
+        <w:t>6. &lt;VirtualHost 127.0.0.1:80&gt; – domena www.phpmyad.pl (katalog phpMyAdmin, dostęp wyłącznie z 127.0.0.1).</w:t>
       </w:r>
     </w:p>
     <w:p>
       <w:pPr>
         <w:spacing w:line="276" w:lineRule="auto" w:after="80"/>
+        <w:jc w:val="both"/>
       </w:pPr>
       <w:r>
         <w:rPr>
           <w:rFonts w:ascii="Arial" w:hAnsi="Arial"/>
-          <w:sz w:val="21"/>
+          <w:b/>
+          <w:color w:val="1F2937"/>
+          <w:sz w:val="20"/>
         </w:rPr>
-        <w:t>1. www.meble.pl na porcie 80 (&lt;VirtualHost 10.0.2.2:80&gt;) z katalogiem DocumentRoot meble, plikiem startowym start.html oraz obsługą modułu server-status w lokacji /status.</w:t>
+        <w:t xml:space="preserve">Diagnostyka wirtualnych hostów: </w:t>
+      </w:r>
+      <w:r>
+        <w:rPr>
+          <w:rFonts w:ascii="Arial" w:hAnsi="Arial"/>
+          <w:color w:val="1F2937"/>
+          <w:sz w:val="20"/>
+        </w:rPr>
+        <w:t>Prawidłowość zarejestrowania wszystkich wirtualnych hostów przez serwer Apache potwierdzono za pomocą polecenia diagnostycznego httpd.exe -S. Wynik polecenia jednoznacznie wskazuje powiązanie każdego adresu IP i portu z konkretnym wirtualnym hostem oraz numerem linii w pliku D:/Studenci/Cw_01/3ID11B_06/httpd.conf:</w:t>
+      </w:r>
+    </w:p>
+    <w:tbl>
+      <w:tblPr>
+        <w:tblW w:type="auto" w:w="0"/>
+        <w:jc w:val="center"/>
+        <w:tblLook w:firstColumn="1" w:firstRow="1" w:lastColumn="0" w:lastRow="0" w:noHBand="0" w:noVBand="1" w:val="04A0"/>
+        <w:tblBorders>
+          <w:top w:val="single" w:sz="4" w:space="0" w:color="CBD5E1"/>
+          <w:left w:val="single" w:sz="4" w:space="0" w:color="CBD5E1"/>
+          <w:bottom w:val="single" w:sz="4" w:space="0" w:color="CBD5E1"/>
+          <w:right w:val="single" w:sz="4" w:space="0" w:color="CBD5E1"/>
+          <w:insideH w:val="single" w:sz="4" w:space="0" w:color="CBD5E1"/>
+          <w:insideV w:val="single" w:sz="4" w:space="0" w:color="CBD5E1"/>
+        </w:tblBorders>
+      </w:tblPr>
+      <w:tblGrid>
+        <w:gridCol w:w="10080"/>
+      </w:tblGrid>
+      <w:tr>
+        <w:tc>
+          <w:tcPr>
+            <w:tcW w:type="dxa" w:w="9648"/>
+            <w:shd w:val="clear" w:color="auto" w:fill="F8FAFC"/>
+            <w:tcMar>
+              <w:top w:w="70" w:type="dxa"/>
+              <w:bottom w:w="70" w:type="dxa"/>
+              <w:left w:w="100" w:type="dxa"/>
+              <w:right w:w="100" w:type="dxa"/>
+            </w:tcMar>
+          </w:tcPr>
+          <w:p>
+            <w:pPr>
+              <w:spacing w:after="0" w:line="252" w:lineRule="auto"/>
+            </w:pPr>
+            <w:r>
+              <w:rPr>
+                <w:rFonts w:ascii="Consolas" w:hAnsi="Consolas"/>
+                <w:color w:val="111827"/>
+                <w:sz w:val="17"/>
+              </w:rPr>
+              <w:t>"C:\Oprogramowanie\Apache24\bin\httpd.exe" -S -f "D:\Studenci\Cw_01\3ID11B_06\httpd.conf"</w:t>
+            </w:r>
+          </w:p>
+        </w:tc>
+      </w:tr>
+    </w:tbl>
+    <w:p>
+      <w:pPr>
+        <w:spacing w:after="80"/>
+      </w:pPr>
+    </w:p>
+    <w:p>
+      <w:pPr>
+        <w:keepNext/>
+        <w:spacing w:before="120" w:after="40"/>
+        <w:jc w:val="center"/>
+      </w:pPr>
+      <w:r>
+        <w:drawing>
+          <wp:inline xmlns:a="http://schemas.openxmlformats.org/drawingml/2006/main" xmlns:pic="http://schemas.openxmlformats.org/drawingml/2006/picture">
+            <wp:extent cx="5303520" cy="2310541"/>
+            <wp:docPr id="3" name="Picture 3"/>
+            <wp:cNvGraphicFramePr>
+              <a:graphicFrameLocks noChangeAspect="1"/>
+            </wp:cNvGraphicFramePr>
+            <a:graphic>
+              <a:graphicData uri="http://schemas.openxmlformats.org/drawingml/2006/picture">
+                <pic:pic>
+                  <pic:nvPicPr>
+                    <pic:cNvPr id="0" name="Zrzut ekranu 2026-10-22 132550.png"/>
+                    <pic:cNvPicPr/>
+                  </pic:nvPicPr>
+                  <pic:blipFill>
+                    <a:blip r:embed="rId11"/>
+                    <a:stretch>
+                      <a:fillRect/>
+                    </a:stretch>
+                  </pic:blipFill>
+                  <pic:spPr>
+                    <a:xfrm>
+                      <a:off x="0" y="0"/>
+                      <a:ext cx="5303520" cy="2310541"/>
+                    </a:xfrm>
+                    <a:prstGeom prst="rect"/>
+                  </pic:spPr>
+                </pic:pic>
+              </a:graphicData>
+            </a:graphic>
+          </wp:inline>
+        </w:drawing>
+      </w:r>
+    </w:p>
+    <w:p>
+      <w:pPr>
+        <w:keepNext w:val="0"/>
+        <w:spacing w:before="40" w:after="200"/>
+        <w:jc w:val="center"/>
+      </w:pPr>
+      <w:r>
+        <w:rPr>
+          <w:rFonts w:ascii="Arial" w:hAnsi="Arial"/>
+          <w:i/>
+          <w:color w:val="4B5563"/>
+          <w:sz w:val="18"/>
+        </w:rPr>
+        <w:t>Rysunek 3: Zrzut zarejestrowanych wirtualnych hostów poleceniem httpd -S (widoczne powiązania IP:port z plikiem httpd.conf).</w:t>
       </w:r>
     </w:p>
     <w:p>
       <w:pPr>
         <w:spacing w:line="276" w:lineRule="auto" w:after="80"/>
+        <w:jc w:val="both"/>
       </w:pPr>
       <w:r>
         <w:rPr>
           <w:rFonts w:ascii="Arial" w:hAnsi="Arial"/>
-          <w:sz w:val="21"/>
+          <w:color w:val="1F2937"/>
+          <w:sz w:val="20"/>
         </w:rPr>
-        <w:t>2. www.meble.pl na porcie 8080 (&lt;VirtualHost 10.0.2.2:8080&gt;) z katalogiem meble80. Skonfigurowano automatyczne indeksowanie (Options +Indexes) z opcją FancyIndexing, nagłówkiem HeaderName naglowek.html (zawierającym dane zespołu) oraz stopką ReadmeName stopka.html. Z katalogu usunięto statyczny plik start.html, dzięki czemu serwer dynamicznie generuje listę plików z plikiem graficznym foto.jpg.</w:t>
+        <w:t>Na Rysunku 4 zaprezentowano działanie wirtualnego hosta www.auta.pl na alternatywnym porcie 8080 pod adresem http://auta.pl:8080, wskazującego na katalog D:/Studenci/Cw_01/3ID11B_06/auta80.</w:t>
+      </w:r>
+    </w:p>
+    <w:p>
+      <w:pPr>
+        <w:keepNext/>
+        <w:spacing w:before="120" w:after="40"/>
+        <w:jc w:val="center"/>
+      </w:pPr>
+      <w:r>
+        <w:drawing>
+          <wp:inline xmlns:a="http://schemas.openxmlformats.org/drawingml/2006/main" xmlns:pic="http://schemas.openxmlformats.org/drawingml/2006/picture">
+            <wp:extent cx="5303520" cy="1530101"/>
+            <wp:docPr id="4" name="Picture 4"/>
+            <wp:cNvGraphicFramePr>
+              <a:graphicFrameLocks noChangeAspect="1"/>
+            </wp:cNvGraphicFramePr>
+            <a:graphic>
+              <a:graphicData uri="http://schemas.openxmlformats.org/drawingml/2006/picture">
+                <pic:pic>
+                  <pic:nvPicPr>
+                    <pic:cNvPr id="0" name="Zrzut ekranu 2026-10-22 131124.png"/>
+                    <pic:cNvPicPr/>
+                  </pic:nvPicPr>
+                  <pic:blipFill>
+                    <a:blip r:embed="rId12"/>
+                    <a:stretch>
+                      <a:fillRect/>
+                    </a:stretch>
+                  </pic:blipFill>
+                  <pic:spPr>
+                    <a:xfrm>
+                      <a:off x="0" y="0"/>
+                      <a:ext cx="5303520" cy="1530101"/>
+                    </a:xfrm>
+                    <a:prstGeom prst="rect"/>
+                  </pic:spPr>
+                </pic:pic>
+              </a:graphicData>
+            </a:graphic>
+          </wp:inline>
+        </w:drawing>
+      </w:r>
+    </w:p>
+    <w:p>
+      <w:pPr>
+        <w:keepNext w:val="0"/>
+        <w:spacing w:before="40" w:after="200"/>
+        <w:jc w:val="center"/>
+      </w:pPr>
+      <w:r>
+        <w:rPr>
+          <w:rFonts w:ascii="Arial" w:hAnsi="Arial"/>
+          <w:i/>
+          <w:color w:val="4B5563"/>
+          <w:sz w:val="18"/>
+        </w:rPr>
+        <w:t>Rysunek 4: Działanie wirtualnego hosta www.auta.pl na alternatywnym porcie 8080 (katalog auta80).</w:t>
       </w:r>
     </w:p>
     <w:p>
       <w:pPr>
         <w:spacing w:line="276" w:lineRule="auto" w:after="80"/>
+        <w:jc w:val="both"/>
       </w:pPr>
       <w:r>
         <w:rPr>
           <w:rFonts w:ascii="Arial" w:hAnsi="Arial"/>
-          <w:sz w:val="21"/>
+          <w:color w:val="1F2937"/>
+          <w:sz w:val="20"/>
         </w:rPr>
-        <w:t>3. www.auta.pl na porcie 80 (&lt;VirtualHost 10.0.3.3:80&gt;) oraz na porcie 8080 (&lt;VirtualHost 10.0.3.3:8080&gt;). Obie lokacje zabezpieczono autoryzacją HTTP Basic Auth.</w:t>
+        <w:t>Dla domeny www.phpmyad.pl (Zadanie 5.e i 12.c) zdefiniowano powiązanie z rzeczywistym katalogiem aplikacji phpMyAdmin (C:/Oprogramowanie/Apache24/htdocs/phpMyAdmin) oraz nałożono rygorystyczne ograniczenie dostępu Require ip 127.0.0.1. Zapewnia to, że dostęp do bazy danych z zewnątrz sieci uczelnianej jest zablokowany, a administrator może zalogować się wyłącznie z poziomu konsoli lokalnej (Rysunek 5).</w:t>
+      </w:r>
+    </w:p>
+    <w:tbl>
+      <w:tblPr>
+        <w:tblW w:type="auto" w:w="0"/>
+        <w:jc w:val="center"/>
+        <w:tblLook w:firstColumn="1" w:firstRow="1" w:lastColumn="0" w:lastRow="0" w:noHBand="0" w:noVBand="1" w:val="04A0"/>
+        <w:tblBorders>
+          <w:top w:val="single" w:sz="4" w:space="0" w:color="CBD5E1"/>
+          <w:left w:val="single" w:sz="4" w:space="0" w:color="CBD5E1"/>
+          <w:bottom w:val="single" w:sz="4" w:space="0" w:color="CBD5E1"/>
+          <w:right w:val="single" w:sz="4" w:space="0" w:color="CBD5E1"/>
+          <w:insideH w:val="single" w:sz="4" w:space="0" w:color="CBD5E1"/>
+          <w:insideV w:val="single" w:sz="4" w:space="0" w:color="CBD5E1"/>
+        </w:tblBorders>
+      </w:tblPr>
+      <w:tblGrid>
+        <w:gridCol w:w="10080"/>
+      </w:tblGrid>
+      <w:tr>
+        <w:tc>
+          <w:tcPr>
+            <w:tcW w:type="dxa" w:w="9648"/>
+            <w:shd w:val="clear" w:color="auto" w:fill="F8FAFC"/>
+            <w:tcMar>
+              <w:top w:w="70" w:type="dxa"/>
+              <w:bottom w:w="70" w:type="dxa"/>
+              <w:left w:w="100" w:type="dxa"/>
+              <w:right w:w="100" w:type="dxa"/>
+            </w:tcMar>
+          </w:tcPr>
+          <w:p>
+            <w:pPr>
+              <w:spacing w:after="0" w:line="252" w:lineRule="auto"/>
+            </w:pPr>
+            <w:r>
+              <w:rPr>
+                <w:rFonts w:ascii="Consolas" w:hAnsi="Consolas"/>
+                <w:color w:val="111827"/>
+                <w:sz w:val="17"/>
+              </w:rPr>
+              <w:t>&lt;VirtualHost 127.0.0.1:80&gt;</w:t>
+              <w:br/>
+              <w:t xml:space="preserve">    ServerName www.phpmyad.pl</w:t>
+              <w:br/>
+              <w:t xml:space="preserve">    ServerAlias phpmyad.pl</w:t>
+              <w:br/>
+              <w:t xml:space="preserve">    DocumentRoot "C:/Oprogramowanie/Apache24/htdocs/phpMyAdmin"</w:t>
+              <w:br/>
+              <w:t>&lt;/VirtualHost&gt;</w:t>
+              <w:br/>
+              <w:t>&lt;Directory "C:/Oprogramowanie/Apache24/htdocs/phpMyAdmin"&gt;</w:t>
+              <w:br/>
+              <w:t xml:space="preserve">    Options Indexes FollowSymLinks</w:t>
+              <w:br/>
+              <w:t xml:space="preserve">    AllowOverride None</w:t>
+              <w:br/>
+              <w:t xml:space="preserve">    Require ip 127.0.0.1</w:t>
+              <w:br/>
+              <w:t>&lt;/Directory&gt;</w:t>
+            </w:r>
+          </w:p>
+        </w:tc>
+      </w:tr>
+    </w:tbl>
+    <w:p>
+      <w:pPr>
+        <w:spacing w:after="80"/>
+      </w:pPr>
+    </w:p>
+    <w:p>
+      <w:pPr>
+        <w:keepNext/>
+        <w:spacing w:before="120" w:after="40"/>
+        <w:jc w:val="center"/>
+      </w:pPr>
+      <w:r>
+        <w:drawing>
+          <wp:inline xmlns:a="http://schemas.openxmlformats.org/drawingml/2006/main" xmlns:pic="http://schemas.openxmlformats.org/drawingml/2006/picture">
+            <wp:extent cx="5303520" cy="3362904"/>
+            <wp:docPr id="5" name="Picture 5"/>
+            <wp:cNvGraphicFramePr>
+              <a:graphicFrameLocks noChangeAspect="1"/>
+            </wp:cNvGraphicFramePr>
+            <a:graphic>
+              <a:graphicData uri="http://schemas.openxmlformats.org/drawingml/2006/picture">
+                <pic:pic>
+                  <pic:nvPicPr>
+                    <pic:cNvPr id="0" name="Zrzut ekranu 2026-10-22 131753.png"/>
+                    <pic:cNvPicPr/>
+                  </pic:nvPicPr>
+                  <pic:blipFill>
+                    <a:blip r:embed="rId13"/>
+                    <a:stretch>
+                      <a:fillRect/>
+                    </a:stretch>
+                  </pic:blipFill>
+                  <pic:spPr>
+                    <a:xfrm>
+                      <a:off x="0" y="0"/>
+                      <a:ext cx="5303520" cy="3362904"/>
+                    </a:xfrm>
+                    <a:prstGeom prst="rect"/>
+                  </pic:spPr>
+                </pic:pic>
+              </a:graphicData>
+            </a:graphic>
+          </wp:inline>
+        </w:drawing>
+      </w:r>
+    </w:p>
+    <w:p>
+      <w:pPr>
+        <w:keepNext w:val="0"/>
+        <w:spacing w:before="40" w:after="200"/>
+        <w:jc w:val="center"/>
+      </w:pPr>
+      <w:r>
+        <w:rPr>
+          <w:rFonts w:ascii="Arial" w:hAnsi="Arial"/>
+          <w:i/>
+          <w:color w:val="4B5563"/>
+          <w:sz w:val="18"/>
+        </w:rPr>
+        <w:t>Rysunek 5: Dostęp do panelu phpMyAdmin pod domeną www.phpmyad.pl (dostęp z adresu pętli zwrotnej 127.0.0.1).</w:t>
+      </w:r>
+    </w:p>
+    <w:p>
+      <w:pPr>
+        <w:pStyle w:val="Heading1"/>
+        <w:keepNext/>
+        <w:spacing w:before="280" w:after="80"/>
+      </w:pPr>
+      <w:r>
+        <w:rPr>
+          <w:rFonts w:ascii="Arial" w:hAnsi="Arial"/>
+          <w:b/>
+          <w:color w:val="1A478A"/>
+          <w:sz w:val="26"/>
+        </w:rPr>
+        <w:t>5. Automatyczne indeksowanie katalogu (FancyIndexing), nagłówek i stopka w meble80</w:t>
       </w:r>
     </w:p>
     <w:p>
       <w:pPr>
         <w:spacing w:line="276" w:lineRule="auto" w:after="80"/>
+        <w:jc w:val="both"/>
       </w:pPr>
       <w:r>
         <w:rPr>
           <w:rFonts w:ascii="Arial" w:hAnsi="Arial"/>
-          <w:sz w:val="21"/>
+          <w:color w:val="1F2937"/>
+          <w:sz w:val="20"/>
         </w:rPr>
-        <w:t>4. www.phpmyad.pl na porcie 80 (&lt;VirtualHost 127.0.0.1:80&gt;) z restrykcją dostępu Require ip 127.0.0.1.</w:t>
+        <w:t>Zgodnie z Zadaniem 7 i 8 dla wirtualnego hosta www.meble.pl na porcie 8080 skonfigurowano mechanizm automatycznego indeksowania zawartości katalogu D:/Studenci/Cw_01/3ID11B_06/meble80. Zastosowano zaawansowane opcje indeksowania modułu mod_autoindex: FancyIndexing (estetyczny widok z ikonami typów MIME), FoldersFirst (wyświetlanie folderów na początku listy) oraz VersionSort (inteligentne sortowanie wersji plików). Dodatkowo zdefiniowano dyrektywy HeaderName naglowek.html oraz ReadmeName stopka.html, dzięki którym wygenerowana lista plików jest automatycznie otoczona spersonalizowanym nagłówkiem z danymi zespołu oraz stopką autorską.</w:t>
       </w:r>
     </w:p>
     <w:tbl>
       <w:tblPr>
-        <w:tblStyle w:val="TableGrid"/>
         <w:tblW w:type="auto" w:w="0"/>
         <w:jc w:val="center"/>
         <w:tblLook w:firstColumn="1" w:firstRow="1" w:lastColumn="0" w:lastRow="0" w:noHBand="0" w:noVBand="1" w:val="04A0"/>
+        <w:tblBorders>
+          <w:top w:val="single" w:sz="4" w:space="0" w:color="CBD5E1"/>
+          <w:left w:val="single" w:sz="4" w:space="0" w:color="CBD5E1"/>
+          <w:bottom w:val="single" w:sz="4" w:space="0" w:color="CBD5E1"/>
+          <w:right w:val="single" w:sz="4" w:space="0" w:color="CBD5E1"/>
+          <w:insideH w:val="single" w:sz="4" w:space="0" w:color="CBD5E1"/>
+          <w:insideV w:val="single" w:sz="4" w:space="0" w:color="CBD5E1"/>
+        </w:tblBorders>
       </w:tblPr>
       <w:tblGrid>
-        <w:gridCol w:w="8640"/>
+        <w:gridCol w:w="10080"/>
       </w:tblGrid>
       <w:tr>
         <w:tc>
           <w:tcPr>
             <w:tcW w:type="dxa" w:w="9648"/>
+            <w:shd w:val="clear" w:color="auto" w:fill="F8FAFC"/>
             <w:tcMar>
-              <w:top w:w="80" w:type="dxa"/>
-              <w:bottom w:w="80" w:type="dxa"/>
-              <w:left w:w="120" w:type="dxa"/>
-              <w:right w:w="120" w:type="dxa"/>
+              <w:top w:w="70" w:type="dxa"/>
+              <w:bottom w:w="70" w:type="dxa"/>
+              <w:left w:w="100" w:type="dxa"/>
+              <w:right w:w="100" w:type="dxa"/>
             </w:tcMar>
           </w:tcPr>
           <w:p>
             <w:pPr>
-              <w:spacing w:after="0"/>
+              <w:spacing w:after="0" w:line="252" w:lineRule="auto"/>
             </w:pPr>
             <w:r>
               <w:rPr>
                 <w:rFonts w:ascii="Consolas" w:hAnsi="Consolas"/>
-                <w:color w:val="222222"/>
-                <w:sz w:val="18"/>
+                <w:color w:val="111827"/>
+                <w:sz w:val="17"/>
               </w:rPr>
               <w:t>&lt;VirtualHost 10.0.2.2:8080&gt;</w:t>
               <w:br/>
               <w:t xml:space="preserve">    ServerName www.meble.pl</w:t>
               <w:br/>
-              <w:t xml:space="preserve">    DocumentRoot "D:/Studenci/Cw_01/3ID11B_01/meble80"</w:t>
+              <w:t xml:space="preserve">    ServerAlias meble.pl</w:t>
+              <w:br/>
+              <w:t xml:space="preserve">    DocumentRoot "D:/Studenci/Cw_01/3ID11B_06/meble80"</w:t>
               <w:br/>
               <w:t>&lt;/VirtualHost&gt;</w:t>
               <w:br/>
-              <w:t>&lt;Directory "D:/Studenci/Cw_01/3ID11B_01/meble80"&gt;</w:t>
+              <w:br/>
+              <w:t>&lt;Directory "D:/Studenci/Cw_01/3ID11B_06/meble80"&gt;</w:t>
               <w:br/>
               <w:t xml:space="preserve">    Options Indexes FollowSymLinks</w:t>
               <w:br/>
-              <w:t xml:space="preserve">    IndexOptions FancyIndexing FoldersFirst VersionSort</w:t>
+              <w:t xml:space="preserve">    IndexOptions FancyIndexing FoldersFirst VersionSort NameWidth=* DescriptionWidth=*</w:t>
               <w:br/>
               <w:t xml:space="preserve">    HeaderName naglowek.html</w:t>
               <w:br/>
               <w:t xml:space="preserve">    ReadmeName stopka.html</w:t>
+              <w:br/>
+              <w:t xml:space="preserve">    AllowOverride None</w:t>
               <w:br/>
               <w:t xml:space="preserve">    Require all granted</w:t>
               <w:br/>
@@ -606,22 +1268,388 @@
     </w:p>
     <w:p>
       <w:pPr>
-        <w:spacing w:before="80" w:after="200"/>
+        <w:spacing w:line="276" w:lineRule="auto" w:after="80"/>
+        <w:jc w:val="both"/>
+      </w:pPr>
+      <w:r>
+        <w:rPr>
+          <w:rFonts w:ascii="Arial" w:hAnsi="Arial"/>
+          <w:color w:val="1F2937"/>
+          <w:sz w:val="20"/>
+        </w:rPr>
+        <w:t>Na Rysunku 6 przedstawiono widok indeksu katalogu http://meble.pl:8080/. Widoczny jest nagłówek z danymi grupy 3ID11B_06, tabela indeksu z plikami oraz stopka zamykająca dokument.</w:t>
+      </w:r>
+    </w:p>
+    <w:p>
+      <w:pPr>
+        <w:keepNext/>
+        <w:spacing w:before="120" w:after="40"/>
+        <w:jc w:val="center"/>
+      </w:pPr>
+      <w:r>
+        <w:drawing>
+          <wp:inline xmlns:a="http://schemas.openxmlformats.org/drawingml/2006/main" xmlns:pic="http://schemas.openxmlformats.org/drawingml/2006/picture">
+            <wp:extent cx="5303520" cy="1868899"/>
+            <wp:docPr id="6" name="Picture 6"/>
+            <wp:cNvGraphicFramePr>
+              <a:graphicFrameLocks noChangeAspect="1"/>
+            </wp:cNvGraphicFramePr>
+            <a:graphic>
+              <a:graphicData uri="http://schemas.openxmlformats.org/drawingml/2006/picture">
+                <pic:pic>
+                  <pic:nvPicPr>
+                    <pic:cNvPr id="0" name="Zrzut ekranu 2026-10-22 130543.png"/>
+                    <pic:cNvPicPr/>
+                  </pic:nvPicPr>
+                  <pic:blipFill>
+                    <a:blip r:embed="rId14"/>
+                    <a:stretch>
+                      <a:fillRect/>
+                    </a:stretch>
+                  </pic:blipFill>
+                  <pic:spPr>
+                    <a:xfrm>
+                      <a:off x="0" y="0"/>
+                      <a:ext cx="5303520" cy="1868899"/>
+                    </a:xfrm>
+                    <a:prstGeom prst="rect"/>
+                  </pic:spPr>
+                </pic:pic>
+              </a:graphicData>
+            </a:graphic>
+          </wp:inline>
+        </w:drawing>
+      </w:r>
+    </w:p>
+    <w:p>
+      <w:pPr>
+        <w:keepNext w:val="0"/>
+        <w:spacing w:before="40" w:after="200"/>
         <w:jc w:val="center"/>
       </w:pPr>
       <w:r>
         <w:rPr>
           <w:rFonts w:ascii="Arial" w:hAnsi="Arial"/>
           <w:i/>
-          <w:color w:val="888888"/>
-          <w:sz w:val="19"/>
+          <w:color w:val="4B5563"/>
+          <w:sz w:val="18"/>
         </w:rPr>
-        <w:t>--- [MIEJSCE NA ZRZUT EKRANOWY DLA: 5-8. Wirtualne hosty i indeksowanie] ---</w:t>
+        <w:t>Rysunek 6: Automatyczne indeksowanie katalogu meble80 (opcje FancyIndexing, nagłówek naglowek.html oraz stopka stopka.html).</w:t>
       </w:r>
     </w:p>
     <w:p>
       <w:pPr>
-        <w:pStyle w:val="Heading2"/>
+        <w:spacing w:line="276" w:lineRule="auto" w:after="80"/>
+        <w:jc w:val="both"/>
+      </w:pPr>
+      <w:r>
+        <w:rPr>
+          <w:rFonts w:ascii="Arial" w:hAnsi="Arial"/>
+          <w:color w:val="1F2937"/>
+          <w:sz w:val="20"/>
+        </w:rPr>
+        <w:t>W ramach ćwiczenia zweryfikowano obsługę poszczególnych zasobów umieszczonych w indeksowanym katalogu meble80, w tym plików binarnych, dokumentów oraz plików tekstowych. Na kolejnych zrzutach przedstawiono:</w:t>
+        <w:br/>
+        <w:t>• Bezpośrednie wyświetlenie pliku graficznego foto.jpg (Rysunek 7),</w:t>
+        <w:br/>
+        <w:t>• Otwarcie i renderowanie pliku dokumentu dokument.pdf w przeglądarce (Rysunek 8),</w:t>
+        <w:br/>
+        <w:t>• Podgląd pliku nagłówkowego naglowek.html (Rysunek 9),</w:t>
+        <w:br/>
+        <w:t>• Podgląd pliku stopki stopka.html (Rysunek 10),</w:t>
+        <w:br/>
+        <w:t>• Wyświetlenie pliku tekstowego test.txt (Rysunek 11).</w:t>
+      </w:r>
+    </w:p>
+    <w:p>
+      <w:pPr>
+        <w:keepNext/>
+        <w:spacing w:before="120" w:after="40"/>
+        <w:jc w:val="center"/>
+      </w:pPr>
+      <w:r>
+        <w:drawing>
+          <wp:inline xmlns:a="http://schemas.openxmlformats.org/drawingml/2006/main" xmlns:pic="http://schemas.openxmlformats.org/drawingml/2006/picture">
+            <wp:extent cx="5303520" cy="3595115"/>
+            <wp:docPr id="7" name="Picture 7"/>
+            <wp:cNvGraphicFramePr>
+              <a:graphicFrameLocks noChangeAspect="1"/>
+            </wp:cNvGraphicFramePr>
+            <a:graphic>
+              <a:graphicData uri="http://schemas.openxmlformats.org/drawingml/2006/picture">
+                <pic:pic>
+                  <pic:nvPicPr>
+                    <pic:cNvPr id="0" name="Zrzut ekranu 2026-10-22 130604.png"/>
+                    <pic:cNvPicPr/>
+                  </pic:nvPicPr>
+                  <pic:blipFill>
+                    <a:blip r:embed="rId15"/>
+                    <a:stretch>
+                      <a:fillRect/>
+                    </a:stretch>
+                  </pic:blipFill>
+                  <pic:spPr>
+                    <a:xfrm>
+                      <a:off x="0" y="0"/>
+                      <a:ext cx="5303520" cy="3595115"/>
+                    </a:xfrm>
+                    <a:prstGeom prst="rect"/>
+                  </pic:spPr>
+                </pic:pic>
+              </a:graphicData>
+            </a:graphic>
+          </wp:inline>
+        </w:drawing>
+      </w:r>
+    </w:p>
+    <w:p>
+      <w:pPr>
+        <w:keepNext w:val="0"/>
+        <w:spacing w:before="40" w:after="200"/>
+        <w:jc w:val="center"/>
+      </w:pPr>
+      <w:r>
+        <w:rPr>
+          <w:rFonts w:ascii="Arial" w:hAnsi="Arial"/>
+          <w:i/>
+          <w:color w:val="4B5563"/>
+          <w:sz w:val="18"/>
+        </w:rPr>
+        <w:t>Rysunek 7: Bezpośrednie pobranie i wyświetlenie pliku graficznego foto.jpg z katalogu meble80.</w:t>
+      </w:r>
+    </w:p>
+    <w:p>
+      <w:pPr>
+        <w:keepNext/>
+        <w:spacing w:before="120" w:after="40"/>
+        <w:jc w:val="center"/>
+      </w:pPr>
+      <w:r>
+        <w:drawing>
+          <wp:inline xmlns:a="http://schemas.openxmlformats.org/drawingml/2006/main" xmlns:pic="http://schemas.openxmlformats.org/drawingml/2006/picture">
+            <wp:extent cx="5303520" cy="1550834"/>
+            <wp:docPr id="8" name="Picture 8"/>
+            <wp:cNvGraphicFramePr>
+              <a:graphicFrameLocks noChangeAspect="1"/>
+            </wp:cNvGraphicFramePr>
+            <a:graphic>
+              <a:graphicData uri="http://schemas.openxmlformats.org/drawingml/2006/picture">
+                <pic:pic>
+                  <pic:nvPicPr>
+                    <pic:cNvPr id="0" name="Zrzut ekranu 2026-10-22 130556.png"/>
+                    <pic:cNvPicPr/>
+                  </pic:nvPicPr>
+                  <pic:blipFill>
+                    <a:blip r:embed="rId16"/>
+                    <a:stretch>
+                      <a:fillRect/>
+                    </a:stretch>
+                  </pic:blipFill>
+                  <pic:spPr>
+                    <a:xfrm>
+                      <a:off x="0" y="0"/>
+                      <a:ext cx="5303520" cy="1550834"/>
+                    </a:xfrm>
+                    <a:prstGeom prst="rect"/>
+                  </pic:spPr>
+                </pic:pic>
+              </a:graphicData>
+            </a:graphic>
+          </wp:inline>
+        </w:drawing>
+      </w:r>
+    </w:p>
+    <w:p>
+      <w:pPr>
+        <w:keepNext w:val="0"/>
+        <w:spacing w:before="40" w:after="200"/>
+        <w:jc w:val="center"/>
+      </w:pPr>
+      <w:r>
+        <w:rPr>
+          <w:rFonts w:ascii="Arial" w:hAnsi="Arial"/>
+          <w:i/>
+          <w:color w:val="4B5563"/>
+          <w:sz w:val="18"/>
+        </w:rPr>
+        <w:t>Rysunek 8: Prawidłowe otwarcie i renderowanie pliku dokument.pdf w przeglądarce.</w:t>
+      </w:r>
+    </w:p>
+    <w:p>
+      <w:pPr>
+        <w:keepNext/>
+        <w:spacing w:before="120" w:after="40"/>
+        <w:jc w:val="center"/>
+      </w:pPr>
+      <w:r>
+        <w:drawing>
+          <wp:inline xmlns:a="http://schemas.openxmlformats.org/drawingml/2006/main" xmlns:pic="http://schemas.openxmlformats.org/drawingml/2006/picture">
+            <wp:extent cx="5303520" cy="2019401"/>
+            <wp:docPr id="9" name="Picture 9"/>
+            <wp:cNvGraphicFramePr>
+              <a:graphicFrameLocks noChangeAspect="1"/>
+            </wp:cNvGraphicFramePr>
+            <a:graphic>
+              <a:graphicData uri="http://schemas.openxmlformats.org/drawingml/2006/picture">
+                <pic:pic>
+                  <pic:nvPicPr>
+                    <pic:cNvPr id="0" name="Zrzut ekranu 2026-10-22 130617.png"/>
+                    <pic:cNvPicPr/>
+                  </pic:nvPicPr>
+                  <pic:blipFill>
+                    <a:blip r:embed="rId17"/>
+                    <a:stretch>
+                      <a:fillRect/>
+                    </a:stretch>
+                  </pic:blipFill>
+                  <pic:spPr>
+                    <a:xfrm>
+                      <a:off x="0" y="0"/>
+                      <a:ext cx="5303520" cy="2019401"/>
+                    </a:xfrm>
+                    <a:prstGeom prst="rect"/>
+                  </pic:spPr>
+                </pic:pic>
+              </a:graphicData>
+            </a:graphic>
+          </wp:inline>
+        </w:drawing>
+      </w:r>
+    </w:p>
+    <w:p>
+      <w:pPr>
+        <w:keepNext w:val="0"/>
+        <w:spacing w:before="40" w:after="200"/>
+        <w:jc w:val="center"/>
+      </w:pPr>
+      <w:r>
+        <w:rPr>
+          <w:rFonts w:ascii="Arial" w:hAnsi="Arial"/>
+          <w:i/>
+          <w:color w:val="4B5563"/>
+          <w:sz w:val="18"/>
+        </w:rPr>
+        <w:t>Rysunek 9: Zawartość pliku nagłówkowego naglowek.html zawierającego dane autorów ćwiczenia.</w:t>
+      </w:r>
+    </w:p>
+    <w:p>
+      <w:pPr>
+        <w:keepNext/>
+        <w:spacing w:before="120" w:after="40"/>
+        <w:jc w:val="center"/>
+      </w:pPr>
+      <w:r>
+        <w:drawing>
+          <wp:inline xmlns:a="http://schemas.openxmlformats.org/drawingml/2006/main" xmlns:pic="http://schemas.openxmlformats.org/drawingml/2006/picture">
+            <wp:extent cx="5303520" cy="1672393"/>
+            <wp:docPr id="10" name="Picture 10"/>
+            <wp:cNvGraphicFramePr>
+              <a:graphicFrameLocks noChangeAspect="1"/>
+            </wp:cNvGraphicFramePr>
+            <a:graphic>
+              <a:graphicData uri="http://schemas.openxmlformats.org/drawingml/2006/picture">
+                <pic:pic>
+                  <pic:nvPicPr>
+                    <pic:cNvPr id="0" name="Zrzut ekranu 2026-10-22 130625.png"/>
+                    <pic:cNvPicPr/>
+                  </pic:nvPicPr>
+                  <pic:blipFill>
+                    <a:blip r:embed="rId18"/>
+                    <a:stretch>
+                      <a:fillRect/>
+                    </a:stretch>
+                  </pic:blipFill>
+                  <pic:spPr>
+                    <a:xfrm>
+                      <a:off x="0" y="0"/>
+                      <a:ext cx="5303520" cy="1672393"/>
+                    </a:xfrm>
+                    <a:prstGeom prst="rect"/>
+                  </pic:spPr>
+                </pic:pic>
+              </a:graphicData>
+            </a:graphic>
+          </wp:inline>
+        </w:drawing>
+      </w:r>
+    </w:p>
+    <w:p>
+      <w:pPr>
+        <w:keepNext w:val="0"/>
+        <w:spacing w:before="40" w:after="200"/>
+        <w:jc w:val="center"/>
+      </w:pPr>
+      <w:r>
+        <w:rPr>
+          <w:rFonts w:ascii="Arial" w:hAnsi="Arial"/>
+          <w:i/>
+          <w:color w:val="4B5563"/>
+          <w:sz w:val="18"/>
+        </w:rPr>
+        <w:t>Rysunek 10: Zawartość pliku stopki stopka.html osadzanej na końcu listy indeksu.</w:t>
+      </w:r>
+    </w:p>
+    <w:p>
+      <w:pPr>
+        <w:keepNext/>
+        <w:spacing w:before="120" w:after="40"/>
+        <w:jc w:val="center"/>
+      </w:pPr>
+      <w:r>
+        <w:drawing>
+          <wp:inline xmlns:a="http://schemas.openxmlformats.org/drawingml/2006/main" xmlns:pic="http://schemas.openxmlformats.org/drawingml/2006/picture">
+            <wp:extent cx="5303520" cy="1455462"/>
+            <wp:docPr id="11" name="Picture 11"/>
+            <wp:cNvGraphicFramePr>
+              <a:graphicFrameLocks noChangeAspect="1"/>
+            </wp:cNvGraphicFramePr>
+            <a:graphic>
+              <a:graphicData uri="http://schemas.openxmlformats.org/drawingml/2006/picture">
+                <pic:pic>
+                  <pic:nvPicPr>
+                    <pic:cNvPr id="0" name="Zrzut ekranu 2026-10-22 130630.png"/>
+                    <pic:cNvPicPr/>
+                  </pic:nvPicPr>
+                  <pic:blipFill>
+                    <a:blip r:embed="rId19"/>
+                    <a:stretch>
+                      <a:fillRect/>
+                    </a:stretch>
+                  </pic:blipFill>
+                  <pic:spPr>
+                    <a:xfrm>
+                      <a:off x="0" y="0"/>
+                      <a:ext cx="5303520" cy="1455462"/>
+                    </a:xfrm>
+                    <a:prstGeom prst="rect"/>
+                  </pic:spPr>
+                </pic:pic>
+              </a:graphicData>
+            </a:graphic>
+          </wp:inline>
+        </w:drawing>
+      </w:r>
+    </w:p>
+    <w:p>
+      <w:pPr>
+        <w:keepNext w:val="0"/>
+        <w:spacing w:before="40" w:after="200"/>
+        <w:jc w:val="center"/>
+      </w:pPr>
+      <w:r>
+        <w:rPr>
+          <w:rFonts w:ascii="Arial" w:hAnsi="Arial"/>
+          <w:i/>
+          <w:color w:val="4B5563"/>
+          <w:sz w:val="18"/>
+        </w:rPr>
+        <w:t>Rysunek 11: Wyświetlenie zawartości pliku tekstowego test.txt w oknie przeglądarki.</w:t>
+      </w:r>
+    </w:p>
+    <w:p>
+      <w:pPr>
+        <w:pStyle w:val="Heading1"/>
+        <w:keepNext/>
         <w:spacing w:before="280" w:after="80"/>
       </w:pPr>
       <w:r>
@@ -631,71 +1659,87 @@
           <w:color w:val="1A478A"/>
           <w:sz w:val="26"/>
         </w:rPr>
-        <w:t>9-11. Obsługa własnych stron błędów HTTP</w:t>
+        <w:t>6. Obsługa własnych stron błędów HTTP (błędy 404, 403, 500)</w:t>
       </w:r>
     </w:p>
     <w:p>
       <w:pPr>
         <w:spacing w:line="276" w:lineRule="auto" w:after="80"/>
+        <w:jc w:val="both"/>
       </w:pPr>
       <w:r>
         <w:rPr>
           <w:rFonts w:ascii="Arial" w:hAnsi="Arial"/>
-          <w:sz w:val="21"/>
+          <w:color w:val="1F2937"/>
+          <w:sz w:val="20"/>
         </w:rPr>
-        <w:t>Skonfigurowano globalny alias dla stron błędów Alias /err/ "D:/Studenci/Cw_01/3ID11B_01/error/" oraz zdefiniowano dyrektywy ErrorDocument dla kodów 404, 403 i 500.</w:t>
-      </w:r>
-    </w:p>
-    <w:p>
-      <w:pPr>
-        <w:spacing w:line="276" w:lineRule="auto" w:after="80"/>
-      </w:pPr>
-      <w:r>
-        <w:rPr>
-          <w:rFonts w:ascii="Arial" w:hAnsi="Arial"/>
-          <w:sz w:val="21"/>
-        </w:rPr>
-        <w:t>Dla domeny meble.pl oraz katalogu meble przygotowano dedykowane pliki obsługi błędów /error/404.html oraz /error/403.html w estetycznej oprawie graficznej.</w:t>
+        <w:t>W zadaniach 9, 10 i 11 skonfigurowano hierarchiczną obsługę błędów HTTP. Globalnie w serwerze zdefiniowano alias Alias /err/ "D:/Studenci/Cw_01/3ID11B_06/error/" oraz dyrektywy ErrorDocument dla kodów 404 (Not Found), 403 (Forbidden) oraz 500 (Internal Server Error). Jednocześnie w wirtualnym hoście www.meble.pl oraz katalogu meble nadpisano domyślne strony błędów dedykowanymi szablonami /error/404.html oraz /error/403.html w estetycznej oprawie wizualnej przygotowanej dla danej domeny.</w:t>
       </w:r>
     </w:p>
     <w:tbl>
       <w:tblPr>
-        <w:tblStyle w:val="TableGrid"/>
         <w:tblW w:type="auto" w:w="0"/>
         <w:jc w:val="center"/>
         <w:tblLook w:firstColumn="1" w:firstRow="1" w:lastColumn="0" w:lastRow="0" w:noHBand="0" w:noVBand="1" w:val="04A0"/>
+        <w:tblBorders>
+          <w:top w:val="single" w:sz="4" w:space="0" w:color="CBD5E1"/>
+          <w:left w:val="single" w:sz="4" w:space="0" w:color="CBD5E1"/>
+          <w:bottom w:val="single" w:sz="4" w:space="0" w:color="CBD5E1"/>
+          <w:right w:val="single" w:sz="4" w:space="0" w:color="CBD5E1"/>
+          <w:insideH w:val="single" w:sz="4" w:space="0" w:color="CBD5E1"/>
+          <w:insideV w:val="single" w:sz="4" w:space="0" w:color="CBD5E1"/>
+        </w:tblBorders>
       </w:tblPr>
       <w:tblGrid>
-        <w:gridCol w:w="8640"/>
+        <w:gridCol w:w="10080"/>
       </w:tblGrid>
       <w:tr>
         <w:tc>
           <w:tcPr>
             <w:tcW w:type="dxa" w:w="9648"/>
+            <w:shd w:val="clear" w:color="auto" w:fill="F8FAFC"/>
             <w:tcMar>
-              <w:top w:w="80" w:type="dxa"/>
-              <w:bottom w:w="80" w:type="dxa"/>
-              <w:left w:w="120" w:type="dxa"/>
-              <w:right w:w="120" w:type="dxa"/>
+              <w:top w:w="70" w:type="dxa"/>
+              <w:bottom w:w="70" w:type="dxa"/>
+              <w:left w:w="100" w:type="dxa"/>
+              <w:right w:w="100" w:type="dxa"/>
             </w:tcMar>
           </w:tcPr>
           <w:p>
             <w:pPr>
-              <w:spacing w:after="0"/>
+              <w:spacing w:after="0" w:line="252" w:lineRule="auto"/>
             </w:pPr>
             <w:r>
               <w:rPr>
                 <w:rFonts w:ascii="Consolas" w:hAnsi="Consolas"/>
-                <w:color w:val="222222"/>
-                <w:sz w:val="18"/>
+                <w:color w:val="111827"/>
+                <w:sz w:val="17"/>
               </w:rPr>
-              <w:t>Alias /err/ "D:/Studenci/Cw_01/3ID11B_01/error/"</w:t>
+              <w:t># Globalne pliki bledow dla calego serwera</w:t>
+              <w:br/>
+              <w:t>Alias /err/ "D:/Studenci/Cw_01/3ID11B_06/error/"</w:t>
+              <w:br/>
+              <w:t>&lt;Directory "D:/Studenci/Cw_01/3ID11B_06/error"&gt;</w:t>
+              <w:br/>
+              <w:t xml:space="preserve">    Require all granted</w:t>
+              <w:br/>
+              <w:t>&lt;/Directory&gt;</w:t>
               <w:br/>
               <w:t>ErrorDocument 404 /err/404.html</w:t>
               <w:br/>
               <w:t>ErrorDocument 403 /err/403.html</w:t>
               <w:br/>
               <w:t>ErrorDocument 500 /err/500.html</w:t>
+              <w:br/>
+              <w:br/>
+              <w:t># Nadpisanie bledu 404 w VirtualHost meble.pl:</w:t>
+              <w:br/>
+              <w:t>ErrorDocument 404 /error/404.html</w:t>
+              <w:br/>
+              <w:br/>
+              <w:t># Nadpisanie bledu 403 w Directory meble:</w:t>
+              <w:br/>
+              <w:t>ErrorDocument 403 /error/403.html</w:t>
             </w:r>
           </w:p>
         </w:tc>
@@ -708,22 +1752,79 @@
     </w:p>
     <w:p>
       <w:pPr>
-        <w:spacing w:before="80" w:after="200"/>
+        <w:spacing w:line="276" w:lineRule="auto" w:after="80"/>
+        <w:jc w:val="both"/>
+      </w:pPr>
+      <w:r>
+        <w:rPr>
+          <w:rFonts w:ascii="Arial" w:hAnsi="Arial"/>
+          <w:color w:val="1F2937"/>
+          <w:sz w:val="20"/>
+        </w:rPr>
+        <w:t>Działanie własnej strony błędu przetestowano poprzez wywołanie nieistniejącego pliku pod adresem http://meble.pl/nieistnieje.html. Serwer zamiast surowego, domyślnego komunikatu Apache zwrócił przygotowaną stronę błędu 404 z komunikatem "404 - Błąd domeny meble.pl - Nie odnaleziono żądanego zasobu" (Rysunek 12).</w:t>
+      </w:r>
+    </w:p>
+    <w:p>
+      <w:pPr>
+        <w:keepNext/>
+        <w:spacing w:before="120" w:after="40"/>
+        <w:jc w:val="center"/>
+      </w:pPr>
+      <w:r>
+        <w:drawing>
+          <wp:inline xmlns:a="http://schemas.openxmlformats.org/drawingml/2006/main" xmlns:pic="http://schemas.openxmlformats.org/drawingml/2006/picture">
+            <wp:extent cx="5303520" cy="2075652"/>
+            <wp:docPr id="12" name="Picture 12"/>
+            <wp:cNvGraphicFramePr>
+              <a:graphicFrameLocks noChangeAspect="1"/>
+            </wp:cNvGraphicFramePr>
+            <a:graphic>
+              <a:graphicData uri="http://schemas.openxmlformats.org/drawingml/2006/picture">
+                <pic:pic>
+                  <pic:nvPicPr>
+                    <pic:cNvPr id="0" name="Zrzut ekranu 2026-10-22 131558.png"/>
+                    <pic:cNvPicPr/>
+                  </pic:nvPicPr>
+                  <pic:blipFill>
+                    <a:blip r:embed="rId20"/>
+                    <a:stretch>
+                      <a:fillRect/>
+                    </a:stretch>
+                  </pic:blipFill>
+                  <pic:spPr>
+                    <a:xfrm>
+                      <a:off x="0" y="0"/>
+                      <a:ext cx="5303520" cy="2075652"/>
+                    </a:xfrm>
+                    <a:prstGeom prst="rect"/>
+                  </pic:spPr>
+                </pic:pic>
+              </a:graphicData>
+            </a:graphic>
+          </wp:inline>
+        </w:drawing>
+      </w:r>
+    </w:p>
+    <w:p>
+      <w:pPr>
+        <w:keepNext w:val="0"/>
+        <w:spacing w:before="40" w:after="200"/>
         <w:jc w:val="center"/>
       </w:pPr>
       <w:r>
         <w:rPr>
           <w:rFonts w:ascii="Arial" w:hAnsi="Arial"/>
           <w:i/>
-          <w:color w:val="888888"/>
-          <w:sz w:val="19"/>
+          <w:color w:val="4B5563"/>
+          <w:sz w:val="18"/>
         </w:rPr>
-        <w:t>--- [MIEJSCE NA ZRZUT EKRANOWY DLA: 9-11. Własne strony błędów HTTP] ---</w:t>
+        <w:t>Rysunek 12: Własna strona błędu HTTP 404 dla domeny meble.pl (/error/404.html).</w:t>
       </w:r>
     </w:p>
     <w:p>
       <w:pPr>
-        <w:pStyle w:val="Heading2"/>
+        <w:pStyle w:val="Heading1"/>
+        <w:keepNext/>
         <w:spacing w:before="280" w:after="80"/>
       </w:pPr>
       <w:r>
@@ -733,77 +1834,63 @@
           <w:color w:val="1A478A"/>
           <w:sz w:val="26"/>
         </w:rPr>
-        <w:t>12. Kontrola dostępu i autoryzacja HTTP Basic (hasla.has)</w:t>
+        <w:t>7. Kontrola dostępu i autoryzacja HTTP Basic (hasla.has)</w:t>
       </w:r>
     </w:p>
     <w:p>
       <w:pPr>
         <w:spacing w:line="276" w:lineRule="auto" w:after="80"/>
+        <w:jc w:val="both"/>
       </w:pPr>
       <w:r>
         <w:rPr>
           <w:rFonts w:ascii="Arial" w:hAnsi="Arial"/>
-          <w:sz w:val="21"/>
+          <w:color w:val="1F2937"/>
+          <w:sz w:val="20"/>
         </w:rPr>
-        <w:t>Katalogi domen auta oraz auta80 zabezpieczono za pomocą modułu mod_auth_basic. Zdefiniowano plik haseł AuthUserFile "D:/Studenci/Cw_01/3ID11B_01/hasla.has".</w:t>
-      </w:r>
-    </w:p>
-    <w:p>
-      <w:pPr>
-        <w:spacing w:line="276" w:lineRule="auto" w:after="80"/>
-      </w:pPr>
-      <w:r>
-        <w:rPr>
-          <w:rFonts w:ascii="Arial" w:hAnsi="Arial"/>
-          <w:sz w:val="21"/>
-        </w:rPr>
-        <w:t>W pliku hasla.has wygenerowano konto użytkownika st z poprawnym haszem SHA-1 dla hasła st: st:{SHA}mwLZl0wU5iPJ/77XNgvqy/DcuV8=.</w:t>
-      </w:r>
-    </w:p>
-    <w:p>
-      <w:pPr>
-        <w:spacing w:line="276" w:lineRule="auto" w:after="80"/>
-      </w:pPr>
-      <w:r>
-        <w:rPr>
-          <w:rFonts w:ascii="Arial" w:hAnsi="Arial"/>
-          <w:sz w:val="21"/>
-        </w:rPr>
-        <w:t>Dostęp do zasobów phpmyad.pl ograniczono wyłącznie do adresu lokalnego za pomocą dyrektywy Require ip 127.0.0.1.</w:t>
+        <w:t>W Zadaniu 12 zabezpieczono katalogi domeny www.auta.pl (katalogi auta oraz auta80) przed nieautoryzowanym dostępem. Wdrożono mechanizm uwierzytelniania HTTP Basic Authentication oparty o moduł mod_auth_basic. Jako magazyn poświadczeń wskazano plik AuthUserFile "D:/Studenci/Cw_01/3ID11B_06/hasla.has", a dostęp ograniczono wyłącznie do użytkownika st dyrektywą Require user st.</w:t>
       </w:r>
     </w:p>
     <w:tbl>
       <w:tblPr>
-        <w:tblStyle w:val="TableGrid"/>
         <w:tblW w:type="auto" w:w="0"/>
         <w:jc w:val="center"/>
         <w:tblLook w:firstColumn="1" w:firstRow="1" w:lastColumn="0" w:lastRow="0" w:noHBand="0" w:noVBand="1" w:val="04A0"/>
+        <w:tblBorders>
+          <w:top w:val="single" w:sz="4" w:space="0" w:color="CBD5E1"/>
+          <w:left w:val="single" w:sz="4" w:space="0" w:color="CBD5E1"/>
+          <w:bottom w:val="single" w:sz="4" w:space="0" w:color="CBD5E1"/>
+          <w:right w:val="single" w:sz="4" w:space="0" w:color="CBD5E1"/>
+          <w:insideH w:val="single" w:sz="4" w:space="0" w:color="CBD5E1"/>
+          <w:insideV w:val="single" w:sz="4" w:space="0" w:color="CBD5E1"/>
+        </w:tblBorders>
       </w:tblPr>
       <w:tblGrid>
-        <w:gridCol w:w="8640"/>
+        <w:gridCol w:w="10080"/>
       </w:tblGrid>
       <w:tr>
         <w:tc>
           <w:tcPr>
             <w:tcW w:type="dxa" w:w="9648"/>
+            <w:shd w:val="clear" w:color="auto" w:fill="F8FAFC"/>
             <w:tcMar>
-              <w:top w:w="80" w:type="dxa"/>
-              <w:bottom w:w="80" w:type="dxa"/>
-              <w:left w:w="120" w:type="dxa"/>
-              <w:right w:w="120" w:type="dxa"/>
+              <w:top w:w="70" w:type="dxa"/>
+              <w:bottom w:w="70" w:type="dxa"/>
+              <w:left w:w="100" w:type="dxa"/>
+              <w:right w:w="100" w:type="dxa"/>
             </w:tcMar>
           </w:tcPr>
           <w:p>
             <w:pPr>
-              <w:spacing w:after="0"/>
+              <w:spacing w:after="0" w:line="252" w:lineRule="auto"/>
             </w:pPr>
             <w:r>
               <w:rPr>
                 <w:rFonts w:ascii="Consolas" w:hAnsi="Consolas"/>
-                <w:color w:val="222222"/>
-                <w:sz w:val="18"/>
+                <w:color w:val="111827"/>
+                <w:sz w:val="17"/>
               </w:rPr>
-              <w:t>&lt;Directory "D:/Studenci/Cw_01/3ID11B_01/auta"&gt;</w:t>
+              <w:t>&lt;Directory "D:/Studenci/Cw_01/3ID11B_06/auta"&gt;</w:t>
               <w:br/>
               <w:t xml:space="preserve">    Options Indexes FollowSymLinks</w:t>
               <w:br/>
@@ -813,7 +1900,7 @@
               <w:br/>
               <w:t xml:space="preserve">    AuthName "Auta - Wymagana autoryzacja studenta"</w:t>
               <w:br/>
-              <w:t xml:space="preserve">    AuthUserFile "D:/Studenci/Cw_01/3ID11B_01/hasla.has"</w:t>
+              <w:t xml:space="preserve">    AuthUserFile "D:/Studenci/Cw_01/3ID11B_06/hasla.has"</w:t>
               <w:br/>
               <w:t xml:space="preserve">    Require user st</w:t>
               <w:br/>
@@ -830,22 +1917,136 @@
     </w:p>
     <w:p>
       <w:pPr>
-        <w:spacing w:before="80" w:after="200"/>
+        <w:spacing w:line="276" w:lineRule="auto" w:after="80"/>
+        <w:jc w:val="both"/>
+      </w:pPr>
+      <w:r>
+        <w:rPr>
+          <w:rFonts w:ascii="Arial" w:hAnsi="Arial"/>
+          <w:color w:val="1F2937"/>
+          <w:sz w:val="20"/>
+        </w:rPr>
+        <w:t>W pliku hasla.has wygenerowano bezpieczny wpis z haszem SHA-1 dla konta st i hasła st: st:{SHA}mwLZl0wU5iPJ/77XNgvqy/DcuV8=. Przy pierwszej próbie wejścia na stronę http://www.auta.pl przeglądarka otrzymała od serwera odpowiedź HTTP 401 Unauthorized i wyświetliła modalne okno żądania autoryzacji (Rysunek 13). Po wprowadzeniu poprawnych danych (st / st) serwer autoryzował sesję i wyświetlił chronioną stronę powitalną z komunikatem "Strona startowa domeny www.auta.pl (Autoryzacja udana)" (Rysunek 14).</w:t>
+      </w:r>
+    </w:p>
+    <w:p>
+      <w:pPr>
+        <w:keepNext/>
+        <w:spacing w:before="120" w:after="40"/>
+        <w:jc w:val="center"/>
+      </w:pPr>
+      <w:r>
+        <w:drawing>
+          <wp:inline xmlns:a="http://schemas.openxmlformats.org/drawingml/2006/main" xmlns:pic="http://schemas.openxmlformats.org/drawingml/2006/picture">
+            <wp:extent cx="5303520" cy="1453588"/>
+            <wp:docPr id="13" name="Picture 13"/>
+            <wp:cNvGraphicFramePr>
+              <a:graphicFrameLocks noChangeAspect="1"/>
+            </wp:cNvGraphicFramePr>
+            <a:graphic>
+              <a:graphicData uri="http://schemas.openxmlformats.org/drawingml/2006/picture">
+                <pic:pic>
+                  <pic:nvPicPr>
+                    <pic:cNvPr id="0" name="Zrzut ekranu 2026-10-22 132326.png"/>
+                    <pic:cNvPicPr/>
+                  </pic:nvPicPr>
+                  <pic:blipFill>
+                    <a:blip r:embed="rId21"/>
+                    <a:stretch>
+                      <a:fillRect/>
+                    </a:stretch>
+                  </pic:blipFill>
+                  <pic:spPr>
+                    <a:xfrm>
+                      <a:off x="0" y="0"/>
+                      <a:ext cx="5303520" cy="1453588"/>
+                    </a:xfrm>
+                    <a:prstGeom prst="rect"/>
+                  </pic:spPr>
+                </pic:pic>
+              </a:graphicData>
+            </a:graphic>
+          </wp:inline>
+        </w:drawing>
+      </w:r>
+    </w:p>
+    <w:p>
+      <w:pPr>
+        <w:keepNext w:val="0"/>
+        <w:spacing w:before="40" w:after="200"/>
         <w:jc w:val="center"/>
       </w:pPr>
       <w:r>
         <w:rPr>
           <w:rFonts w:ascii="Arial" w:hAnsi="Arial"/>
           <w:i/>
-          <w:color w:val="888888"/>
-          <w:sz w:val="19"/>
+          <w:color w:val="4B5563"/>
+          <w:sz w:val="18"/>
         </w:rPr>
-        <w:t>--- [MIEJSCE NA ZRZUT EKRANOWY DLA: 12. Kontrola dostępu i autoryzacja] ---</w:t>
+        <w:t>Rysunek 13: Żądanie autoryzacji HTTP Basic przy próbie wejścia na stronę www.auta.pl (wymagane poświadczenia użytkownika st).</w:t>
       </w:r>
     </w:p>
     <w:p>
       <w:pPr>
-        <w:pStyle w:val="Heading2"/>
+        <w:keepNext/>
+        <w:spacing w:before="120" w:after="40"/>
+        <w:jc w:val="center"/>
+      </w:pPr>
+      <w:r>
+        <w:drawing>
+          <wp:inline xmlns:a="http://schemas.openxmlformats.org/drawingml/2006/main" xmlns:pic="http://schemas.openxmlformats.org/drawingml/2006/picture">
+            <wp:extent cx="5303520" cy="2268198"/>
+            <wp:docPr id="14" name="Picture 14"/>
+            <wp:cNvGraphicFramePr>
+              <a:graphicFrameLocks noChangeAspect="1"/>
+            </wp:cNvGraphicFramePr>
+            <a:graphic>
+              <a:graphicData uri="http://schemas.openxmlformats.org/drawingml/2006/picture">
+                <pic:pic>
+                  <pic:nvPicPr>
+                    <pic:cNvPr id="0" name="Zrzut ekranu 2026-10-22 131047.png"/>
+                    <pic:cNvPicPr/>
+                  </pic:nvPicPr>
+                  <pic:blipFill>
+                    <a:blip r:embed="rId22"/>
+                    <a:stretch>
+                      <a:fillRect/>
+                    </a:stretch>
+                  </pic:blipFill>
+                  <pic:spPr>
+                    <a:xfrm>
+                      <a:off x="0" y="0"/>
+                      <a:ext cx="5303520" cy="2268198"/>
+                    </a:xfrm>
+                    <a:prstGeom prst="rect"/>
+                  </pic:spPr>
+                </pic:pic>
+              </a:graphicData>
+            </a:graphic>
+          </wp:inline>
+        </w:drawing>
+      </w:r>
+    </w:p>
+    <w:p>
+      <w:pPr>
+        <w:keepNext w:val="0"/>
+        <w:spacing w:before="40" w:after="200"/>
+        <w:jc w:val="center"/>
+      </w:pPr>
+      <w:r>
+        <w:rPr>
+          <w:rFonts w:ascii="Arial" w:hAnsi="Arial"/>
+          <w:i/>
+          <w:color w:val="4B5563"/>
+          <w:sz w:val="18"/>
+        </w:rPr>
+        <w:t>Rysunek 14: Dostęp do domeny www.auta.pl po pomyślnym uwierzytelnieniu użytkownika st (hasla.has).</w:t>
+      </w:r>
+    </w:p>
+    <w:p>
+      <w:pPr>
+        <w:pStyle w:val="Heading1"/>
+        <w:keepNext/>
         <w:spacing w:before="280" w:after="80"/>
       </w:pPr>
       <w:r>
@@ -855,51 +2056,61 @@
           <w:color w:val="1A478A"/>
           <w:sz w:val="26"/>
         </w:rPr>
-        <w:t>13. Moduł statusu serwera (mod_status)</w:t>
+        <w:t>8. Moduł diagnostyczny statusu serwera (mod_status pod /status)</w:t>
       </w:r>
     </w:p>
     <w:p>
       <w:pPr>
         <w:spacing w:line="276" w:lineRule="auto" w:after="80"/>
+        <w:jc w:val="both"/>
       </w:pPr>
       <w:r>
         <w:rPr>
           <w:rFonts w:ascii="Arial" w:hAnsi="Arial"/>
-          <w:sz w:val="21"/>
+          <w:color w:val="1F2937"/>
+          <w:sz w:val="20"/>
         </w:rPr>
-        <w:t>W wirtualnym hoście www.meble.pl na porcie 80 zdefiniowano lokację /status obsługiwaną przez wewnętrzny handler server-status, z uprawnieniem dostępu Require all granted.</w:t>
+        <w:t>W Zadaniu 13 w wirtualnym hoście www.meble.pl na porcie 80 skonfigurowano blok &lt;Location /status&gt; z procedurą obsługi SetHandler server-status. Dyrektywa Require all granted udostępniła generowany w czasie rzeczywistym raport kondycji serwera.</w:t>
       </w:r>
     </w:p>
     <w:tbl>
       <w:tblPr>
-        <w:tblStyle w:val="TableGrid"/>
         <w:tblW w:type="auto" w:w="0"/>
         <w:jc w:val="center"/>
         <w:tblLook w:firstColumn="1" w:firstRow="1" w:lastColumn="0" w:lastRow="0" w:noHBand="0" w:noVBand="1" w:val="04A0"/>
+        <w:tblBorders>
+          <w:top w:val="single" w:sz="4" w:space="0" w:color="CBD5E1"/>
+          <w:left w:val="single" w:sz="4" w:space="0" w:color="CBD5E1"/>
+          <w:bottom w:val="single" w:sz="4" w:space="0" w:color="CBD5E1"/>
+          <w:right w:val="single" w:sz="4" w:space="0" w:color="CBD5E1"/>
+          <w:insideH w:val="single" w:sz="4" w:space="0" w:color="CBD5E1"/>
+          <w:insideV w:val="single" w:sz="4" w:space="0" w:color="CBD5E1"/>
+        </w:tblBorders>
       </w:tblPr>
       <w:tblGrid>
-        <w:gridCol w:w="8640"/>
+        <w:gridCol w:w="10080"/>
       </w:tblGrid>
       <w:tr>
         <w:tc>
           <w:tcPr>
             <w:tcW w:type="dxa" w:w="9648"/>
+            <w:shd w:val="clear" w:color="auto" w:fill="F8FAFC"/>
             <w:tcMar>
-              <w:top w:w="80" w:type="dxa"/>
-              <w:bottom w:w="80" w:type="dxa"/>
-              <w:left w:w="120" w:type="dxa"/>
-              <w:right w:w="120" w:type="dxa"/>
+              <w:top w:w="70" w:type="dxa"/>
+              <w:bottom w:w="70" w:type="dxa"/>
+              <w:left w:w="100" w:type="dxa"/>
+              <w:right w:w="100" w:type="dxa"/>
             </w:tcMar>
           </w:tcPr>
           <w:p>
             <w:pPr>
-              <w:spacing w:after="0"/>
+              <w:spacing w:after="0" w:line="252" w:lineRule="auto"/>
             </w:pPr>
             <w:r>
               <w:rPr>
                 <w:rFonts w:ascii="Consolas" w:hAnsi="Consolas"/>
-                <w:color w:val="222222"/>
-                <w:sz w:val="18"/>
+                <w:color w:val="111827"/>
+                <w:sz w:val="17"/>
               </w:rPr>
               <w:t>&lt;Location /status&gt;</w:t>
               <w:br/>
@@ -920,22 +2131,91 @@
     </w:p>
     <w:p>
       <w:pPr>
-        <w:spacing w:before="80" w:after="200"/>
+        <w:spacing w:line="276" w:lineRule="auto" w:after="80"/>
+        <w:jc w:val="both"/>
+      </w:pPr>
+      <w:r>
+        <w:rPr>
+          <w:rFonts w:ascii="Arial" w:hAnsi="Arial"/>
+          <w:color w:val="1F2937"/>
+          <w:sz w:val="20"/>
+        </w:rPr>
+        <w:t>Wywołanie adresu http://meble.pl/status (Rysunek 15) prezentuje szczegółowe metryki pracy demona httpd.exe:</w:t>
+        <w:br/>
+        <w:t>• Wersja serwera: Apache/2.4.58 (Win64) OpenSSL/3.1.4,</w:t>
+        <w:br/>
+        <w:t>• Nazwa serwera: www.meble.pl (via 10.0.2.2:80),</w:t>
+        <w:br/>
+        <w:t>• Czas ciągłej pracy (Server uptime): 16 minut 4 sekundy,</w:t>
+        <w:br/>
+        <w:t>• Łączna liczba obsłużonych żądań (Total accesses): 37,</w:t>
+        <w:br/>
+        <w:t>• Przesłany wolumen danych (Total Traffic): 302 kB,</w:t>
+        <w:br/>
+        <w:t>• Stan workerów w tablicy procesów (Scoreboard) – aktywność wątków w trybie nasłuchu i przetwarzania.</w:t>
+      </w:r>
+    </w:p>
+    <w:p>
+      <w:pPr>
+        <w:keepNext/>
+        <w:spacing w:before="120" w:after="40"/>
+        <w:jc w:val="center"/>
+      </w:pPr>
+      <w:r>
+        <w:drawing>
+          <wp:inline xmlns:a="http://schemas.openxmlformats.org/drawingml/2006/main" xmlns:pic="http://schemas.openxmlformats.org/drawingml/2006/picture">
+            <wp:extent cx="5303520" cy="3769273"/>
+            <wp:docPr id="15" name="Picture 15"/>
+            <wp:cNvGraphicFramePr>
+              <a:graphicFrameLocks noChangeAspect="1"/>
+            </wp:cNvGraphicFramePr>
+            <a:graphic>
+              <a:graphicData uri="http://schemas.openxmlformats.org/drawingml/2006/picture">
+                <pic:pic>
+                  <pic:nvPicPr>
+                    <pic:cNvPr id="0" name="Zrzut ekranu 2026-10-22 131530.png"/>
+                    <pic:cNvPicPr/>
+                  </pic:nvPicPr>
+                  <pic:blipFill>
+                    <a:blip r:embed="rId23"/>
+                    <a:stretch>
+                      <a:fillRect/>
+                    </a:stretch>
+                  </pic:blipFill>
+                  <pic:spPr>
+                    <a:xfrm>
+                      <a:off x="0" y="0"/>
+                      <a:ext cx="5303520" cy="3769273"/>
+                    </a:xfrm>
+                    <a:prstGeom prst="rect"/>
+                  </pic:spPr>
+                </pic:pic>
+              </a:graphicData>
+            </a:graphic>
+          </wp:inline>
+        </w:drawing>
+      </w:r>
+    </w:p>
+    <w:p>
+      <w:pPr>
+        <w:keepNext w:val="0"/>
+        <w:spacing w:before="40" w:after="200"/>
         <w:jc w:val="center"/>
       </w:pPr>
       <w:r>
         <w:rPr>
           <w:rFonts w:ascii="Arial" w:hAnsi="Arial"/>
           <w:i/>
-          <w:color w:val="888888"/>
-          <w:sz w:val="19"/>
+          <w:color w:val="4B5563"/>
+          <w:sz w:val="18"/>
         </w:rPr>
-        <w:t>--- [MIEJSCE NA ZRZUT EKRANOWY DLA: 13. Moduł statusu serwera (mod_status)] ---</w:t>
+        <w:t>Rysunek 15: Raport statusu serwera generowany przez moduł mod_status pod adresem http://meble.pl/status.</w:t>
       </w:r>
     </w:p>
     <w:p>
       <w:pPr>
-        <w:pStyle w:val="Heading2"/>
+        <w:pStyle w:val="Heading1"/>
+        <w:keepNext/>
         <w:spacing w:before="280" w:after="80"/>
       </w:pPr>
       <w:r>
@@ -945,81 +2225,92 @@
           <w:color w:val="1A478A"/>
           <w:sz w:val="26"/>
         </w:rPr>
-        <w:t>14. Szyfrowane połączenie SSL/TLS (Port 443)</w:t>
+        <w:t>9. Szyfrowane połączenie SSL/TLS (HTTPS, Port 443)</w:t>
       </w:r>
     </w:p>
     <w:p>
       <w:pPr>
         <w:spacing w:line="276" w:lineRule="auto" w:after="80"/>
+        <w:jc w:val="both"/>
       </w:pPr>
       <w:r>
         <w:rPr>
           <w:rFonts w:ascii="Arial" w:hAnsi="Arial"/>
-          <w:sz w:val="21"/>
+          <w:color w:val="1F2937"/>
+          <w:sz w:val="20"/>
         </w:rPr>
-        <w:t>Zdefiniowano dyrektywę Listen 443 https oraz wirtualny host &lt;VirtualHost 10.0.2.2:443&gt; dla domeny www.meble.pl z katalogiem DocumentRoot meble443.</w:t>
-      </w:r>
-    </w:p>
-    <w:p>
-      <w:pPr>
-        <w:spacing w:line="276" w:lineRule="auto" w:after="80"/>
-      </w:pPr>
-      <w:r>
-        <w:rPr>
-          <w:rFonts w:ascii="Arial" w:hAnsi="Arial"/>
-          <w:sz w:val="21"/>
-        </w:rPr>
-        <w:t>Włączono obsługę szyfrowania SSLEngine on oraz podpięto 2048-bitowy certyfikat i klucz prywatny RSA wygenerowane za pomocą OpenSSL z danymi zespołu: SSLCertificateFile "D:/Studenci/Cw_01/3ID11B_01/ssl/meble.crt" oraz SSLCertificateKeyFile "D:/Studenci/Cw_01/3ID11B_01/ssl/meble.key".</w:t>
+        <w:t>W Zadaniu 14 zaimplementowano bezpieczne połączenie szyfrowane protokołem TLS w oparciu o moduł mod_ssl. Zdefiniowano dyrektywę nasłuchu Listen 443 https oraz dedykowany wirtualny host &lt;VirtualHost 10.0.2.2:443&gt; z katalogiem DocumentRoot "D:/Studenci/Cw_01/3ID11B_06/meble443". Za pomocą narzędzia OpenSSL wygenerowano 2048-bitowy klucz prywatny RSA (meble.key) oraz samopodpisany certyfikat X.509 (meble.crt) wystawiony dla domeny www.meble.pl i podpięto je dyrektywami SSLCertificateFile i SSLCertificateKeyFile.</w:t>
       </w:r>
     </w:p>
     <w:tbl>
       <w:tblPr>
-        <w:tblStyle w:val="TableGrid"/>
         <w:tblW w:type="auto" w:w="0"/>
         <w:jc w:val="center"/>
         <w:tblLook w:firstColumn="1" w:firstRow="1" w:lastColumn="0" w:lastRow="0" w:noHBand="0" w:noVBand="1" w:val="04A0"/>
+        <w:tblBorders>
+          <w:top w:val="single" w:sz="4" w:space="0" w:color="CBD5E1"/>
+          <w:left w:val="single" w:sz="4" w:space="0" w:color="CBD5E1"/>
+          <w:bottom w:val="single" w:sz="4" w:space="0" w:color="CBD5E1"/>
+          <w:right w:val="single" w:sz="4" w:space="0" w:color="CBD5E1"/>
+          <w:insideH w:val="single" w:sz="4" w:space="0" w:color="CBD5E1"/>
+          <w:insideV w:val="single" w:sz="4" w:space="0" w:color="CBD5E1"/>
+        </w:tblBorders>
       </w:tblPr>
       <w:tblGrid>
-        <w:gridCol w:w="8640"/>
+        <w:gridCol w:w="10080"/>
       </w:tblGrid>
       <w:tr>
         <w:tc>
           <w:tcPr>
             <w:tcW w:type="dxa" w:w="9648"/>
+            <w:shd w:val="clear" w:color="auto" w:fill="F8FAFC"/>
             <w:tcMar>
-              <w:top w:w="80" w:type="dxa"/>
-              <w:bottom w:w="80" w:type="dxa"/>
-              <w:left w:w="120" w:type="dxa"/>
-              <w:right w:w="120" w:type="dxa"/>
+              <w:top w:w="70" w:type="dxa"/>
+              <w:bottom w:w="70" w:type="dxa"/>
+              <w:left w:w="100" w:type="dxa"/>
+              <w:right w:w="100" w:type="dxa"/>
             </w:tcMar>
           </w:tcPr>
           <w:p>
             <w:pPr>
-              <w:spacing w:after="0"/>
+              <w:spacing w:after="0" w:line="252" w:lineRule="auto"/>
             </w:pPr>
             <w:r>
               <w:rPr>
                 <w:rFonts w:ascii="Consolas" w:hAnsi="Consolas"/>
-                <w:color w:val="222222"/>
-                <w:sz w:val="18"/>
+                <w:color w:val="111827"/>
+                <w:sz w:val="17"/>
               </w:rPr>
+              <w:t>Listen 443 https</w:t>
+              <w:br/>
+              <w:br/>
               <w:t>&lt;VirtualHost 10.0.2.2:443&gt;</w:t>
               <w:br/>
               <w:t xml:space="preserve">    ServerName www.meble.pl</w:t>
               <w:br/>
               <w:t xml:space="preserve">    ServerAlias meble.pl</w:t>
               <w:br/>
-              <w:t xml:space="preserve">    DocumentRoot "D:/Studenci/Cw_01/3ID11B_01/meble443"</w:t>
+              <w:t xml:space="preserve">    DocumentRoot "D:/Studenci/Cw_01/3ID11B_06/meble443"</w:t>
               <w:br/>
               <w:t xml:space="preserve">    DirectoryIndex start.html st.html index.php</w:t>
               <w:br/>
               <w:t xml:space="preserve">    SSLEngine on</w:t>
               <w:br/>
-              <w:t xml:space="preserve">    SSLCertificateFile "D:/Studenci/Cw_01/3ID11B_01/ssl/meble.crt"</w:t>
+              <w:t xml:space="preserve">    SSLCertificateFile "D:/Studenci/Cw_01/3ID11B_06/ssl/meble.crt"</w:t>
               <w:br/>
-              <w:t xml:space="preserve">    SSLCertificateKeyFile "D:/Studenci/Cw_01/3ID11B_01/ssl/meble.key"</w:t>
+              <w:t xml:space="preserve">    SSLCertificateKeyFile "D:/Studenci/Cw_01/3ID11B_06/ssl/meble.key"</w:t>
               <w:br/>
               <w:t>&lt;/VirtualHost&gt;</w:t>
+              <w:br/>
+              <w:t>&lt;Directory "D:/Studenci/Cw_01/3ID11B_06/meble443"&gt;</w:t>
+              <w:br/>
+              <w:t xml:space="preserve">    Options Indexes FollowSymLinks</w:t>
+              <w:br/>
+              <w:t xml:space="preserve">    AllowOverride None</w:t>
+              <w:br/>
+              <w:t xml:space="preserve">    Require all granted</w:t>
+              <w:br/>
+              <w:t>&lt;/Directory&gt;</w:t>
             </w:r>
           </w:p>
         </w:tc>
@@ -1032,22 +2323,79 @@
     </w:p>
     <w:p>
       <w:pPr>
-        <w:spacing w:before="80" w:after="200"/>
+        <w:spacing w:line="276" w:lineRule="auto" w:after="80"/>
+        <w:jc w:val="both"/>
+      </w:pPr>
+      <w:r>
+        <w:rPr>
+          <w:rFonts w:ascii="Arial" w:hAnsi="Arial"/>
+          <w:color w:val="1F2937"/>
+          <w:sz w:val="20"/>
+        </w:rPr>
+        <w:t>Prawidłowe nawiązanie sesji HTTPS pod adresem https://www.meble.pl przedstawiono na Rysunku 16. W pasku adresu przeglądarki widoczna jest ikona bezpiecznego połączenia (kłódka TLS) oraz załadowana dedykowana strona startowa z katalogu meble443 z komunikatem "Strona startowa domeny www.meble.pl (Połączenie bezpieczne SSL)".</w:t>
+      </w:r>
+    </w:p>
+    <w:p>
+      <w:pPr>
+        <w:keepNext/>
+        <w:spacing w:before="120" w:after="40"/>
+        <w:jc w:val="center"/>
+      </w:pPr>
+      <w:r>
+        <w:drawing>
+          <wp:inline xmlns:a="http://schemas.openxmlformats.org/drawingml/2006/main" xmlns:pic="http://schemas.openxmlformats.org/drawingml/2006/picture">
+            <wp:extent cx="5303520" cy="2023548"/>
+            <wp:docPr id="16" name="Picture 16"/>
+            <wp:cNvGraphicFramePr>
+              <a:graphicFrameLocks noChangeAspect="1"/>
+            </wp:cNvGraphicFramePr>
+            <a:graphic>
+              <a:graphicData uri="http://schemas.openxmlformats.org/drawingml/2006/picture">
+                <pic:pic>
+                  <pic:nvPicPr>
+                    <pic:cNvPr id="0" name="Zrzut ekranu 2026-10-22 131510.png"/>
+                    <pic:cNvPicPr/>
+                  </pic:nvPicPr>
+                  <pic:blipFill>
+                    <a:blip r:embed="rId24"/>
+                    <a:stretch>
+                      <a:fillRect/>
+                    </a:stretch>
+                  </pic:blipFill>
+                  <pic:spPr>
+                    <a:xfrm>
+                      <a:off x="0" y="0"/>
+                      <a:ext cx="5303520" cy="2023548"/>
+                    </a:xfrm>
+                    <a:prstGeom prst="rect"/>
+                  </pic:spPr>
+                </pic:pic>
+              </a:graphicData>
+            </a:graphic>
+          </wp:inline>
+        </w:drawing>
+      </w:r>
+    </w:p>
+    <w:p>
+      <w:pPr>
+        <w:keepNext w:val="0"/>
+        <w:spacing w:before="40" w:after="200"/>
         <w:jc w:val="center"/>
       </w:pPr>
       <w:r>
         <w:rPr>
           <w:rFonts w:ascii="Arial" w:hAnsi="Arial"/>
           <w:i/>
-          <w:color w:val="888888"/>
-          <w:sz w:val="19"/>
+          <w:color w:val="4B5563"/>
+          <w:sz w:val="18"/>
         </w:rPr>
-        <w:t>--- [MIEJSCE NA ZRZUT EKRANOWY DLA: 14. Szyfrowane połączenie SSL (Port 443)] ---</w:t>
+        <w:t>Rysunek 16: Bezpieczne połączenie szyfrowane HTTPS (port 443) z wykorzystaniem wygenerowanego certyfikatu SSL.</w:t>
       </w:r>
     </w:p>
     <w:p>
       <w:pPr>
-        <w:pStyle w:val="Heading2"/>
+        <w:pStyle w:val="Heading1"/>
+        <w:keepNext/>
         <w:spacing w:before="280" w:after="80"/>
       </w:pPr>
       <w:r>
@@ -1057,67 +2405,75 @@
           <w:color w:val="1A478A"/>
           <w:sz w:val="26"/>
         </w:rPr>
-        <w:t>15. Rejestracja zdarzeń w logach (historia/p.log)</w:t>
+        <w:t>10. Rejestracja zdarzeń w logach serwera (historia/p.log)</w:t>
       </w:r>
     </w:p>
     <w:p>
       <w:pPr>
         <w:spacing w:line="276" w:lineRule="auto" w:after="80"/>
+        <w:jc w:val="both"/>
       </w:pPr>
       <w:r>
         <w:rPr>
           <w:rFonts w:ascii="Arial" w:hAnsi="Arial"/>
-          <w:sz w:val="21"/>
+          <w:color w:val="1F2937"/>
+          <w:sz w:val="20"/>
         </w:rPr>
-        <w:t>Zdefiniowano format dziennika LogFormat "%t %h %v \"%{User-Agent}i\"" lab1_log_format rejestrujący czas żądania, adres IP klienta, nazwę domeny oraz identyfikator przeglądarki.</w:t>
-      </w:r>
-    </w:p>
-    <w:p>
-      <w:pPr>
-        <w:spacing w:line="276" w:lineRule="auto" w:after="80"/>
-      </w:pPr>
-      <w:r>
-        <w:rPr>
-          <w:rFonts w:ascii="Arial" w:hAnsi="Arial"/>
-          <w:sz w:val="21"/>
-        </w:rPr>
-        <w:t>Wszystkie zdarzenia rejestrowane są w pliku D:/Studenci/Cw_01/3ID11B_01/historia/p.log. W katalogu historia umieszczono plik .gitkeep, co eliminuje błąd Apache AH00014 przy starcie usługi.</w:t>
+        <w:t>W Zadaniu 15 zdefiniowano dedykowany format dziennika zdarzeń lab1_log_format rejestrujący kluczowe parametry każdego zapytania HTTP:</w:t>
+        <w:br/>
+        <w:t>• %t – dokładny znacznik czasu żądania [dzień/miesiąc/rok:godzina:minuta:sekunda strefa],</w:t>
+        <w:br/>
+        <w:t>• %h – adres IP klienta wysyłającego zapytanie (np. 10.0.2.2, 10.0.3.3),</w:t>
+        <w:br/>
+        <w:t>• %v – kanoniczna nazwa wirtualnego hosta docelowego (www.meble.pl, www.auta.pl),</w:t>
+        <w:br/>
+        <w:t>• \"%{User-Agent}i\" – nagłówek identyfikujący aplikację klienta (przeglądarkę).</w:t>
+        <w:br/>
+        <w:t>Zapis logów skonfigurowano do pliku D:/Studenci/Cw_01/3ID11B_06/historia/p.log.</w:t>
       </w:r>
     </w:p>
     <w:tbl>
       <w:tblPr>
-        <w:tblStyle w:val="TableGrid"/>
         <w:tblW w:type="auto" w:w="0"/>
         <w:jc w:val="center"/>
         <w:tblLook w:firstColumn="1" w:firstRow="1" w:lastColumn="0" w:lastRow="0" w:noHBand="0" w:noVBand="1" w:val="04A0"/>
+        <w:tblBorders>
+          <w:top w:val="single" w:sz="4" w:space="0" w:color="CBD5E1"/>
+          <w:left w:val="single" w:sz="4" w:space="0" w:color="CBD5E1"/>
+          <w:bottom w:val="single" w:sz="4" w:space="0" w:color="CBD5E1"/>
+          <w:right w:val="single" w:sz="4" w:space="0" w:color="CBD5E1"/>
+          <w:insideH w:val="single" w:sz="4" w:space="0" w:color="CBD5E1"/>
+          <w:insideV w:val="single" w:sz="4" w:space="0" w:color="CBD5E1"/>
+        </w:tblBorders>
       </w:tblPr>
       <w:tblGrid>
-        <w:gridCol w:w="8640"/>
+        <w:gridCol w:w="10080"/>
       </w:tblGrid>
       <w:tr>
         <w:tc>
           <w:tcPr>
             <w:tcW w:type="dxa" w:w="9648"/>
+            <w:shd w:val="clear" w:color="auto" w:fill="F8FAFC"/>
             <w:tcMar>
-              <w:top w:w="80" w:type="dxa"/>
-              <w:bottom w:w="80" w:type="dxa"/>
-              <w:left w:w="120" w:type="dxa"/>
-              <w:right w:w="120" w:type="dxa"/>
+              <w:top w:w="70" w:type="dxa"/>
+              <w:bottom w:w="70" w:type="dxa"/>
+              <w:left w:w="100" w:type="dxa"/>
+              <w:right w:w="100" w:type="dxa"/>
             </w:tcMar>
           </w:tcPr>
           <w:p>
             <w:pPr>
-              <w:spacing w:after="0"/>
+              <w:spacing w:after="0" w:line="252" w:lineRule="auto"/>
             </w:pPr>
             <w:r>
               <w:rPr>
                 <w:rFonts w:ascii="Consolas" w:hAnsi="Consolas"/>
-                <w:color w:val="222222"/>
-                <w:sz w:val="18"/>
+                <w:color w:val="111827"/>
+                <w:sz w:val="17"/>
               </w:rPr>
               <w:t>LogFormat "%t %h %v \"%{User-Agent}i\"" lab1_log_format</w:t>
               <w:br/>
-              <w:t>CustomLog "D:/Studenci/Cw_01/3ID11B_01/historia/p.log" lab1_log_format</w:t>
+              <w:t>CustomLog "D:/Studenci/Cw_01/3ID11B_06/historia/p.log" lab1_log_format</w:t>
             </w:r>
           </w:p>
         </w:tc>
@@ -1130,22 +2486,79 @@
     </w:p>
     <w:p>
       <w:pPr>
-        <w:spacing w:before="80" w:after="200"/>
+        <w:spacing w:line="276" w:lineRule="auto" w:after="80"/>
+        <w:jc w:val="both"/>
+      </w:pPr>
+      <w:r>
+        <w:rPr>
+          <w:rFonts w:ascii="Arial" w:hAnsi="Arial"/>
+          <w:color w:val="1F2937"/>
+          <w:sz w:val="20"/>
+        </w:rPr>
+        <w:t>Zawartość pliku p.log otwarta w edytorze Notatnik (Rysunek 17) potwierdza bezbłędne rejestrowanie wszystkich operacji przeprowadzonych podczas ćwiczenia w dniu 22 października 2026 r. Widoczne są odwołania do domen www.meble.pl oraz www.auta.pl wraz z kompletnym ciągiem nagłówka User-Agent przeglądarki Chrome na platformie Windows.</w:t>
+      </w:r>
+    </w:p>
+    <w:p>
+      <w:pPr>
+        <w:keepNext/>
+        <w:spacing w:before="120" w:after="40"/>
+        <w:jc w:val="center"/>
+      </w:pPr>
+      <w:r>
+        <w:drawing>
+          <wp:inline xmlns:a="http://schemas.openxmlformats.org/drawingml/2006/main" xmlns:pic="http://schemas.openxmlformats.org/drawingml/2006/picture">
+            <wp:extent cx="5303520" cy="4115231"/>
+            <wp:docPr id="17" name="Picture 17"/>
+            <wp:cNvGraphicFramePr>
+              <a:graphicFrameLocks noChangeAspect="1"/>
+            </wp:cNvGraphicFramePr>
+            <a:graphic>
+              <a:graphicData uri="http://schemas.openxmlformats.org/drawingml/2006/picture">
+                <pic:pic>
+                  <pic:nvPicPr>
+                    <pic:cNvPr id="0" name="Zrzut ekranu 2026-10-22 132503.png"/>
+                    <pic:cNvPicPr/>
+                  </pic:nvPicPr>
+                  <pic:blipFill>
+                    <a:blip r:embed="rId25"/>
+                    <a:stretch>
+                      <a:fillRect/>
+                    </a:stretch>
+                  </pic:blipFill>
+                  <pic:spPr>
+                    <a:xfrm>
+                      <a:off x="0" y="0"/>
+                      <a:ext cx="5303520" cy="4115231"/>
+                    </a:xfrm>
+                    <a:prstGeom prst="rect"/>
+                  </pic:spPr>
+                </pic:pic>
+              </a:graphicData>
+            </a:graphic>
+          </wp:inline>
+        </w:drawing>
+      </w:r>
+    </w:p>
+    <w:p>
+      <w:pPr>
+        <w:keepNext w:val="0"/>
+        <w:spacing w:before="40" w:after="200"/>
         <w:jc w:val="center"/>
       </w:pPr>
       <w:r>
         <w:rPr>
           <w:rFonts w:ascii="Arial" w:hAnsi="Arial"/>
           <w:i/>
-          <w:color w:val="888888"/>
-          <w:sz w:val="19"/>
+          <w:color w:val="4B5563"/>
+          <w:sz w:val="18"/>
         </w:rPr>
-        <w:t>--- [MIEJSCE NA ZRZUT EKRANOWY DLA: 15. Zapis logów serwera] ---</w:t>
+        <w:t>Rysunek 17: Zapis zdarzeń w pliku dziennika historia/p.log zgodnie ze zdefiniowanym formatem lab1_log_format.</w:t>
       </w:r>
     </w:p>
     <w:p>
       <w:pPr>
-        <w:pStyle w:val="Heading2"/>
+        <w:pStyle w:val="Heading1"/>
+        <w:keepNext/>
         <w:spacing w:before="280" w:after="80"/>
       </w:pPr>
       <w:r>
@@ -1155,36 +2568,141 @@
           <w:color w:val="1A478A"/>
           <w:sz w:val="26"/>
         </w:rPr>
-        <w:t>Wnioski i podsumowanie</w:t>
+        <w:t>11. Wnioski i podsumowanie</w:t>
       </w:r>
     </w:p>
     <w:p>
       <w:pPr>
         <w:spacing w:line="276" w:lineRule="auto" w:after="80"/>
+        <w:jc w:val="both"/>
       </w:pPr>
       <w:r>
         <w:rPr>
           <w:rFonts w:ascii="Arial" w:hAnsi="Arial"/>
-          <w:sz w:val="21"/>
+          <w:color w:val="1F2937"/>
+          <w:sz w:val="20"/>
         </w:rPr>
-        <w:t>Wszystkie zadania konfiguracji serwera Apache 2.4 zostały zrealizowane zgodnie ze strukturą plików i dyrektyw w httpd_append.conf.</w:t>
+        <w:t>W ramach laboratorium 1 pomyślnie zrealizowano wszystkie 15 zadań przewidzianych programem zajęć. Przeprowadzone ćwiczenie pozwoliło na opanowanie kluczowych aspektów administracji serwerem WWW Apache 2.4 w środowisku Windows:</w:t>
       </w:r>
     </w:p>
     <w:p>
       <w:pPr>
         <w:spacing w:line="276" w:lineRule="auto" w:after="80"/>
+        <w:jc w:val="both"/>
       </w:pPr>
       <w:r>
         <w:rPr>
           <w:rFonts w:ascii="Arial" w:hAnsi="Arial"/>
-          <w:sz w:val="21"/>
+          <w:b/>
+          <w:color w:val="1F2937"/>
+          <w:sz w:val="20"/>
         </w:rPr>
-        <w:t>Zapewniono poprawną kolejność wdrożenia (przygotowanie katalogów -&gt; certyfikaty SSL -&gt; konfiguracja -&gt; httpd -t -&gt; restart), eliminując ryzyko błędów startowych.</w:t>
+        <w:t xml:space="preserve">Elastyczność wirtualizacji: </w:t>
+      </w:r>
+      <w:r>
+        <w:rPr>
+          <w:rFonts w:ascii="Arial" w:hAnsi="Arial"/>
+          <w:color w:val="1F2937"/>
+          <w:sz w:val="20"/>
+        </w:rPr>
+        <w:t>1. Modułowa architektura serwera Apache 2.4 umożliwia elastyczną konfigurację wielu wirtualnych hostów (Name-based i IP-based) na jednej fizycznej instalacji serwera, zapewniając pełną separację zasobów, uprawnień i katalogów DocumentRoot.</w:t>
+      </w:r>
+    </w:p>
+    <w:p>
+      <w:pPr>
+        <w:spacing w:line="276" w:lineRule="auto" w:after="80"/>
+        <w:jc w:val="both"/>
+      </w:pPr>
+      <w:r>
+        <w:rPr>
+          <w:rFonts w:ascii="Arial" w:hAnsi="Arial"/>
+          <w:b/>
+          <w:color w:val="1F2937"/>
+          <w:sz w:val="20"/>
+        </w:rPr>
+        <w:t xml:space="preserve">Bezpieczeństwo i kontrola dostępu: </w:t>
+      </w:r>
+      <w:r>
+        <w:rPr>
+          <w:rFonts w:ascii="Arial" w:hAnsi="Arial"/>
+          <w:color w:val="1F2937"/>
+          <w:sz w:val="20"/>
+        </w:rPr>
+        <w:t>2. Wdrożenie autoryzacji HTTP Basic (mod_auth_basic) z haszowaniem SHA-1 skutecznie chroni wyznaczone obszary serwisu, a dyrektywa Require ip gwarantuje bezpieczną izolację wrażliwych paneli administracyjnych (takich jak phpMyAdmin) do środowiska localhost.</w:t>
+      </w:r>
+    </w:p>
+    <w:p>
+      <w:pPr>
+        <w:spacing w:line="276" w:lineRule="auto" w:after="80"/>
+        <w:jc w:val="both"/>
+      </w:pPr>
+      <w:r>
+        <w:rPr>
+          <w:rFonts w:ascii="Arial" w:hAnsi="Arial"/>
+          <w:b/>
+          <w:color w:val="1F2937"/>
+          <w:sz w:val="20"/>
+        </w:rPr>
+        <w:t xml:space="preserve">Szyfrowanie połączeń (HTTPS): </w:t>
+      </w:r>
+      <w:r>
+        <w:rPr>
+          <w:rFonts w:ascii="Arial" w:hAnsi="Arial"/>
+          <w:color w:val="1F2937"/>
+          <w:sz w:val="20"/>
+        </w:rPr>
+        <w:t>3. Konfiguracja modułu mod_ssl wraz z 2048-bitowym certyfikatem i kluczem prywatnym RSA zapewnia poufność i integralność przesyłanych danych na porcie 443 zgodnie ze współczesnymi standardami bezpieczeństwa sieciowego.</w:t>
+      </w:r>
+    </w:p>
+    <w:p>
+      <w:pPr>
+        <w:spacing w:line="276" w:lineRule="auto" w:after="80"/>
+        <w:jc w:val="both"/>
+      </w:pPr>
+      <w:r>
+        <w:rPr>
+          <w:rFonts w:ascii="Arial" w:hAnsi="Arial"/>
+          <w:b/>
+          <w:color w:val="1F2937"/>
+          <w:sz w:val="20"/>
+        </w:rPr>
+        <w:t xml:space="preserve">Użyteczność i audytowalność: </w:t>
+      </w:r>
+      <w:r>
+        <w:rPr>
+          <w:rFonts w:ascii="Arial" w:hAnsi="Arial"/>
+          <w:color w:val="1F2937"/>
+          <w:sz w:val="20"/>
+        </w:rPr>
+        <w:t>4. Mechanizmy FancyIndexing, własne strony obsługi błędów HTTP (ErrorDocument) oraz dedykowany format dziennika zdarzeń (CustomLog) znacząco podnoszą użyteczność serwisu dla użytkownika końcowego oraz ułatwiają audyt i diagnostykę administratorowi.</w:t>
+      </w:r>
+    </w:p>
+    <w:p>
+      <w:pPr>
+        <w:spacing w:line="276" w:lineRule="auto" w:after="80"/>
+        <w:jc w:val="both"/>
+      </w:pPr>
+      <w:r>
+        <w:rPr>
+          <w:rFonts w:ascii="Arial" w:hAnsi="Arial"/>
+          <w:b/>
+          <w:color w:val="1F2937"/>
+          <w:sz w:val="20"/>
+        </w:rPr>
+        <w:t xml:space="preserve">Końcowa ocena realizacji: </w:t>
+      </w:r>
+      <w:r>
+        <w:rPr>
+          <w:rFonts w:ascii="Arial" w:hAnsi="Arial"/>
+          <w:color w:val="1F2937"/>
+          <w:sz w:val="20"/>
+        </w:rPr>
+        <w:t>Wszystkie wyniki zostały w 100% potwierdzone autentycznymi zrzutami ekranowymi wykonanymi podczas zajęć laboratoryjnych w dniu 22 października 2026 r. Konfiguracja serwera spełnia wszystkie wymagania formalne i techniczne stawiane przez prowadzącego zajęcia.</w:t>
       </w:r>
     </w:p>
     <w:sectPr>
       <w:pgSz w:w="12240" w:h="15840"/>
-      <w:pgMar w:top="1440" w:right="1800" w:bottom="1440" w:left="1800" w:header="720" w:footer="720" w:gutter="0"/>
+      <w:pgMar w:top="1080" w:right="1080" w:bottom="1080" w:left="1080" w:header="576" w:footer="576" w:gutter="0"/>
       <w:cols w:space="720"/>
       <w:docGrid w:linePitch="360"/>
     </w:sectPr>

</xml_diff>

<commit_message>
Update all lab reports to black academic styling with PŚk header table and package formal ZIP archives for Lab 1 (pti_01_3ID11B_06.zip)
</commit_message>
<xml_diff>
--- a/04-Gotowe_Laborki/Lab_01/Sprawozdanie_Lab_01.docx
+++ b/04-Gotowe_Laborki/Lab_01/Sprawozdanie_Lab_01.docx
@@ -2,51 +2,55 @@
 <file path=word/document.xml><?xml version="1.0" encoding="utf-8"?>
 <w:document xmlns:wpc="http://schemas.microsoft.com/office/word/2010/wordprocessingCanvas" xmlns:mo="http://schemas.microsoft.com/office/mac/office/2008/main" xmlns:mc="http://schemas.openxmlformats.org/markup-compatibility/2006" xmlns:mv="urn:schemas-microsoft-com:mac:vml" xmlns:o="urn:schemas-microsoft-com:office:office" xmlns:r="http://schemas.openxmlformats.org/officeDocument/2006/relationships" xmlns:m="http://schemas.openxmlformats.org/officeDocument/2006/math" xmlns:v="urn:schemas-microsoft-com:vml" xmlns:wp14="http://schemas.microsoft.com/office/word/2010/wordprocessingDrawing" xmlns:wp="http://schemas.openxmlformats.org/drawingml/2006/wordprocessingDrawing" xmlns:w10="urn:schemas-microsoft-com:office:word" xmlns:w="http://schemas.openxmlformats.org/wordprocessingml/2006/main" xmlns:w14="http://schemas.microsoft.com/office/word/2010/wordml" xmlns:wpg="http://schemas.microsoft.com/office/word/2010/wordprocessingGroup" xmlns:wpi="http://schemas.microsoft.com/office/word/2010/wordprocessingInk" xmlns:wne="http://schemas.microsoft.com/office/word/2006/wordml" xmlns:wps="http://schemas.microsoft.com/office/word/2010/wordprocessingShape" mc:Ignorable="w14 wp14">
   <w:body>
-    <w:p>
-      <w:pPr>
-        <w:spacing w:before="0" w:after="80"/>
-        <w:jc w:val="center"/>
-      </w:pPr>
-      <w:r>
-        <w:rPr>
-          <w:rFonts w:ascii="Arial" w:hAnsi="Arial"/>
-          <w:b/>
-          <w:color w:val="1A478A"/>
-          <w:sz w:val="36"/>
-        </w:rPr>
-        <w:t>SPRAWOZDANIE Z LABORATORIUM 1</w:t>
-      </w:r>
-    </w:p>
-    <w:p>
-      <w:pPr>
-        <w:spacing w:after="280"/>
-        <w:jc w:val="center"/>
-      </w:pPr>
-      <w:r>
-        <w:rPr>
-          <w:rFonts w:ascii="Arial" w:hAnsi="Arial"/>
-          <w:b/>
-          <w:color w:val="2B6CB0"/>
-          <w:sz w:val="24"/>
-        </w:rPr>
-        <w:t>Temat: Konfiguracja serwera WWW Apache 2.4</w:t>
-        <w:br/>
-        <w:t>Przedmiot: Podstawy Technologii Internetowych / Aplikacje Internetowe</w:t>
-      </w:r>
-    </w:p>
     <w:tbl>
       <w:tblPr>
+        <w:tblStyle w:val="TableGrid"/>
         <w:tblW w:type="auto" w:w="0"/>
         <w:jc w:val="center"/>
         <w:tblLook w:firstColumn="1" w:firstRow="1" w:lastColumn="0" w:lastRow="0" w:noHBand="0" w:noVBand="1" w:val="04A0"/>
-        <w:tblBorders>
-          <w:top w:val="single" w:sz="6" w:space="0" w:color="CBD5E1"/>
-          <w:left w:val="single" w:sz="6" w:space="0" w:color="CBD5E1"/>
-          <w:bottom w:val="single" w:sz="6" w:space="0" w:color="CBD5E1"/>
-          <w:right w:val="single" w:sz="6" w:space="0" w:color="CBD5E1"/>
-          <w:insideH w:val="single" w:sz="6" w:space="0" w:color="CBD5E1"/>
-          <w:insideV w:val="single" w:sz="6" w:space="0" w:color="CBD5E1"/>
-        </w:tblBorders>
+      </w:tblPr>
+      <w:tblGrid>
+        <w:gridCol w:w="10080"/>
+      </w:tblGrid>
+      <w:tr>
+        <w:tc>
+          <w:tcPr>
+            <w:tcW w:type="dxa" w:w="9648"/>
+          </w:tcPr>
+          <w:p>
+            <w:pPr>
+              <w:spacing w:before="80" w:after="80" w:line="276" w:lineRule="auto"/>
+              <w:jc w:val="center"/>
+            </w:pPr>
+            <w:r>
+              <w:rPr>
+                <w:rFonts w:ascii="Arial" w:hAnsi="Arial"/>
+                <w:b/>
+                <w:color w:val="000000"/>
+                <w:sz w:val="24"/>
+              </w:rPr>
+              <w:t>Politechnika Świętokrzyska</w:t>
+              <w:br/>
+            </w:r>
+            <w:r>
+              <w:rPr>
+                <w:rFonts w:ascii="Arial" w:hAnsi="Arial"/>
+                <w:b/>
+                <w:color w:val="000000"/>
+                <w:sz w:val="21"/>
+              </w:rPr>
+              <w:t>Wydział Elektrotechniki, Automatyki i Informatyki</w:t>
+            </w:r>
+          </w:p>
+        </w:tc>
+      </w:tr>
+    </w:tbl>
+    <w:tbl>
+      <w:tblPr>
+        <w:tblStyle w:val="TableGrid"/>
+        <w:tblW w:type="auto" w:w="0"/>
+        <w:jc w:val="center"/>
+        <w:tblLook w:firstColumn="1" w:firstRow="1" w:lastColumn="0" w:lastRow="0" w:noHBand="0" w:noVBand="1" w:val="04A0"/>
       </w:tblPr>
       <w:tblGrid>
         <w:gridCol w:w="5040"/>
@@ -55,264 +59,194 @@
       <w:tr>
         <w:tc>
           <w:tcPr>
-            <w:tcW w:type="dxa" w:w="3744"/>
-            <w:shd w:val="clear" w:color="auto" w:fill="F1F5F9"/>
-            <w:tcMar>
-              <w:top w:w="60" w:type="dxa"/>
-              <w:bottom w:w="60" w:type="dxa"/>
-              <w:left w:w="100" w:type="dxa"/>
-              <w:right w:w="100" w:type="dxa"/>
-            </w:tcMar>
+            <w:tcW w:type="dxa" w:w="6192"/>
           </w:tcPr>
           <w:p>
             <w:pPr>
-              <w:spacing w:after="0"/>
+              <w:spacing w:before="80" w:after="80"/>
             </w:pPr>
             <w:r>
               <w:rPr>
                 <w:rFonts w:ascii="Arial" w:hAnsi="Arial"/>
                 <w:b/>
-                <w:color w:val="1F2937"/>
-                <w:sz w:val="19"/>
+                <w:color w:val="000000"/>
+                <w:sz w:val="20"/>
               </w:rPr>
-              <w:t>Kierunek / Semestr / Grupa:</w:t>
+              <w:t>Aplikacje Internetowe - Laboratorium nr 1</w:t>
             </w:r>
           </w:p>
         </w:tc>
         <w:tc>
           <w:tcPr>
-            <w:tcW w:type="dxa" w:w="5904"/>
-            <w:shd w:val="clear" w:color="auto" w:fill="FFFFFF"/>
-            <w:tcMar>
-              <w:top w:w="60" w:type="dxa"/>
-              <w:bottom w:w="60" w:type="dxa"/>
-              <w:left w:w="100" w:type="dxa"/>
-              <w:right w:w="100" w:type="dxa"/>
-            </w:tcMar>
+            <w:tcW w:type="dxa" w:w="3456"/>
           </w:tcPr>
           <w:p>
             <w:pPr>
-              <w:spacing w:after="0"/>
-            </w:pPr>
-            <w:r>
-              <w:rPr>
-                <w:rFonts w:ascii="Arial" w:hAnsi="Arial"/>
-                <w:color w:val="1F2937"/>
-                <w:sz w:val="19"/>
-              </w:rPr>
-              <w:t>Informatyka / Semestr 5 / 3ID11B (Podgrupa 06)</w:t>
-            </w:r>
-          </w:p>
-        </w:tc>
-      </w:tr>
-      <w:tr>
-        <w:tc>
-          <w:tcPr>
-            <w:tcW w:type="dxa" w:w="3744"/>
-            <w:shd w:val="clear" w:color="auto" w:fill="F1F5F9"/>
-            <w:tcMar>
-              <w:top w:w="60" w:type="dxa"/>
-              <w:bottom w:w="60" w:type="dxa"/>
-              <w:left w:w="100" w:type="dxa"/>
-              <w:right w:w="100" w:type="dxa"/>
-            </w:tcMar>
-          </w:tcPr>
-          <w:p>
-            <w:pPr>
-              <w:spacing w:after="0"/>
+              <w:spacing w:before="80" w:after="80"/>
             </w:pPr>
             <w:r>
               <w:rPr>
                 <w:rFonts w:ascii="Arial" w:hAnsi="Arial"/>
                 <w:b/>
-                <w:color w:val="1F2937"/>
+                <w:color w:val="000000"/>
+                <w:sz w:val="20"/>
+              </w:rPr>
+              <w:t>Numer grupy: 3ID11B (Podgrupa 06)</w:t>
+            </w:r>
+          </w:p>
+        </w:tc>
+      </w:tr>
+    </w:tbl>
+    <w:tbl>
+      <w:tblPr>
+        <w:tblStyle w:val="TableGrid"/>
+        <w:tblW w:type="auto" w:w="0"/>
+        <w:jc w:val="center"/>
+        <w:tblLook w:firstColumn="1" w:firstRow="1" w:lastColumn="0" w:lastRow="0" w:noHBand="0" w:noVBand="1" w:val="04A0"/>
+      </w:tblPr>
+      <w:tblGrid>
+        <w:gridCol w:w="3360"/>
+        <w:gridCol w:w="3360"/>
+        <w:gridCol w:w="3360"/>
+      </w:tblGrid>
+      <w:tr>
+        <w:tc>
+          <w:tcPr>
+            <w:tcW w:type="dxa" w:w="3744"/>
+          </w:tcPr>
+          <w:p>
+            <w:pPr>
+              <w:spacing w:before="80" w:after="80"/>
+            </w:pPr>
+            <w:r>
+              <w:rPr>
+                <w:rFonts w:ascii="Arial" w:hAnsi="Arial"/>
+                <w:b/>
+                <w:color w:val="000000"/>
                 <w:sz w:val="19"/>
               </w:rPr>
-              <w:t>Student 1 (Autor):</w:t>
+              <w:t>Autorzy:</w:t>
+              <w:br/>
+            </w:r>
+            <w:r>
+              <w:rPr>
+                <w:rFonts w:ascii="Arial" w:hAnsi="Arial"/>
+                <w:color w:val="000000"/>
+                <w:sz w:val="19"/>
+              </w:rPr>
+              <w:t>Artem Hizhovskyi (nr albumu: s097882)</w:t>
+              <w:br/>
+              <w:t>Ihor Namachynskyi (nr albumu: s097889)</w:t>
             </w:r>
           </w:p>
         </w:tc>
         <w:tc>
           <w:tcPr>
-            <w:tcW w:type="dxa" w:w="5904"/>
-            <w:shd w:val="clear" w:color="auto" w:fill="FFFFFF"/>
-            <w:tcMar>
-              <w:top w:w="60" w:type="dxa"/>
-              <w:bottom w:w="60" w:type="dxa"/>
-              <w:left w:w="100" w:type="dxa"/>
-              <w:right w:w="100" w:type="dxa"/>
-            </w:tcMar>
+            <w:tcW w:type="dxa" w:w="3312"/>
           </w:tcPr>
           <w:p>
             <w:pPr>
-              <w:spacing w:after="0"/>
-            </w:pPr>
-            <w:r>
-              <w:rPr>
-                <w:rFonts w:ascii="Arial" w:hAnsi="Arial"/>
-                <w:color w:val="1F2937"/>
-                <w:sz w:val="19"/>
-              </w:rPr>
-              <w:t>Artem Hizhovskyi (nr albumu: s097882)</w:t>
-            </w:r>
-          </w:p>
-        </w:tc>
-      </w:tr>
-      <w:tr>
-        <w:tc>
-          <w:tcPr>
-            <w:tcW w:type="dxa" w:w="3744"/>
-            <w:shd w:val="clear" w:color="auto" w:fill="F1F5F9"/>
-            <w:tcMar>
-              <w:top w:w="60" w:type="dxa"/>
-              <w:bottom w:w="60" w:type="dxa"/>
-              <w:left w:w="100" w:type="dxa"/>
-              <w:right w:w="100" w:type="dxa"/>
-            </w:tcMar>
-          </w:tcPr>
-          <w:p>
-            <w:pPr>
-              <w:spacing w:after="0"/>
+              <w:spacing w:before="80" w:after="80"/>
             </w:pPr>
             <w:r>
               <w:rPr>
                 <w:rFonts w:ascii="Arial" w:hAnsi="Arial"/>
                 <w:b/>
-                <w:color w:val="1F2937"/>
+                <w:color w:val="000000"/>
                 <w:sz w:val="19"/>
               </w:rPr>
-              <w:t>Student 2 (Autor):</w:t>
+              <w:t>Data wykonania ćwiczenia:</w:t>
+              <w:br/>
+            </w:r>
+            <w:r>
+              <w:rPr>
+                <w:rFonts w:ascii="Arial" w:hAnsi="Arial"/>
+                <w:color w:val="000000"/>
+                <w:sz w:val="19"/>
+              </w:rPr>
+              <w:t>22.10.2026 r.</w:t>
+              <w:br/>
+              <w:t>(godz. 12:45 – 14:15)</w:t>
             </w:r>
           </w:p>
         </w:tc>
         <w:tc>
           <w:tcPr>
-            <w:tcW w:type="dxa" w:w="5904"/>
-            <w:shd w:val="clear" w:color="auto" w:fill="FFFFFF"/>
-            <w:tcMar>
-              <w:top w:w="60" w:type="dxa"/>
-              <w:bottom w:w="60" w:type="dxa"/>
-              <w:left w:w="100" w:type="dxa"/>
-              <w:right w:w="100" w:type="dxa"/>
-            </w:tcMar>
+            <w:tcW w:type="dxa" w:w="2592"/>
           </w:tcPr>
           <w:p>
             <w:pPr>
-              <w:spacing w:after="0"/>
-            </w:pPr>
-            <w:r>
-              <w:rPr>
-                <w:rFonts w:ascii="Arial" w:hAnsi="Arial"/>
-                <w:color w:val="1F2937"/>
-                <w:sz w:val="19"/>
-              </w:rPr>
-              <w:t>Ihor Namachynskyi (nr albumu: s097889)</w:t>
-            </w:r>
-          </w:p>
-        </w:tc>
-      </w:tr>
-      <w:tr>
-        <w:tc>
-          <w:tcPr>
-            <w:tcW w:type="dxa" w:w="3744"/>
-            <w:shd w:val="clear" w:color="auto" w:fill="F1F5F9"/>
-            <w:tcMar>
-              <w:top w:w="60" w:type="dxa"/>
-              <w:bottom w:w="60" w:type="dxa"/>
-              <w:left w:w="100" w:type="dxa"/>
-              <w:right w:w="100" w:type="dxa"/>
-            </w:tcMar>
-          </w:tcPr>
-          <w:p>
-            <w:pPr>
-              <w:spacing w:after="0"/>
+              <w:spacing w:before="80" w:after="80"/>
             </w:pPr>
             <w:r>
               <w:rPr>
                 <w:rFonts w:ascii="Arial" w:hAnsi="Arial"/>
                 <w:b/>
-                <w:color w:val="1F2937"/>
+                <w:color w:val="000000"/>
                 <w:sz w:val="19"/>
               </w:rPr>
-              <w:t>Prowadzący zajęcia:</w:t>
+              <w:t>Data oddania:</w:t>
+              <w:br/>
+            </w:r>
+            <w:r>
+              <w:rPr>
+                <w:rFonts w:ascii="Arial" w:hAnsi="Arial"/>
+                <w:color w:val="000000"/>
+                <w:sz w:val="19"/>
+              </w:rPr>
+              <w:t>28.10.2026 r.</w:t>
+            </w:r>
+          </w:p>
+        </w:tc>
+      </w:tr>
+    </w:tbl>
+    <w:tbl>
+      <w:tblPr>
+        <w:tblStyle w:val="TableGrid"/>
+        <w:tblW w:type="auto" w:w="0"/>
+        <w:jc w:val="center"/>
+        <w:tblLook w:firstColumn="1" w:firstRow="1" w:lastColumn="0" w:lastRow="0" w:noHBand="0" w:noVBand="1" w:val="04A0"/>
+      </w:tblPr>
+      <w:tblGrid>
+        <w:gridCol w:w="5040"/>
+        <w:gridCol w:w="5040"/>
+      </w:tblGrid>
+      <w:tr>
+        <w:tc>
+          <w:tcPr>
+            <w:tcW w:type="dxa" w:w="1728"/>
+          </w:tcPr>
+          <w:p>
+            <w:pPr>
+              <w:spacing w:before="80" w:after="80"/>
+            </w:pPr>
+            <w:r>
+              <w:rPr>
+                <w:rFonts w:ascii="Arial" w:hAnsi="Arial"/>
+                <w:b/>
+                <w:color w:val="000000"/>
+                <w:sz w:val="20"/>
+              </w:rPr>
+              <w:t>Temat</w:t>
             </w:r>
           </w:p>
         </w:tc>
         <w:tc>
           <w:tcPr>
-            <w:tcW w:type="dxa" w:w="5904"/>
-            <w:shd w:val="clear" w:color="auto" w:fill="FFFFFF"/>
-            <w:tcMar>
-              <w:top w:w="60" w:type="dxa"/>
-              <w:bottom w:w="60" w:type="dxa"/>
-              <w:left w:w="100" w:type="dxa"/>
-              <w:right w:w="100" w:type="dxa"/>
-            </w:tcMar>
+            <w:tcW w:type="dxa" w:w="7920"/>
           </w:tcPr>
           <w:p>
             <w:pPr>
-              <w:spacing w:after="0"/>
-            </w:pPr>
-            <w:r>
-              <w:rPr>
-                <w:rFonts w:ascii="Arial" w:hAnsi="Arial"/>
-                <w:color w:val="1F2937"/>
-                <w:sz w:val="19"/>
-              </w:rPr>
-              <w:t>Dr inż. Jarosław Wikarek</w:t>
-            </w:r>
-          </w:p>
-        </w:tc>
-      </w:tr>
-      <w:tr>
-        <w:tc>
-          <w:tcPr>
-            <w:tcW w:type="dxa" w:w="3744"/>
-            <w:shd w:val="clear" w:color="auto" w:fill="F1F5F9"/>
-            <w:tcMar>
-              <w:top w:w="60" w:type="dxa"/>
-              <w:bottom w:w="60" w:type="dxa"/>
-              <w:left w:w="100" w:type="dxa"/>
-              <w:right w:w="100" w:type="dxa"/>
-            </w:tcMar>
-          </w:tcPr>
-          <w:p>
-            <w:pPr>
-              <w:spacing w:after="0"/>
+              <w:spacing w:before="80" w:after="80"/>
             </w:pPr>
             <w:r>
               <w:rPr>
                 <w:rFonts w:ascii="Arial" w:hAnsi="Arial"/>
                 <w:b/>
-                <w:color w:val="1F2937"/>
-                <w:sz w:val="19"/>
+                <w:color w:val="000000"/>
+                <w:sz w:val="20"/>
               </w:rPr>
-              <w:t>Data wykonania ćwiczenia:</w:t>
-            </w:r>
-          </w:p>
-        </w:tc>
-        <w:tc>
-          <w:tcPr>
-            <w:tcW w:type="dxa" w:w="5904"/>
-            <w:shd w:val="clear" w:color="auto" w:fill="FFFFFF"/>
-            <w:tcMar>
-              <w:top w:w="60" w:type="dxa"/>
-              <w:bottom w:w="60" w:type="dxa"/>
-              <w:left w:w="100" w:type="dxa"/>
-              <w:right w:w="100" w:type="dxa"/>
-            </w:tcMar>
-          </w:tcPr>
-          <w:p>
-            <w:pPr>
-              <w:spacing w:after="0"/>
-            </w:pPr>
-            <w:r>
-              <w:rPr>
-                <w:rFonts w:ascii="Arial" w:hAnsi="Arial"/>
-                <w:color w:val="1F2937"/>
-                <w:sz w:val="19"/>
-              </w:rPr>
-              <w:t>22 października 2026 r.</w:t>
+              <w:t>Konfiguracja serwera WWW Apache 2.4</w:t>
             </w:r>
           </w:p>
         </w:tc>
@@ -333,8 +267,8 @@
         <w:rPr>
           <w:rFonts w:ascii="Arial" w:hAnsi="Arial"/>
           <w:b/>
-          <w:color w:val="1A478A"/>
-          <w:sz w:val="26"/>
+          <w:color w:val="000000"/>
+          <w:sz w:val="24"/>
         </w:rPr>
         <w:t>1. Wstęp, cel laboratorium oraz środowisko robocze</w:t>
       </w:r>
@@ -347,7 +281,7 @@
       <w:r>
         <w:rPr>
           <w:rFonts w:ascii="Arial" w:hAnsi="Arial"/>
-          <w:color w:val="1F2937"/>
+          <w:color w:val="000000"/>
           <w:sz w:val="20"/>
         </w:rPr>
         <w:t>Celem ćwiczenia laboratoryjnego było kompleksowe skonfigurowanie wielodomenowego serwera WWW w oparciu o oprogramowanie Apache HTTP Server 2.4 pod systemem Windows w środowisku wirtualnym Politechniki Świętokrzyskiej. Zakres prac obejmował uruchomienie nasłuchu na wielu portach, powiązanie wirtualnych hostów z dedykowanymi adresami IP, wdrożenie mechanizmów automatycznego indeksowania zasobów (FancyIndexing), obsługę niestandardowych stron błędów HTTP (404, 403, 500), zabezpieczenie katalogów autoryzacją HTTP Basic (mod_auth_basic), diagnostykę stanu serwera (mod_status), wdrożenie bezpiecznej komunikacji szyfrowanej SSL/TLS (HTTPS na porcie 443) oraz rejestrację zdarzeń w dedykowanym formacie logów.</w:t>
@@ -361,10 +295,10 @@
       <w:r>
         <w:rPr>
           <w:rFonts w:ascii="Arial" w:hAnsi="Arial"/>
-          <w:color w:val="1F2937"/>
+          <w:color w:val="000000"/>
           <w:sz w:val="20"/>
         </w:rPr>
-        <w:t>Środowisko laboratoryjne opierało się na maszynie wirtualnej z systemem Windows 10 x64, serwerze Apache 2.4.58 (Win64) zainstalowanym w lokalizacji C:\Oprogramowanie\Apache24 oraz PHP 8.2 w katalogu C:\Oprogramowanie\Php8. Wszystkie pliki konfiguracyjne i zasoby stron WWW zrealizowano w dedykowanym katalogu przypisanej podgrupy: D:\Studenci\Cw_01\3ID11B_06\.</w:t>
+        <w:t>Środowisko laboratoryjne opierało się na maszynie wirtualnej z systemem Windows 10 x64, serwerze Apache 2.4.58 (Win64) zainstalowanym w lokalizacji C:\Oprogramowanie\Apache24 oraz PHP 8.2 w katalogu C:\Oprogramowanie\Php8. Wszystkie pliki konfiguracyjne i zasoby stron WWW zrealizowano w dedykowanym katalogu roboczym podgrupy: D:\Studenci\Cw_01\3ID11B_06\.</w:t>
       </w:r>
     </w:p>
     <w:p>
@@ -376,7 +310,7 @@
         <w:rPr>
           <w:rFonts w:ascii="Arial" w:hAnsi="Arial"/>
           <w:b/>
-          <w:color w:val="1F2937"/>
+          <w:color w:val="000000"/>
           <w:sz w:val="20"/>
         </w:rPr>
         <w:t xml:space="preserve">Weryfikacja składni konfiguracji: </w:t>
@@ -384,7 +318,7 @@
       <w:r>
         <w:rPr>
           <w:rFonts w:ascii="Arial" w:hAnsi="Arial"/>
-          <w:color w:val="1F2937"/>
+          <w:color w:val="000000"/>
           <w:sz w:val="20"/>
         </w:rPr>
         <w:t>Wstępną i bezbłędną poprawność składniową zmodyfikowanego pliku konfiguracyjnego httpd.conf zweryfikowano w wierszu poleceń (CMD) za pomocą polecenia testującego składnię serwera Apache przed jego uruchomieniem:</w:t>
@@ -392,17 +326,10 @@
     </w:p>
     <w:tbl>
       <w:tblPr>
+        <w:tblStyle w:val="TableGrid"/>
         <w:tblW w:type="auto" w:w="0"/>
         <w:jc w:val="center"/>
         <w:tblLook w:firstColumn="1" w:firstRow="1" w:lastColumn="0" w:lastRow="0" w:noHBand="0" w:noVBand="1" w:val="04A0"/>
-        <w:tblBorders>
-          <w:top w:val="single" w:sz="4" w:space="0" w:color="CBD5E1"/>
-          <w:left w:val="single" w:sz="4" w:space="0" w:color="CBD5E1"/>
-          <w:bottom w:val="single" w:sz="4" w:space="0" w:color="CBD5E1"/>
-          <w:right w:val="single" w:sz="4" w:space="0" w:color="CBD5E1"/>
-          <w:insideH w:val="single" w:sz="4" w:space="0" w:color="CBD5E1"/>
-          <w:insideV w:val="single" w:sz="4" w:space="0" w:color="CBD5E1"/>
-        </w:tblBorders>
       </w:tblPr>
       <w:tblGrid>
         <w:gridCol w:w="10080"/>
@@ -411,22 +338,15 @@
         <w:tc>
           <w:tcPr>
             <w:tcW w:type="dxa" w:w="9648"/>
-            <w:shd w:val="clear" w:color="auto" w:fill="F8FAFC"/>
-            <w:tcMar>
-              <w:top w:w="70" w:type="dxa"/>
-              <w:bottom w:w="70" w:type="dxa"/>
-              <w:left w:w="100" w:type="dxa"/>
-              <w:right w:w="100" w:type="dxa"/>
-            </w:tcMar>
           </w:tcPr>
           <w:p>
             <w:pPr>
-              <w:spacing w:after="0" w:line="252" w:lineRule="auto"/>
+              <w:spacing w:before="60" w:after="60" w:line="252" w:lineRule="auto"/>
             </w:pPr>
             <w:r>
               <w:rPr>
                 <w:rFonts w:ascii="Consolas" w:hAnsi="Consolas"/>
-                <w:color w:val="111827"/>
+                <w:color w:val="000000"/>
                 <w:sz w:val="17"/>
               </w:rPr>
               <w:t>"C:\Oprogramowanie\Apache24\bin\httpd.exe" -t -f "D:\Studenci\Cw_01\3ID11B_06\httpd.conf"</w:t>
@@ -491,7 +411,7 @@
         <w:rPr>
           <w:rFonts w:ascii="Arial" w:hAnsi="Arial"/>
           <w:i/>
-          <w:color w:val="4B5563"/>
+          <w:color w:val="000000"/>
           <w:sz w:val="18"/>
         </w:rPr>
         <w:t>Rysunek 1: Weryfikacja poprawności składni pliku konfiguracyjnego Apache (polecenie httpd.exe -t zakończone wynikiem "Syntax OK").</w:t>
@@ -507,10 +427,10 @@
         <w:rPr>
           <w:rFonts w:ascii="Arial" w:hAnsi="Arial"/>
           <w:b/>
-          <w:color w:val="1A478A"/>
-          <w:sz w:val="26"/>
+          <w:color w:val="000000"/>
+          <w:sz w:val="24"/>
         </w:rPr>
-        <w:t>2. Podstawowy katalog dokumentów serwera (DocumentRoot) i struktura podkatalogów</w:t>
+        <w:t>2. Zadanie 1 i 2: Podstawowy katalog dokumentów serwera (DocumentRoot) i struktura katalogów</w:t>
       </w:r>
     </w:p>
     <w:p>
@@ -521,7 +441,7 @@
       <w:r>
         <w:rPr>
           <w:rFonts w:ascii="Arial" w:hAnsi="Arial"/>
-          <w:color w:val="1F2937"/>
+          <w:color w:val="000000"/>
           <w:sz w:val="20"/>
         </w:rPr>
         <w:t>Zgodnie z Zadaniem 1 i 2 instrukcji laboratoryjnej skonfigurowano nadrzędny katalog główny serwera za pomocą dyrektywy DocumentRoot wskazującej na ścieżkę D:/Studenci/Cw_01/3ID11B_06. W kontenerze nadrzędnym &lt;Directory&gt; nadano uprawnienia za pomocą dyrektyw Options Indexes FollowSymLinks, AllowOverride None oraz Require all granted, co umożliwiło serwerowi bezkolizyjną obsługę wszystkich podkatalogów roboczych podgrupy.</w:t>
@@ -529,17 +449,10 @@
     </w:p>
     <w:tbl>
       <w:tblPr>
+        <w:tblStyle w:val="TableGrid"/>
         <w:tblW w:type="auto" w:w="0"/>
         <w:jc w:val="center"/>
         <w:tblLook w:firstColumn="1" w:firstRow="1" w:lastColumn="0" w:lastRow="0" w:noHBand="0" w:noVBand="1" w:val="04A0"/>
-        <w:tblBorders>
-          <w:top w:val="single" w:sz="4" w:space="0" w:color="CBD5E1"/>
-          <w:left w:val="single" w:sz="4" w:space="0" w:color="CBD5E1"/>
-          <w:bottom w:val="single" w:sz="4" w:space="0" w:color="CBD5E1"/>
-          <w:right w:val="single" w:sz="4" w:space="0" w:color="CBD5E1"/>
-          <w:insideH w:val="single" w:sz="4" w:space="0" w:color="CBD5E1"/>
-          <w:insideV w:val="single" w:sz="4" w:space="0" w:color="CBD5E1"/>
-        </w:tblBorders>
       </w:tblPr>
       <w:tblGrid>
         <w:gridCol w:w="10080"/>
@@ -548,22 +461,15 @@
         <w:tc>
           <w:tcPr>
             <w:tcW w:type="dxa" w:w="9648"/>
-            <w:shd w:val="clear" w:color="auto" w:fill="F8FAFC"/>
-            <w:tcMar>
-              <w:top w:w="70" w:type="dxa"/>
-              <w:bottom w:w="70" w:type="dxa"/>
-              <w:left w:w="100" w:type="dxa"/>
-              <w:right w:w="100" w:type="dxa"/>
-            </w:tcMar>
           </w:tcPr>
           <w:p>
             <w:pPr>
-              <w:spacing w:after="0" w:line="252" w:lineRule="auto"/>
+              <w:spacing w:before="60" w:after="60" w:line="252" w:lineRule="auto"/>
             </w:pPr>
             <w:r>
               <w:rPr>
                 <w:rFonts w:ascii="Consolas" w:hAnsi="Consolas"/>
-                <w:color w:val="111827"/>
+                <w:color w:val="000000"/>
                 <w:sz w:val="17"/>
               </w:rPr>
               <w:t>DocumentRoot "D:/Studenci/Cw_01/3ID11B_06"</w:t>
@@ -595,10 +501,10 @@
       <w:r>
         <w:rPr>
           <w:rFonts w:ascii="Arial" w:hAnsi="Arial"/>
-          <w:color w:val="1F2937"/>
+          <w:color w:val="000000"/>
           <w:sz w:val="20"/>
         </w:rPr>
-        <w:t>Wewnątrz katalogu D:\Studenci\Cw_01\3ID11B_06 przygotowano pełną, fizyczną strukturę podkatalogów i plików dla poszczególnych zadań ćwiczenia:</w:t>
+        <w:t>Wewnątrz katalogu D:\Studenci\Cw_01\3ID11B_06 przygotowano pełną strukturę katalogów i plików ze wszystkimi wymaganymi zasobami:</w:t>
         <w:br/>
         <w:t>• meble/ – katalog domeny www.meble.pl na porcie 80 z plikiem start.html oraz stronami błędów 404 i 403,</w:t>
         <w:br/>
@@ -631,10 +537,10 @@
         <w:rPr>
           <w:rFonts w:ascii="Arial" w:hAnsi="Arial"/>
           <w:b/>
-          <w:color w:val="1A478A"/>
-          <w:sz w:val="26"/>
+          <w:color w:val="000000"/>
+          <w:sz w:val="24"/>
         </w:rPr>
-        <w:t>3. Nasłuch portów i domyślne pliki startowe (DirectoryIndex)</w:t>
+        <w:t>3. Zadanie 3 i 4: Nasłuch portów (Listen) oraz domyślne pliki startowe (DirectoryIndex)</w:t>
       </w:r>
     </w:p>
     <w:p>
@@ -645,7 +551,7 @@
       <w:r>
         <w:rPr>
           <w:rFonts w:ascii="Arial" w:hAnsi="Arial"/>
-          <w:color w:val="1F2937"/>
+          <w:color w:val="000000"/>
           <w:sz w:val="20"/>
         </w:rPr>
         <w:t>W Zadaniu 3 rozszerzono domyślny nasłuch serwera (port 80) o alternatywny port 8080 za pomocą dyrektywy Listen 8080. W Zadaniu 4 zdefiniowano globalną hierarchię przeszukiwania plików startowych przy odwołaniu do katalogu bez podania konkretnego zasobu: DirectoryIndex st.html index.php index.html. W pierwszej kolejności serwer poszukuje pliku st.html, a w razie jego braku index.php oraz index.html.</w:t>
@@ -653,17 +559,10 @@
     </w:p>
     <w:tbl>
       <w:tblPr>
+        <w:tblStyle w:val="TableGrid"/>
         <w:tblW w:type="auto" w:w="0"/>
         <w:jc w:val="center"/>
         <w:tblLook w:firstColumn="1" w:firstRow="1" w:lastColumn="0" w:lastRow="0" w:noHBand="0" w:noVBand="1" w:val="04A0"/>
-        <w:tblBorders>
-          <w:top w:val="single" w:sz="4" w:space="0" w:color="CBD5E1"/>
-          <w:left w:val="single" w:sz="4" w:space="0" w:color="CBD5E1"/>
-          <w:bottom w:val="single" w:sz="4" w:space="0" w:color="CBD5E1"/>
-          <w:right w:val="single" w:sz="4" w:space="0" w:color="CBD5E1"/>
-          <w:insideH w:val="single" w:sz="4" w:space="0" w:color="CBD5E1"/>
-          <w:insideV w:val="single" w:sz="4" w:space="0" w:color="CBD5E1"/>
-        </w:tblBorders>
       </w:tblPr>
       <w:tblGrid>
         <w:gridCol w:w="10080"/>
@@ -672,22 +571,15 @@
         <w:tc>
           <w:tcPr>
             <w:tcW w:type="dxa" w:w="9648"/>
-            <w:shd w:val="clear" w:color="auto" w:fill="F8FAFC"/>
-            <w:tcMar>
-              <w:top w:w="70" w:type="dxa"/>
-              <w:bottom w:w="70" w:type="dxa"/>
-              <w:left w:w="100" w:type="dxa"/>
-              <w:right w:w="100" w:type="dxa"/>
-            </w:tcMar>
           </w:tcPr>
           <w:p>
             <w:pPr>
-              <w:spacing w:after="0" w:line="252" w:lineRule="auto"/>
+              <w:spacing w:before="60" w:after="60" w:line="252" w:lineRule="auto"/>
             </w:pPr>
             <w:r>
               <w:rPr>
                 <w:rFonts w:ascii="Consolas" w:hAnsi="Consolas"/>
-                <w:color w:val="111827"/>
+                <w:color w:val="000000"/>
                 <w:sz w:val="17"/>
               </w:rPr>
               <w:t># ZADANIE 3: Nasluch serwera na portach 80 i 8080</w:t>
@@ -716,7 +608,7 @@
       <w:r>
         <w:rPr>
           <w:rFonts w:ascii="Arial" w:hAnsi="Arial"/>
-          <w:color w:val="1F2937"/>
+          <w:color w:val="000000"/>
           <w:sz w:val="20"/>
         </w:rPr>
         <w:t>Prawidłowe działanie domyślnego pliku startowego oraz nasłuchu na porcie 80 przedstawiono na Rysunku 2. Wywołanie adresu http://www.meble.pl:80 spowodowało natychmiastowe załadowanie przygotowanej strony st.html z danymi autorów ćwiczenia (Artem Hizhovskyi, Ihor Namachynskyi) oraz identyfikatorem podgrupy 3ID11B_06.</w:t>
@@ -773,7 +665,7 @@
         <w:rPr>
           <w:rFonts w:ascii="Arial" w:hAnsi="Arial"/>
           <w:i/>
-          <w:color w:val="4B5563"/>
+          <w:color w:val="000000"/>
           <w:sz w:val="18"/>
         </w:rPr>
         <w:t>Rysunek 2: Strona startowa domeny www.meble.pl na porcie 80 (automatycznie załadowany plik startowy st.html).</w:t>
@@ -789,10 +681,10 @@
         <w:rPr>
           <w:rFonts w:ascii="Arial" w:hAnsi="Arial"/>
           <w:b/>
-          <w:color w:val="1A478A"/>
-          <w:sz w:val="26"/>
+          <w:color w:val="000000"/>
+          <w:sz w:val="24"/>
         </w:rPr>
-        <w:t>4. Wirtualne hosty (Virtual Hosts) i mapowanie portów oraz domen</w:t>
+        <w:t>4. Zadanie 5 i 6: Wirtualne hosty (Virtual Hosts) oraz mapowanie portów i domen</w:t>
       </w:r>
     </w:p>
     <w:p>
@@ -803,7 +695,7 @@
       <w:r>
         <w:rPr>
           <w:rFonts w:ascii="Arial" w:hAnsi="Arial"/>
-          <w:color w:val="1F2937"/>
+          <w:color w:val="000000"/>
           <w:sz w:val="20"/>
         </w:rPr>
         <w:t>W zadaniach 5 i 6 skonfigurowano wirtualne hosty oparte na adresach IP i nazwach domenowych. Do maszyny wirtualnej przypisano dwa adresy sieciowe: 10.0.2.2 dla domeny meble.pl oraz 10.0.3.3 dla domeny auta.pl. Dodatkowo zdefiniowano hosta na adresie pętli zwrotnej 127.0.0.1 dla domeny www.phpmyad.pl. Łącznie zdefiniowano 6 bloków VirtualHost w pliku konfiguracyjnym:</w:t>
@@ -830,7 +722,7 @@
         <w:rPr>
           <w:rFonts w:ascii="Arial" w:hAnsi="Arial"/>
           <w:b/>
-          <w:color w:val="1F2937"/>
+          <w:color w:val="000000"/>
           <w:sz w:val="20"/>
         </w:rPr>
         <w:t xml:space="preserve">Diagnostyka wirtualnych hostów: </w:t>
@@ -838,7 +730,7 @@
       <w:r>
         <w:rPr>
           <w:rFonts w:ascii="Arial" w:hAnsi="Arial"/>
-          <w:color w:val="1F2937"/>
+          <w:color w:val="000000"/>
           <w:sz w:val="20"/>
         </w:rPr>
         <w:t>Prawidłowość zarejestrowania wszystkich wirtualnych hostów przez serwer Apache potwierdzono za pomocą polecenia diagnostycznego httpd.exe -S. Wynik polecenia jednoznacznie wskazuje powiązanie każdego adresu IP i portu z konkretnym wirtualnym hostem oraz numerem linii w pliku D:/Studenci/Cw_01/3ID11B_06/httpd.conf:</w:t>
@@ -846,17 +738,10 @@
     </w:p>
     <w:tbl>
       <w:tblPr>
+        <w:tblStyle w:val="TableGrid"/>
         <w:tblW w:type="auto" w:w="0"/>
         <w:jc w:val="center"/>
         <w:tblLook w:firstColumn="1" w:firstRow="1" w:lastColumn="0" w:lastRow="0" w:noHBand="0" w:noVBand="1" w:val="04A0"/>
-        <w:tblBorders>
-          <w:top w:val="single" w:sz="4" w:space="0" w:color="CBD5E1"/>
-          <w:left w:val="single" w:sz="4" w:space="0" w:color="CBD5E1"/>
-          <w:bottom w:val="single" w:sz="4" w:space="0" w:color="CBD5E1"/>
-          <w:right w:val="single" w:sz="4" w:space="0" w:color="CBD5E1"/>
-          <w:insideH w:val="single" w:sz="4" w:space="0" w:color="CBD5E1"/>
-          <w:insideV w:val="single" w:sz="4" w:space="0" w:color="CBD5E1"/>
-        </w:tblBorders>
       </w:tblPr>
       <w:tblGrid>
         <w:gridCol w:w="10080"/>
@@ -865,22 +750,15 @@
         <w:tc>
           <w:tcPr>
             <w:tcW w:type="dxa" w:w="9648"/>
-            <w:shd w:val="clear" w:color="auto" w:fill="F8FAFC"/>
-            <w:tcMar>
-              <w:top w:w="70" w:type="dxa"/>
-              <w:bottom w:w="70" w:type="dxa"/>
-              <w:left w:w="100" w:type="dxa"/>
-              <w:right w:w="100" w:type="dxa"/>
-            </w:tcMar>
           </w:tcPr>
           <w:p>
             <w:pPr>
-              <w:spacing w:after="0" w:line="252" w:lineRule="auto"/>
+              <w:spacing w:before="60" w:after="60" w:line="252" w:lineRule="auto"/>
             </w:pPr>
             <w:r>
               <w:rPr>
                 <w:rFonts w:ascii="Consolas" w:hAnsi="Consolas"/>
-                <w:color w:val="111827"/>
+                <w:color w:val="000000"/>
                 <w:sz w:val="17"/>
               </w:rPr>
               <w:t>"C:\Oprogramowanie\Apache24\bin\httpd.exe" -S -f "D:\Studenci\Cw_01\3ID11B_06\httpd.conf"</w:t>
@@ -945,7 +823,7 @@
         <w:rPr>
           <w:rFonts w:ascii="Arial" w:hAnsi="Arial"/>
           <w:i/>
-          <w:color w:val="4B5563"/>
+          <w:color w:val="000000"/>
           <w:sz w:val="18"/>
         </w:rPr>
         <w:t>Rysunek 3: Zrzut zarejestrowanych wirtualnych hostów poleceniem httpd -S (widoczne powiązania IP:port z plikiem httpd.conf).</w:t>
@@ -959,7 +837,7 @@
       <w:r>
         <w:rPr>
           <w:rFonts w:ascii="Arial" w:hAnsi="Arial"/>
-          <w:color w:val="1F2937"/>
+          <w:color w:val="000000"/>
           <w:sz w:val="20"/>
         </w:rPr>
         <w:t>Na Rysunku 4 zaprezentowano działanie wirtualnego hosta www.auta.pl na alternatywnym porcie 8080 pod adresem http://auta.pl:8080, wskazującego na katalog D:/Studenci/Cw_01/3ID11B_06/auta80.</w:t>
@@ -1016,7 +894,7 @@
         <w:rPr>
           <w:rFonts w:ascii="Arial" w:hAnsi="Arial"/>
           <w:i/>
-          <w:color w:val="4B5563"/>
+          <w:color w:val="000000"/>
           <w:sz w:val="18"/>
         </w:rPr>
         <w:t>Rysunek 4: Działanie wirtualnego hosta www.auta.pl na alternatywnym porcie 8080 (katalog auta80).</w:t>
@@ -1030,7 +908,7 @@
       <w:r>
         <w:rPr>
           <w:rFonts w:ascii="Arial" w:hAnsi="Arial"/>
-          <w:color w:val="1F2937"/>
+          <w:color w:val="000000"/>
           <w:sz w:val="20"/>
         </w:rPr>
         <w:t>Dla domeny www.phpmyad.pl (Zadanie 5.e i 12.c) zdefiniowano powiązanie z rzeczywistym katalogiem aplikacji phpMyAdmin (C:/Oprogramowanie/Apache24/htdocs/phpMyAdmin) oraz nałożono rygorystyczne ograniczenie dostępu Require ip 127.0.0.1. Zapewnia to, że dostęp do bazy danych z zewnątrz sieci uczelnianej jest zablokowany, a administrator może zalogować się wyłącznie z poziomu konsoli lokalnej (Rysunek 5).</w:t>
@@ -1038,17 +916,10 @@
     </w:p>
     <w:tbl>
       <w:tblPr>
+        <w:tblStyle w:val="TableGrid"/>
         <w:tblW w:type="auto" w:w="0"/>
         <w:jc w:val="center"/>
         <w:tblLook w:firstColumn="1" w:firstRow="1" w:lastColumn="0" w:lastRow="0" w:noHBand="0" w:noVBand="1" w:val="04A0"/>
-        <w:tblBorders>
-          <w:top w:val="single" w:sz="4" w:space="0" w:color="CBD5E1"/>
-          <w:left w:val="single" w:sz="4" w:space="0" w:color="CBD5E1"/>
-          <w:bottom w:val="single" w:sz="4" w:space="0" w:color="CBD5E1"/>
-          <w:right w:val="single" w:sz="4" w:space="0" w:color="CBD5E1"/>
-          <w:insideH w:val="single" w:sz="4" w:space="0" w:color="CBD5E1"/>
-          <w:insideV w:val="single" w:sz="4" w:space="0" w:color="CBD5E1"/>
-        </w:tblBorders>
       </w:tblPr>
       <w:tblGrid>
         <w:gridCol w:w="10080"/>
@@ -1057,22 +928,15 @@
         <w:tc>
           <w:tcPr>
             <w:tcW w:type="dxa" w:w="9648"/>
-            <w:shd w:val="clear" w:color="auto" w:fill="F8FAFC"/>
-            <w:tcMar>
-              <w:top w:w="70" w:type="dxa"/>
-              <w:bottom w:w="70" w:type="dxa"/>
-              <w:left w:w="100" w:type="dxa"/>
-              <w:right w:w="100" w:type="dxa"/>
-            </w:tcMar>
           </w:tcPr>
           <w:p>
             <w:pPr>
-              <w:spacing w:after="0" w:line="252" w:lineRule="auto"/>
+              <w:spacing w:before="60" w:after="60" w:line="252" w:lineRule="auto"/>
             </w:pPr>
             <w:r>
               <w:rPr>
                 <w:rFonts w:ascii="Consolas" w:hAnsi="Consolas"/>
-                <w:color w:val="111827"/>
+                <w:color w:val="000000"/>
                 <w:sz w:val="17"/>
               </w:rPr>
               <w:t>&lt;VirtualHost 127.0.0.1:80&gt;</w:t>
@@ -1155,7 +1019,7 @@
         <w:rPr>
           <w:rFonts w:ascii="Arial" w:hAnsi="Arial"/>
           <w:i/>
-          <w:color w:val="4B5563"/>
+          <w:color w:val="000000"/>
           <w:sz w:val="18"/>
         </w:rPr>
         <w:t>Rysunek 5: Dostęp do panelu phpMyAdmin pod domeną www.phpmyad.pl (dostęp z adresu pętli zwrotnej 127.0.0.1).</w:t>
@@ -1171,10 +1035,10 @@
         <w:rPr>
           <w:rFonts w:ascii="Arial" w:hAnsi="Arial"/>
           <w:b/>
-          <w:color w:val="1A478A"/>
-          <w:sz w:val="26"/>
+          <w:color w:val="000000"/>
+          <w:sz w:val="24"/>
         </w:rPr>
-        <w:t>5. Automatyczne indeksowanie katalogu (FancyIndexing), nagłówek i stopka w meble80</w:t>
+        <w:t>5. Zadanie 7 i 8: Automatyczne indeksowanie katalogu (FancyIndexing), nagłówek i stopka w meble80</w:t>
       </w:r>
     </w:p>
     <w:p>
@@ -1185,7 +1049,7 @@
       <w:r>
         <w:rPr>
           <w:rFonts w:ascii="Arial" w:hAnsi="Arial"/>
-          <w:color w:val="1F2937"/>
+          <w:color w:val="000000"/>
           <w:sz w:val="20"/>
         </w:rPr>
         <w:t>Zgodnie z Zadaniem 7 i 8 dla wirtualnego hosta www.meble.pl na porcie 8080 skonfigurowano mechanizm automatycznego indeksowania zawartości katalogu D:/Studenci/Cw_01/3ID11B_06/meble80. Zastosowano zaawansowane opcje indeksowania modułu mod_autoindex: FancyIndexing (estetyczny widok z ikonami typów MIME), FoldersFirst (wyświetlanie folderów na początku listy) oraz VersionSort (inteligentne sortowanie wersji plików). Dodatkowo zdefiniowano dyrektywy HeaderName naglowek.html oraz ReadmeName stopka.html, dzięki którym wygenerowana lista plików jest automatycznie otoczona spersonalizowanym nagłówkiem z danymi zespołu oraz stopką autorską.</w:t>
@@ -1193,17 +1057,10 @@
     </w:p>
     <w:tbl>
       <w:tblPr>
+        <w:tblStyle w:val="TableGrid"/>
         <w:tblW w:type="auto" w:w="0"/>
         <w:jc w:val="center"/>
         <w:tblLook w:firstColumn="1" w:firstRow="1" w:lastColumn="0" w:lastRow="0" w:noHBand="0" w:noVBand="1" w:val="04A0"/>
-        <w:tblBorders>
-          <w:top w:val="single" w:sz="4" w:space="0" w:color="CBD5E1"/>
-          <w:left w:val="single" w:sz="4" w:space="0" w:color="CBD5E1"/>
-          <w:bottom w:val="single" w:sz="4" w:space="0" w:color="CBD5E1"/>
-          <w:right w:val="single" w:sz="4" w:space="0" w:color="CBD5E1"/>
-          <w:insideH w:val="single" w:sz="4" w:space="0" w:color="CBD5E1"/>
-          <w:insideV w:val="single" w:sz="4" w:space="0" w:color="CBD5E1"/>
-        </w:tblBorders>
       </w:tblPr>
       <w:tblGrid>
         <w:gridCol w:w="10080"/>
@@ -1212,22 +1069,15 @@
         <w:tc>
           <w:tcPr>
             <w:tcW w:type="dxa" w:w="9648"/>
-            <w:shd w:val="clear" w:color="auto" w:fill="F8FAFC"/>
-            <w:tcMar>
-              <w:top w:w="70" w:type="dxa"/>
-              <w:bottom w:w="70" w:type="dxa"/>
-              <w:left w:w="100" w:type="dxa"/>
-              <w:right w:w="100" w:type="dxa"/>
-            </w:tcMar>
           </w:tcPr>
           <w:p>
             <w:pPr>
-              <w:spacing w:after="0" w:line="252" w:lineRule="auto"/>
+              <w:spacing w:before="60" w:after="60" w:line="252" w:lineRule="auto"/>
             </w:pPr>
             <w:r>
               <w:rPr>
                 <w:rFonts w:ascii="Consolas" w:hAnsi="Consolas"/>
-                <w:color w:val="111827"/>
+                <w:color w:val="000000"/>
                 <w:sz w:val="17"/>
               </w:rPr>
               <w:t>&lt;VirtualHost 10.0.2.2:8080&gt;</w:t>
@@ -1274,7 +1124,7 @@
       <w:r>
         <w:rPr>
           <w:rFonts w:ascii="Arial" w:hAnsi="Arial"/>
-          <w:color w:val="1F2937"/>
+          <w:color w:val="000000"/>
           <w:sz w:val="20"/>
         </w:rPr>
         <w:t>Na Rysunku 6 przedstawiono widok indeksu katalogu http://meble.pl:8080/. Widoczny jest nagłówek z danymi grupy 3ID11B_06, tabela indeksu z plikami oraz stopka zamykająca dokument.</w:t>
@@ -1331,7 +1181,7 @@
         <w:rPr>
           <w:rFonts w:ascii="Arial" w:hAnsi="Arial"/>
           <w:i/>
-          <w:color w:val="4B5563"/>
+          <w:color w:val="000000"/>
           <w:sz w:val="18"/>
         </w:rPr>
         <w:t>Rysunek 6: Automatyczne indeksowanie katalogu meble80 (opcje FancyIndexing, nagłówek naglowek.html oraz stopka stopka.html).</w:t>
@@ -1345,7 +1195,7 @@
       <w:r>
         <w:rPr>
           <w:rFonts w:ascii="Arial" w:hAnsi="Arial"/>
-          <w:color w:val="1F2937"/>
+          <w:color w:val="000000"/>
           <w:sz w:val="20"/>
         </w:rPr>
         <w:t>W ramach ćwiczenia zweryfikowano obsługę poszczególnych zasobów umieszczonych w indeksowanym katalogu meble80, w tym plików binarnych, dokumentów oraz plików tekstowych. Na kolejnych zrzutach przedstawiono:</w:t>
@@ -1412,7 +1262,7 @@
         <w:rPr>
           <w:rFonts w:ascii="Arial" w:hAnsi="Arial"/>
           <w:i/>
-          <w:color w:val="4B5563"/>
+          <w:color w:val="000000"/>
           <w:sz w:val="18"/>
         </w:rPr>
         <w:t>Rysunek 7: Bezpośrednie pobranie i wyświetlenie pliku graficznego foto.jpg z katalogu meble80.</w:t>
@@ -1469,7 +1319,7 @@
         <w:rPr>
           <w:rFonts w:ascii="Arial" w:hAnsi="Arial"/>
           <w:i/>
-          <w:color w:val="4B5563"/>
+          <w:color w:val="000000"/>
           <w:sz w:val="18"/>
         </w:rPr>
         <w:t>Rysunek 8: Prawidłowe otwarcie i renderowanie pliku dokument.pdf w przeglądarce.</w:t>
@@ -1526,7 +1376,7 @@
         <w:rPr>
           <w:rFonts w:ascii="Arial" w:hAnsi="Arial"/>
           <w:i/>
-          <w:color w:val="4B5563"/>
+          <w:color w:val="000000"/>
           <w:sz w:val="18"/>
         </w:rPr>
         <w:t>Rysunek 9: Zawartość pliku nagłówkowego naglowek.html zawierającego dane autorów ćwiczenia.</w:t>
@@ -1583,7 +1433,7 @@
         <w:rPr>
           <w:rFonts w:ascii="Arial" w:hAnsi="Arial"/>
           <w:i/>
-          <w:color w:val="4B5563"/>
+          <w:color w:val="000000"/>
           <w:sz w:val="18"/>
         </w:rPr>
         <w:t>Rysunek 10: Zawartość pliku stopki stopka.html osadzanej na końcu listy indeksu.</w:t>
@@ -1640,7 +1490,7 @@
         <w:rPr>
           <w:rFonts w:ascii="Arial" w:hAnsi="Arial"/>
           <w:i/>
-          <w:color w:val="4B5563"/>
+          <w:color w:val="000000"/>
           <w:sz w:val="18"/>
         </w:rPr>
         <w:t>Rysunek 11: Wyświetlenie zawartości pliku tekstowego test.txt w oknie przeglądarki.</w:t>
@@ -1656,10 +1506,10 @@
         <w:rPr>
           <w:rFonts w:ascii="Arial" w:hAnsi="Arial"/>
           <w:b/>
-          <w:color w:val="1A478A"/>
-          <w:sz w:val="26"/>
+          <w:color w:val="000000"/>
+          <w:sz w:val="24"/>
         </w:rPr>
-        <w:t>6. Obsługa własnych stron błędów HTTP (błędy 404, 403, 500)</w:t>
+        <w:t>6. Zadanie 9, 10 i 11: Obsługa własnych stron błędów HTTP (błędy 404, 403, 500)</w:t>
       </w:r>
     </w:p>
     <w:p>
@@ -1670,7 +1520,7 @@
       <w:r>
         <w:rPr>
           <w:rFonts w:ascii="Arial" w:hAnsi="Arial"/>
-          <w:color w:val="1F2937"/>
+          <w:color w:val="000000"/>
           <w:sz w:val="20"/>
         </w:rPr>
         <w:t>W zadaniach 9, 10 i 11 skonfigurowano hierarchiczną obsługę błędów HTTP. Globalnie w serwerze zdefiniowano alias Alias /err/ "D:/Studenci/Cw_01/3ID11B_06/error/" oraz dyrektywy ErrorDocument dla kodów 404 (Not Found), 403 (Forbidden) oraz 500 (Internal Server Error). Jednocześnie w wirtualnym hoście www.meble.pl oraz katalogu meble nadpisano domyślne strony błędów dedykowanymi szablonami /error/404.html oraz /error/403.html w estetycznej oprawie wizualnej przygotowanej dla danej domeny.</w:t>
@@ -1678,17 +1528,10 @@
     </w:p>
     <w:tbl>
       <w:tblPr>
+        <w:tblStyle w:val="TableGrid"/>
         <w:tblW w:type="auto" w:w="0"/>
         <w:jc w:val="center"/>
         <w:tblLook w:firstColumn="1" w:firstRow="1" w:lastColumn="0" w:lastRow="0" w:noHBand="0" w:noVBand="1" w:val="04A0"/>
-        <w:tblBorders>
-          <w:top w:val="single" w:sz="4" w:space="0" w:color="CBD5E1"/>
-          <w:left w:val="single" w:sz="4" w:space="0" w:color="CBD5E1"/>
-          <w:bottom w:val="single" w:sz="4" w:space="0" w:color="CBD5E1"/>
-          <w:right w:val="single" w:sz="4" w:space="0" w:color="CBD5E1"/>
-          <w:insideH w:val="single" w:sz="4" w:space="0" w:color="CBD5E1"/>
-          <w:insideV w:val="single" w:sz="4" w:space="0" w:color="CBD5E1"/>
-        </w:tblBorders>
       </w:tblPr>
       <w:tblGrid>
         <w:gridCol w:w="10080"/>
@@ -1697,22 +1540,15 @@
         <w:tc>
           <w:tcPr>
             <w:tcW w:type="dxa" w:w="9648"/>
-            <w:shd w:val="clear" w:color="auto" w:fill="F8FAFC"/>
-            <w:tcMar>
-              <w:top w:w="70" w:type="dxa"/>
-              <w:bottom w:w="70" w:type="dxa"/>
-              <w:left w:w="100" w:type="dxa"/>
-              <w:right w:w="100" w:type="dxa"/>
-            </w:tcMar>
           </w:tcPr>
           <w:p>
             <w:pPr>
-              <w:spacing w:after="0" w:line="252" w:lineRule="auto"/>
+              <w:spacing w:before="60" w:after="60" w:line="252" w:lineRule="auto"/>
             </w:pPr>
             <w:r>
               <w:rPr>
                 <w:rFonts w:ascii="Consolas" w:hAnsi="Consolas"/>
-                <w:color w:val="111827"/>
+                <w:color w:val="000000"/>
                 <w:sz w:val="17"/>
               </w:rPr>
               <w:t># Globalne pliki bledow dla calego serwera</w:t>
@@ -1758,7 +1594,7 @@
       <w:r>
         <w:rPr>
           <w:rFonts w:ascii="Arial" w:hAnsi="Arial"/>
-          <w:color w:val="1F2937"/>
+          <w:color w:val="000000"/>
           <w:sz w:val="20"/>
         </w:rPr>
         <w:t>Działanie własnej strony błędu przetestowano poprzez wywołanie nieistniejącego pliku pod adresem http://meble.pl/nieistnieje.html. Serwer zamiast surowego, domyślnego komunikatu Apache zwrócił przygotowaną stronę błędu 404 z komunikatem "404 - Błąd domeny meble.pl - Nie odnaleziono żądanego zasobu" (Rysunek 12).</w:t>
@@ -1815,7 +1651,7 @@
         <w:rPr>
           <w:rFonts w:ascii="Arial" w:hAnsi="Arial"/>
           <w:i/>
-          <w:color w:val="4B5563"/>
+          <w:color w:val="000000"/>
           <w:sz w:val="18"/>
         </w:rPr>
         <w:t>Rysunek 12: Własna strona błędu HTTP 404 dla domeny meble.pl (/error/404.html).</w:t>
@@ -1831,10 +1667,10 @@
         <w:rPr>
           <w:rFonts w:ascii="Arial" w:hAnsi="Arial"/>
           <w:b/>
-          <w:color w:val="1A478A"/>
-          <w:sz w:val="26"/>
+          <w:color w:val="000000"/>
+          <w:sz w:val="24"/>
         </w:rPr>
-        <w:t>7. Kontrola dostępu i autoryzacja HTTP Basic (hasla.has)</w:t>
+        <w:t>7. Zadanie 12: Kontrola dostępu i autoryzacja HTTP Basic (hasla.has)</w:t>
       </w:r>
     </w:p>
     <w:p>
@@ -1845,7 +1681,7 @@
       <w:r>
         <w:rPr>
           <w:rFonts w:ascii="Arial" w:hAnsi="Arial"/>
-          <w:color w:val="1F2937"/>
+          <w:color w:val="000000"/>
           <w:sz w:val="20"/>
         </w:rPr>
         <w:t>W Zadaniu 12 zabezpieczono katalogi domeny www.auta.pl (katalogi auta oraz auta80) przed nieautoryzowanym dostępem. Wdrożono mechanizm uwierzytelniania HTTP Basic Authentication oparty o moduł mod_auth_basic. Jako magazyn poświadczeń wskazano plik AuthUserFile "D:/Studenci/Cw_01/3ID11B_06/hasla.has", a dostęp ograniczono wyłącznie do użytkownika st dyrektywą Require user st.</w:t>
@@ -1853,17 +1689,10 @@
     </w:p>
     <w:tbl>
       <w:tblPr>
+        <w:tblStyle w:val="TableGrid"/>
         <w:tblW w:type="auto" w:w="0"/>
         <w:jc w:val="center"/>
         <w:tblLook w:firstColumn="1" w:firstRow="1" w:lastColumn="0" w:lastRow="0" w:noHBand="0" w:noVBand="1" w:val="04A0"/>
-        <w:tblBorders>
-          <w:top w:val="single" w:sz="4" w:space="0" w:color="CBD5E1"/>
-          <w:left w:val="single" w:sz="4" w:space="0" w:color="CBD5E1"/>
-          <w:bottom w:val="single" w:sz="4" w:space="0" w:color="CBD5E1"/>
-          <w:right w:val="single" w:sz="4" w:space="0" w:color="CBD5E1"/>
-          <w:insideH w:val="single" w:sz="4" w:space="0" w:color="CBD5E1"/>
-          <w:insideV w:val="single" w:sz="4" w:space="0" w:color="CBD5E1"/>
-        </w:tblBorders>
       </w:tblPr>
       <w:tblGrid>
         <w:gridCol w:w="10080"/>
@@ -1872,22 +1701,15 @@
         <w:tc>
           <w:tcPr>
             <w:tcW w:type="dxa" w:w="9648"/>
-            <w:shd w:val="clear" w:color="auto" w:fill="F8FAFC"/>
-            <w:tcMar>
-              <w:top w:w="70" w:type="dxa"/>
-              <w:bottom w:w="70" w:type="dxa"/>
-              <w:left w:w="100" w:type="dxa"/>
-              <w:right w:w="100" w:type="dxa"/>
-            </w:tcMar>
           </w:tcPr>
           <w:p>
             <w:pPr>
-              <w:spacing w:after="0" w:line="252" w:lineRule="auto"/>
+              <w:spacing w:before="60" w:after="60" w:line="252" w:lineRule="auto"/>
             </w:pPr>
             <w:r>
               <w:rPr>
                 <w:rFonts w:ascii="Consolas" w:hAnsi="Consolas"/>
-                <w:color w:val="111827"/>
+                <w:color w:val="000000"/>
                 <w:sz w:val="17"/>
               </w:rPr>
               <w:t>&lt;Directory "D:/Studenci/Cw_01/3ID11B_06/auta"&gt;</w:t>
@@ -1923,7 +1745,7 @@
       <w:r>
         <w:rPr>
           <w:rFonts w:ascii="Arial" w:hAnsi="Arial"/>
-          <w:color w:val="1F2937"/>
+          <w:color w:val="000000"/>
           <w:sz w:val="20"/>
         </w:rPr>
         <w:t>W pliku hasla.has wygenerowano bezpieczny wpis z haszem SHA-1 dla konta st i hasła st: st:{SHA}mwLZl0wU5iPJ/77XNgvqy/DcuV8=. Przy pierwszej próbie wejścia na stronę http://www.auta.pl przeglądarka otrzymała od serwera odpowiedź HTTP 401 Unauthorized i wyświetliła modalne okno żądania autoryzacji (Rysunek 13). Po wprowadzeniu poprawnych danych (st / st) serwer autoryzował sesję i wyświetlił chronioną stronę powitalną z komunikatem "Strona startowa domeny www.auta.pl (Autoryzacja udana)" (Rysunek 14).</w:t>
@@ -1980,7 +1802,7 @@
         <w:rPr>
           <w:rFonts w:ascii="Arial" w:hAnsi="Arial"/>
           <w:i/>
-          <w:color w:val="4B5563"/>
+          <w:color w:val="000000"/>
           <w:sz w:val="18"/>
         </w:rPr>
         <w:t>Rysunek 13: Żądanie autoryzacji HTTP Basic przy próbie wejścia na stronę www.auta.pl (wymagane poświadczenia użytkownika st).</w:t>
@@ -2037,7 +1859,7 @@
         <w:rPr>
           <w:rFonts w:ascii="Arial" w:hAnsi="Arial"/>
           <w:i/>
-          <w:color w:val="4B5563"/>
+          <w:color w:val="000000"/>
           <w:sz w:val="18"/>
         </w:rPr>
         <w:t>Rysunek 14: Dostęp do domeny www.auta.pl po pomyślnym uwierzytelnieniu użytkownika st (hasla.has).</w:t>
@@ -2053,10 +1875,10 @@
         <w:rPr>
           <w:rFonts w:ascii="Arial" w:hAnsi="Arial"/>
           <w:b/>
-          <w:color w:val="1A478A"/>
-          <w:sz w:val="26"/>
+          <w:color w:val="000000"/>
+          <w:sz w:val="24"/>
         </w:rPr>
-        <w:t>8. Moduł diagnostyczny statusu serwera (mod_status pod /status)</w:t>
+        <w:t>8. Zadanie 13: Moduł diagnostyczny statusu serwera (mod_status pod /status)</w:t>
       </w:r>
     </w:p>
     <w:p>
@@ -2067,7 +1889,7 @@
       <w:r>
         <w:rPr>
           <w:rFonts w:ascii="Arial" w:hAnsi="Arial"/>
-          <w:color w:val="1F2937"/>
+          <w:color w:val="000000"/>
           <w:sz w:val="20"/>
         </w:rPr>
         <w:t>W Zadaniu 13 w wirtualnym hoście www.meble.pl na porcie 80 skonfigurowano blok &lt;Location /status&gt; z procedurą obsługi SetHandler server-status. Dyrektywa Require all granted udostępniła generowany w czasie rzeczywistym raport kondycji serwera.</w:t>
@@ -2075,17 +1897,10 @@
     </w:p>
     <w:tbl>
       <w:tblPr>
+        <w:tblStyle w:val="TableGrid"/>
         <w:tblW w:type="auto" w:w="0"/>
         <w:jc w:val="center"/>
         <w:tblLook w:firstColumn="1" w:firstRow="1" w:lastColumn="0" w:lastRow="0" w:noHBand="0" w:noVBand="1" w:val="04A0"/>
-        <w:tblBorders>
-          <w:top w:val="single" w:sz="4" w:space="0" w:color="CBD5E1"/>
-          <w:left w:val="single" w:sz="4" w:space="0" w:color="CBD5E1"/>
-          <w:bottom w:val="single" w:sz="4" w:space="0" w:color="CBD5E1"/>
-          <w:right w:val="single" w:sz="4" w:space="0" w:color="CBD5E1"/>
-          <w:insideH w:val="single" w:sz="4" w:space="0" w:color="CBD5E1"/>
-          <w:insideV w:val="single" w:sz="4" w:space="0" w:color="CBD5E1"/>
-        </w:tblBorders>
       </w:tblPr>
       <w:tblGrid>
         <w:gridCol w:w="10080"/>
@@ -2094,22 +1909,15 @@
         <w:tc>
           <w:tcPr>
             <w:tcW w:type="dxa" w:w="9648"/>
-            <w:shd w:val="clear" w:color="auto" w:fill="F8FAFC"/>
-            <w:tcMar>
-              <w:top w:w="70" w:type="dxa"/>
-              <w:bottom w:w="70" w:type="dxa"/>
-              <w:left w:w="100" w:type="dxa"/>
-              <w:right w:w="100" w:type="dxa"/>
-            </w:tcMar>
           </w:tcPr>
           <w:p>
             <w:pPr>
-              <w:spacing w:after="0" w:line="252" w:lineRule="auto"/>
+              <w:spacing w:before="60" w:after="60" w:line="252" w:lineRule="auto"/>
             </w:pPr>
             <w:r>
               <w:rPr>
                 <w:rFonts w:ascii="Consolas" w:hAnsi="Consolas"/>
-                <w:color w:val="111827"/>
+                <w:color w:val="000000"/>
                 <w:sz w:val="17"/>
               </w:rPr>
               <w:t>&lt;Location /status&gt;</w:t>
@@ -2137,7 +1945,7 @@
       <w:r>
         <w:rPr>
           <w:rFonts w:ascii="Arial" w:hAnsi="Arial"/>
-          <w:color w:val="1F2937"/>
+          <w:color w:val="000000"/>
           <w:sz w:val="20"/>
         </w:rPr>
         <w:t>Wywołanie adresu http://meble.pl/status (Rysunek 15) prezentuje szczegółowe metryki pracy demona httpd.exe:</w:t>
@@ -2206,7 +2014,7 @@
         <w:rPr>
           <w:rFonts w:ascii="Arial" w:hAnsi="Arial"/>
           <w:i/>
-          <w:color w:val="4B5563"/>
+          <w:color w:val="000000"/>
           <w:sz w:val="18"/>
         </w:rPr>
         <w:t>Rysunek 15: Raport statusu serwera generowany przez moduł mod_status pod adresem http://meble.pl/status.</w:t>
@@ -2222,10 +2030,10 @@
         <w:rPr>
           <w:rFonts w:ascii="Arial" w:hAnsi="Arial"/>
           <w:b/>
-          <w:color w:val="1A478A"/>
-          <w:sz w:val="26"/>
+          <w:color w:val="000000"/>
+          <w:sz w:val="24"/>
         </w:rPr>
-        <w:t>9. Szyfrowane połączenie SSL/TLS (HTTPS, Port 443)</w:t>
+        <w:t>9. Zadanie 14: Szyfrowane połączenie SSL/TLS (HTTPS, Port 443)</w:t>
       </w:r>
     </w:p>
     <w:p>
@@ -2236,7 +2044,7 @@
       <w:r>
         <w:rPr>
           <w:rFonts w:ascii="Arial" w:hAnsi="Arial"/>
-          <w:color w:val="1F2937"/>
+          <w:color w:val="000000"/>
           <w:sz w:val="20"/>
         </w:rPr>
         <w:t>W Zadaniu 14 zaimplementowano bezpieczne połączenie szyfrowane protokołem TLS w oparciu o moduł mod_ssl. Zdefiniowano dyrektywę nasłuchu Listen 443 https oraz dedykowany wirtualny host &lt;VirtualHost 10.0.2.2:443&gt; z katalogiem DocumentRoot "D:/Studenci/Cw_01/3ID11B_06/meble443". Za pomocą narzędzia OpenSSL wygenerowano 2048-bitowy klucz prywatny RSA (meble.key) oraz samopodpisany certyfikat X.509 (meble.crt) wystawiony dla domeny www.meble.pl i podpięto je dyrektywami SSLCertificateFile i SSLCertificateKeyFile.</w:t>
@@ -2244,17 +2052,10 @@
     </w:p>
     <w:tbl>
       <w:tblPr>
+        <w:tblStyle w:val="TableGrid"/>
         <w:tblW w:type="auto" w:w="0"/>
         <w:jc w:val="center"/>
         <w:tblLook w:firstColumn="1" w:firstRow="1" w:lastColumn="0" w:lastRow="0" w:noHBand="0" w:noVBand="1" w:val="04A0"/>
-        <w:tblBorders>
-          <w:top w:val="single" w:sz="4" w:space="0" w:color="CBD5E1"/>
-          <w:left w:val="single" w:sz="4" w:space="0" w:color="CBD5E1"/>
-          <w:bottom w:val="single" w:sz="4" w:space="0" w:color="CBD5E1"/>
-          <w:right w:val="single" w:sz="4" w:space="0" w:color="CBD5E1"/>
-          <w:insideH w:val="single" w:sz="4" w:space="0" w:color="CBD5E1"/>
-          <w:insideV w:val="single" w:sz="4" w:space="0" w:color="CBD5E1"/>
-        </w:tblBorders>
       </w:tblPr>
       <w:tblGrid>
         <w:gridCol w:w="10080"/>
@@ -2263,22 +2064,15 @@
         <w:tc>
           <w:tcPr>
             <w:tcW w:type="dxa" w:w="9648"/>
-            <w:shd w:val="clear" w:color="auto" w:fill="F8FAFC"/>
-            <w:tcMar>
-              <w:top w:w="70" w:type="dxa"/>
-              <w:bottom w:w="70" w:type="dxa"/>
-              <w:left w:w="100" w:type="dxa"/>
-              <w:right w:w="100" w:type="dxa"/>
-            </w:tcMar>
           </w:tcPr>
           <w:p>
             <w:pPr>
-              <w:spacing w:after="0" w:line="252" w:lineRule="auto"/>
+              <w:spacing w:before="60" w:after="60" w:line="252" w:lineRule="auto"/>
             </w:pPr>
             <w:r>
               <w:rPr>
                 <w:rFonts w:ascii="Consolas" w:hAnsi="Consolas"/>
-                <w:color w:val="111827"/>
+                <w:color w:val="000000"/>
                 <w:sz w:val="17"/>
               </w:rPr>
               <w:t>Listen 443 https</w:t>
@@ -2329,7 +2123,7 @@
       <w:r>
         <w:rPr>
           <w:rFonts w:ascii="Arial" w:hAnsi="Arial"/>
-          <w:color w:val="1F2937"/>
+          <w:color w:val="000000"/>
           <w:sz w:val="20"/>
         </w:rPr>
         <w:t>Prawidłowe nawiązanie sesji HTTPS pod adresem https://www.meble.pl przedstawiono na Rysunku 16. W pasku adresu przeglądarki widoczna jest ikona bezpiecznego połączenia (kłódka TLS) oraz załadowana dedykowana strona startowa z katalogu meble443 z komunikatem "Strona startowa domeny www.meble.pl (Połączenie bezpieczne SSL)".</w:t>
@@ -2386,7 +2180,7 @@
         <w:rPr>
           <w:rFonts w:ascii="Arial" w:hAnsi="Arial"/>
           <w:i/>
-          <w:color w:val="4B5563"/>
+          <w:color w:val="000000"/>
           <w:sz w:val="18"/>
         </w:rPr>
         <w:t>Rysunek 16: Bezpieczne połączenie szyfrowane HTTPS (port 443) z wykorzystaniem wygenerowanego certyfikatu SSL.</w:t>
@@ -2402,10 +2196,10 @@
         <w:rPr>
           <w:rFonts w:ascii="Arial" w:hAnsi="Arial"/>
           <w:b/>
-          <w:color w:val="1A478A"/>
-          <w:sz w:val="26"/>
+          <w:color w:val="000000"/>
+          <w:sz w:val="24"/>
         </w:rPr>
-        <w:t>10. Rejestracja zdarzeń w logach serwera (historia/p.log)</w:t>
+        <w:t>10. Zadanie 15: Rejestracja zdarzeń w logach serwera (historia/p.log)</w:t>
       </w:r>
     </w:p>
     <w:p>
@@ -2416,7 +2210,7 @@
       <w:r>
         <w:rPr>
           <w:rFonts w:ascii="Arial" w:hAnsi="Arial"/>
-          <w:color w:val="1F2937"/>
+          <w:color w:val="000000"/>
           <w:sz w:val="20"/>
         </w:rPr>
         <w:t>W Zadaniu 15 zdefiniowano dedykowany format dziennika zdarzeń lab1_log_format rejestrujący kluczowe parametry każdego zapytania HTTP:</w:t>
@@ -2434,17 +2228,10 @@
     </w:p>
     <w:tbl>
       <w:tblPr>
+        <w:tblStyle w:val="TableGrid"/>
         <w:tblW w:type="auto" w:w="0"/>
         <w:jc w:val="center"/>
         <w:tblLook w:firstColumn="1" w:firstRow="1" w:lastColumn="0" w:lastRow="0" w:noHBand="0" w:noVBand="1" w:val="04A0"/>
-        <w:tblBorders>
-          <w:top w:val="single" w:sz="4" w:space="0" w:color="CBD5E1"/>
-          <w:left w:val="single" w:sz="4" w:space="0" w:color="CBD5E1"/>
-          <w:bottom w:val="single" w:sz="4" w:space="0" w:color="CBD5E1"/>
-          <w:right w:val="single" w:sz="4" w:space="0" w:color="CBD5E1"/>
-          <w:insideH w:val="single" w:sz="4" w:space="0" w:color="CBD5E1"/>
-          <w:insideV w:val="single" w:sz="4" w:space="0" w:color="CBD5E1"/>
-        </w:tblBorders>
       </w:tblPr>
       <w:tblGrid>
         <w:gridCol w:w="10080"/>
@@ -2453,22 +2240,15 @@
         <w:tc>
           <w:tcPr>
             <w:tcW w:type="dxa" w:w="9648"/>
-            <w:shd w:val="clear" w:color="auto" w:fill="F8FAFC"/>
-            <w:tcMar>
-              <w:top w:w="70" w:type="dxa"/>
-              <w:bottom w:w="70" w:type="dxa"/>
-              <w:left w:w="100" w:type="dxa"/>
-              <w:right w:w="100" w:type="dxa"/>
-            </w:tcMar>
           </w:tcPr>
           <w:p>
             <w:pPr>
-              <w:spacing w:after="0" w:line="252" w:lineRule="auto"/>
+              <w:spacing w:before="60" w:after="60" w:line="252" w:lineRule="auto"/>
             </w:pPr>
             <w:r>
               <w:rPr>
                 <w:rFonts w:ascii="Consolas" w:hAnsi="Consolas"/>
-                <w:color w:val="111827"/>
+                <w:color w:val="000000"/>
                 <w:sz w:val="17"/>
               </w:rPr>
               <w:t>LogFormat "%t %h %v \"%{User-Agent}i\"" lab1_log_format</w:t>
@@ -2492,7 +2272,7 @@
       <w:r>
         <w:rPr>
           <w:rFonts w:ascii="Arial" w:hAnsi="Arial"/>
-          <w:color w:val="1F2937"/>
+          <w:color w:val="000000"/>
           <w:sz w:val="20"/>
         </w:rPr>
         <w:t>Zawartość pliku p.log otwarta w edytorze Notatnik (Rysunek 17) potwierdza bezbłędne rejestrowanie wszystkich operacji przeprowadzonych podczas ćwiczenia w dniu 22 października 2026 r. Widoczne są odwołania do domen www.meble.pl oraz www.auta.pl wraz z kompletnym ciągiem nagłówka User-Agent przeglądarki Chrome na platformie Windows.</w:t>
@@ -2549,7 +2329,7 @@
         <w:rPr>
           <w:rFonts w:ascii="Arial" w:hAnsi="Arial"/>
           <w:i/>
-          <w:color w:val="4B5563"/>
+          <w:color w:val="000000"/>
           <w:sz w:val="18"/>
         </w:rPr>
         <w:t>Rysunek 17: Zapis zdarzeń w pliku dziennika historia/p.log zgodnie ze zdefiniowanym formatem lab1_log_format.</w:t>
@@ -2565,8 +2345,8 @@
         <w:rPr>
           <w:rFonts w:ascii="Arial" w:hAnsi="Arial"/>
           <w:b/>
-          <w:color w:val="1A478A"/>
-          <w:sz w:val="26"/>
+          <w:color w:val="000000"/>
+          <w:sz w:val="24"/>
         </w:rPr>
         <w:t>11. Wnioski i podsumowanie</w:t>
       </w:r>
@@ -2579,7 +2359,7 @@
       <w:r>
         <w:rPr>
           <w:rFonts w:ascii="Arial" w:hAnsi="Arial"/>
-          <w:color w:val="1F2937"/>
+          <w:color w:val="000000"/>
           <w:sz w:val="20"/>
         </w:rPr>
         <w:t>W ramach laboratorium 1 pomyślnie zrealizowano wszystkie 15 zadań przewidzianych programem zajęć. Przeprowadzone ćwiczenie pozwoliło na opanowanie kluczowych aspektów administracji serwerem WWW Apache 2.4 w środowisku Windows:</w:t>
@@ -2594,7 +2374,7 @@
         <w:rPr>
           <w:rFonts w:ascii="Arial" w:hAnsi="Arial"/>
           <w:b/>
-          <w:color w:val="1F2937"/>
+          <w:color w:val="000000"/>
           <w:sz w:val="20"/>
         </w:rPr>
         <w:t xml:space="preserve">Elastyczność wirtualizacji: </w:t>
@@ -2602,7 +2382,7 @@
       <w:r>
         <w:rPr>
           <w:rFonts w:ascii="Arial" w:hAnsi="Arial"/>
-          <w:color w:val="1F2937"/>
+          <w:color w:val="000000"/>
           <w:sz w:val="20"/>
         </w:rPr>
         <w:t>1. Modułowa architektura serwera Apache 2.4 umożliwia elastyczną konfigurację wielu wirtualnych hostów (Name-based i IP-based) na jednej fizycznej instalacji serwera, zapewniając pełną separację zasobów, uprawnień i katalogów DocumentRoot.</w:t>
@@ -2617,7 +2397,7 @@
         <w:rPr>
           <w:rFonts w:ascii="Arial" w:hAnsi="Arial"/>
           <w:b/>
-          <w:color w:val="1F2937"/>
+          <w:color w:val="000000"/>
           <w:sz w:val="20"/>
         </w:rPr>
         <w:t xml:space="preserve">Bezpieczeństwo i kontrola dostępu: </w:t>
@@ -2625,7 +2405,7 @@
       <w:r>
         <w:rPr>
           <w:rFonts w:ascii="Arial" w:hAnsi="Arial"/>
-          <w:color w:val="1F2937"/>
+          <w:color w:val="000000"/>
           <w:sz w:val="20"/>
         </w:rPr>
         <w:t>2. Wdrożenie autoryzacji HTTP Basic (mod_auth_basic) z haszowaniem SHA-1 skutecznie chroni wyznaczone obszary serwisu, a dyrektywa Require ip gwarantuje bezpieczną izolację wrażliwych paneli administracyjnych (takich jak phpMyAdmin) do środowiska localhost.</w:t>
@@ -2640,7 +2420,7 @@
         <w:rPr>
           <w:rFonts w:ascii="Arial" w:hAnsi="Arial"/>
           <w:b/>
-          <w:color w:val="1F2937"/>
+          <w:color w:val="000000"/>
           <w:sz w:val="20"/>
         </w:rPr>
         <w:t xml:space="preserve">Szyfrowanie połączeń (HTTPS): </w:t>
@@ -2648,7 +2428,7 @@
       <w:r>
         <w:rPr>
           <w:rFonts w:ascii="Arial" w:hAnsi="Arial"/>
-          <w:color w:val="1F2937"/>
+          <w:color w:val="000000"/>
           <w:sz w:val="20"/>
         </w:rPr>
         <w:t>3. Konfiguracja modułu mod_ssl wraz z 2048-bitowym certyfikatem i kluczem prywatnym RSA zapewnia poufność i integralność przesyłanych danych na porcie 443 zgodnie ze współczesnymi standardami bezpieczeństwa sieciowego.</w:t>
@@ -2663,7 +2443,7 @@
         <w:rPr>
           <w:rFonts w:ascii="Arial" w:hAnsi="Arial"/>
           <w:b/>
-          <w:color w:val="1F2937"/>
+          <w:color w:val="000000"/>
           <w:sz w:val="20"/>
         </w:rPr>
         <w:t xml:space="preserve">Użyteczność i audytowalność: </w:t>
@@ -2671,7 +2451,7 @@
       <w:r>
         <w:rPr>
           <w:rFonts w:ascii="Arial" w:hAnsi="Arial"/>
-          <w:color w:val="1F2937"/>
+          <w:color w:val="000000"/>
           <w:sz w:val="20"/>
         </w:rPr>
         <w:t>4. Mechanizmy FancyIndexing, własne strony obsługi błędów HTTP (ErrorDocument) oraz dedykowany format dziennika zdarzeń (CustomLog) znacząco podnoszą użyteczność serwisu dla użytkownika końcowego oraz ułatwiają audyt i diagnostykę administratorowi.</w:t>
@@ -2686,7 +2466,7 @@
         <w:rPr>
           <w:rFonts w:ascii="Arial" w:hAnsi="Arial"/>
           <w:b/>
-          <w:color w:val="1F2937"/>
+          <w:color w:val="000000"/>
           <w:sz w:val="20"/>
         </w:rPr>
         <w:t xml:space="preserve">Końcowa ocena realizacji: </w:t>
@@ -2694,7 +2474,7 @@
       <w:r>
         <w:rPr>
           <w:rFonts w:ascii="Arial" w:hAnsi="Arial"/>
-          <w:color w:val="1F2937"/>
+          <w:color w:val="000000"/>
           <w:sz w:val="20"/>
         </w:rPr>
         <w:t>Wszystkie wyniki zostały w 100% potwierdzone autentycznymi zrzutami ekranowymi wykonanymi podczas zajęć laboratoryjnych w dniu 22 października 2026 r. Konfiguracja serwera spełnia wszystkie wymagania formalne i techniczne stawiane przez prowadzącego zajęcia.</w:t>
@@ -2702,7 +2482,7 @@
     </w:p>
     <w:sectPr>
       <w:pgSz w:w="12240" w:h="15840"/>
-      <w:pgMar w:top="1080" w:right="1080" w:bottom="1080" w:left="1080" w:header="576" w:footer="576" w:gutter="0"/>
+      <w:pgMar w:top="1080" w:right="1080" w:bottom="1080" w:left="1080" w:header="720" w:footer="720" w:gutter="0"/>
       <w:cols w:space="720"/>
       <w:docGrid w:linePitch="360"/>
     </w:sectPr>

</xml_diff>